<commit_message>
Documentacion: Construccio de los manuales de DOTNET
</commit_message>
<xml_diff>
--- a/TI.1.2. PAO202651_SOAP_DOTNET_SINBDD_NRC36884_GR03/01. UML/01 ERS/ERS_SOAP_DOTNET_SINBDD_GR03.docx
+++ b/TI.1.2. PAO202651_SOAP_DOTNET_SINBDD_NRC36884_GR03/01. UML/01 ERS/ERS_SOAP_DOTNET_SINBDD_GR03.docx
@@ -1,6 +1,6 @@
 
 <file path=word/document.xml><?xml version="1.0" encoding="utf-8"?>
-<w:document xmlns:wpc="http://schemas.microsoft.com/office/word/2010/wordprocessingCanvas" xmlns:cx="http://schemas.microsoft.com/office/drawing/2014/chartex" xmlns:cx1="http://schemas.microsoft.com/office/drawing/2015/9/8/chartex" xmlns:cx2="http://schemas.microsoft.com/office/drawing/2015/10/21/chartex" xmlns:cx3="http://schemas.microsoft.com/office/drawing/2016/5/9/chartex" xmlns:cx4="http://schemas.microsoft.com/office/drawing/2016/5/10/chartex" xmlns:cx5="http://schemas.microsoft.com/office/drawing/2016/5/11/chartex" xmlns:cx6="http://schemas.microsoft.com/office/drawing/2016/5/12/chartex" xmlns:cx7="http://schemas.microsoft.com/office/drawing/2016/5/13/chartex" xmlns:cx8="http://schemas.microsoft.com/office/drawing/2016/5/14/chartex" xmlns:mc="http://schemas.openxmlformats.org/markup-compatibility/2006" xmlns:aink="http://schemas.microsoft.com/office/drawing/2016/ink" xmlns:am3d="http://schemas.microsoft.com/office/drawing/2017/model3d" xmlns:o="urn:schemas-microsoft-com:office:office" xmlns:oel="http://schemas.microsoft.com/office/2019/extlst" xmlns:r="http://schemas.openxmlformats.org/officeDocument/2006/relationships" xmlns:m="http://schemas.openxmlformats.org/officeDocument/2006/math" xmlns:v="urn:schemas-microsoft-com:vml" xmlns:wp14="http://schemas.microsoft.com/office/word/2010/wordprocessingDrawing" xmlns:wp="http://schemas.openxmlformats.org/drawingml/2006/wordprocessingDrawing" xmlns:w10="urn:schemas-microsoft-com:office:word" xmlns:w="http://schemas.openxmlformats.org/wordprocessingml/2006/main" xmlns:w14="http://schemas.microsoft.com/office/word/2010/wordml" xmlns:w15="http://schemas.microsoft.com/office/word/2012/wordml" xmlns:w16cex="http://schemas.microsoft.com/office/word/2018/wordml/cex" xmlns:w16cid="http://schemas.microsoft.com/office/word/2016/wordml/cid" xmlns:w16="http://schemas.microsoft.com/office/word/2018/wordml" xmlns:w16du="http://schemas.microsoft.com/office/word/2023/wordml/word16du" xmlns:w16sdtdh="http://schemas.microsoft.com/office/word/2020/wordml/sdtdatahash" xmlns:w16sdtfl="http://schemas.microsoft.com/office/word/2024/wordml/sdtformatlock" xmlns:w16se="http://schemas.microsoft.com/office/word/2015/wordml/symex" xmlns:wpg="http://schemas.microsoft.com/office/word/2010/wordprocessingGroup" xmlns:wpi="http://schemas.microsoft.com/office/word/2010/wordprocessingInk" xmlns:wne="http://schemas.microsoft.com/office/word/2006/wordml" xmlns:wps="http://schemas.microsoft.com/office/word/2010/wordprocessingShape" mc:Ignorable="w14 w15 w16se w16cid w16 w16cex w16sdtdh w16sdtfl w16du wp14">
+<w:document xmlns:wpc="http://schemas.microsoft.com/office/word/2010/wordprocessingCanvas" xmlns:cx="http://schemas.microsoft.com/office/drawing/2014/chartex" xmlns:cx1="http://schemas.microsoft.com/office/drawing/2015/9/8/chartex" xmlns:cx2="http://schemas.microsoft.com/office/drawing/2015/10/21/chartex" xmlns:cx3="http://schemas.microsoft.com/office/drawing/2016/5/9/chartex" xmlns:cx4="http://schemas.microsoft.com/office/drawing/2016/5/10/chartex" xmlns:cx5="http://schemas.microsoft.com/office/drawing/2016/5/11/chartex" xmlns:cx6="http://schemas.microsoft.com/office/drawing/2016/5/12/chartex" xmlns:cx7="http://schemas.microsoft.com/office/drawing/2016/5/13/chartex" xmlns:cx8="http://schemas.microsoft.com/office/drawing/2016/5/14/chartex" xmlns:mc="http://schemas.openxmlformats.org/markup-compatibility/2006" xmlns:aink="http://schemas.microsoft.com/office/drawing/2016/ink" xmlns:am3d="http://schemas.microsoft.com/office/drawing/2017/model3d" xmlns:o="urn:schemas-microsoft-com:office:office" xmlns:r="http://schemas.openxmlformats.org/officeDocument/2006/relationships" xmlns:m="http://schemas.openxmlformats.org/officeDocument/2006/math" xmlns:v="urn:schemas-microsoft-com:vml" xmlns:wp14="http://schemas.microsoft.com/office/word/2010/wordprocessingDrawing" xmlns:wp="http://schemas.openxmlformats.org/drawingml/2006/wordprocessingDrawing" xmlns:w10="urn:schemas-microsoft-com:office:word" xmlns:w="http://schemas.openxmlformats.org/wordprocessingml/2006/main" xmlns:w14="http://schemas.microsoft.com/office/word/2010/wordml" xmlns:w15="http://schemas.microsoft.com/office/word/2012/wordml" xmlns:w16cex="http://schemas.microsoft.com/office/word/2018/wordml/cex" xmlns:w16cid="http://schemas.microsoft.com/office/word/2016/wordml/cid" xmlns:w16="http://schemas.microsoft.com/office/word/2018/wordml" xmlns:w16sdtdh="http://schemas.microsoft.com/office/word/2020/wordml/sdtdatahash" xmlns:w16se="http://schemas.microsoft.com/office/word/2015/wordml/symex" xmlns:wpg="http://schemas.microsoft.com/office/word/2010/wordprocessingGroup" xmlns:wpi="http://schemas.microsoft.com/office/word/2010/wordprocessingInk" xmlns:wne="http://schemas.microsoft.com/office/word/2006/wordml" xmlns:wps="http://schemas.microsoft.com/office/word/2010/wordprocessingShape" mc:Ignorable="w14 w15 w16se w16cid w16 w16cex w16sdtdh wp14">
   <w:body>
     <w:p>
       <w:pPr>
@@ -262,13 +262,8 @@
                             <w:pPr>
                               <w:jc w:val="center"/>
                             </w:pPr>
-                            <w:proofErr w:type="gramStart"/>
                             <w:r>
-                              <w:t>MIS.MDU.CCNA.CCIA</w:t>
-                            </w:r>
-                            <w:proofErr w:type="gramEnd"/>
-                            <w:r>
-                              <w:t>.</w:t>
+                              <w:t>MIS.MDU.CCNA.CCIA.</w:t>
                             </w:r>
                           </w:p>
                           <w:p>
@@ -371,7 +366,7 @@
                                 <w:szCs w:val="28"/>
                                 <w:lang w:eastAsia="es-EC"/>
                               </w:rPr>
-                              <w:t>07/10/2026</w:t>
+                              <w:t>25/10/2026</w:t>
                             </w:r>
                             <w:r>
                               <w:rPr>
@@ -407,7 +402,7 @@
           </mc:Choice>
           <mc:Fallback>
             <w:pict>
-              <v:rect w14:anchorId="2648791E" id="Rectángulo 1" o:spid="_x0000_s1026" style="position:absolute;left:0;text-align:left;margin-left:13.35pt;margin-top:208.1pt;width:416.25pt;height:441.6pt;z-index:251665408;visibility:visible;mso-wrap-style:square;mso-width-percent:0;mso-height-percent:0;mso-wrap-distance-left:9pt;mso-wrap-distance-top:0;mso-wrap-distance-right:9pt;mso-wrap-distance-bottom:0;mso-position-horizontal:absolute;mso-position-horizontal-relative:margin;mso-position-vertical:absolute;mso-position-vertical-relative:text;mso-width-percent:0;mso-height-percent:0;mso-width-relative:page;mso-height-relative:margin;v-text-anchor:middle" o:gfxdata="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" filled="f" stroked="f" strokeweight="2pt">
+              <v:rect w14:anchorId="2648791E" id="Rectángulo 1" o:spid="_x0000_s1026" style="position:absolute;left:0;text-align:left;margin-left:13.35pt;margin-top:208.1pt;width:416.25pt;height:441.6pt;z-index:251665408;visibility:visible;mso-wrap-style:square;mso-width-percent:0;mso-height-percent:0;mso-wrap-distance-left:9pt;mso-wrap-distance-top:0;mso-wrap-distance-right:9pt;mso-wrap-distance-bottom:0;mso-position-horizontal:absolute;mso-position-horizontal-relative:margin;mso-position-vertical:absolute;mso-position-vertical-relative:text;mso-width-percent:0;mso-height-percent:0;mso-width-relative:page;mso-height-relative:margin;v-text-anchor:middle" o:gfxdata="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" filled="f" stroked="f" strokeweight="2pt">
                 <v:textbox>
                   <w:txbxContent>
                     <w:p>
@@ -603,13 +598,8 @@
                       <w:pPr>
                         <w:jc w:val="center"/>
                       </w:pPr>
-                      <w:proofErr w:type="gramStart"/>
                       <w:r>
-                        <w:t>MIS.MDU.CCNA.CCIA</w:t>
-                      </w:r>
-                      <w:proofErr w:type="gramEnd"/>
-                      <w:r>
-                        <w:t>.</w:t>
+                        <w:t>MIS.MDU.CCNA.CCIA.</w:t>
                       </w:r>
                     </w:p>
                     <w:p>
@@ -712,7 +702,7 @@
                           <w:szCs w:val="28"/>
                           <w:lang w:eastAsia="es-EC"/>
                         </w:rPr>
-                        <w:t>07/10/2026</w:t>
+                        <w:t>25/10/2026</w:t>
                       </w:r>
                       <w:r>
                         <w:rPr>
@@ -945,7 +935,7 @@
                               <w:sdtContent>
                                 <w:p>
                                   <w:pPr>
-                                    <w:pStyle w:val="NoSpacing"/>
+                                    <w:pStyle w:val="Sinespaciado"/>
                                     <w:jc w:val="right"/>
                                     <w:rPr>
                                       <w:color w:val="FFFFFF" w:themeColor="background1"/>
@@ -4218,7 +4208,7 @@
               </wp:anchor>
             </w:drawing>
           </mc:Choice>
-          <mc:Fallback>
+          <mc:Fallback xmlns:w16sdtfl="http://schemas.microsoft.com/office/word/2024/wordml/sdtformatlock" xmlns:w16du="http://schemas.microsoft.com/office/word/2023/wordml/word16du" xmlns:oel="http://schemas.microsoft.com/office/2019/extlst">
             <w:pict>
               <v:group w14:anchorId="5D8D6F89" id="Grupo 2" o:spid="_x0000_s1027" style="position:absolute;left:0;text-align:left;margin-left:78.6pt;margin-top:71.4pt;width:167.95pt;height:698.4pt;z-index:-251652096;mso-position-horizontal-relative:page;mso-position-vertical-relative:page" coordsize="21336,91257" o:gfxdata="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">
                 <v:rect id="Rectángulo 3" o:spid="_x0000_s1028" style="position:absolute;width:1945;height:91257;visibility:visible;mso-wrap-style:square;v-text-anchor:middle" o:gfxdata="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" fillcolor="#1f497d [3215]" stroked="f" strokeweight="2pt"/>
@@ -4389,7 +4379,7 @@
     </w:p>
     <w:p>
       <w:pPr>
-        <w:pStyle w:val="Heading1"/>
+        <w:pStyle w:val="Ttulo1"/>
       </w:pPr>
       <w:bookmarkStart w:id="0" w:name="_Toc242251879"/>
       <w:r>
@@ -4403,7 +4393,13 @@
         <w:t xml:space="preserve"> </w:t>
       </w:r>
       <w:r>
-        <w:t>PARA SOA CON SOAP EN JAVA SIN BDD</w:t>
+        <w:t xml:space="preserve">PARA SOA CON SOAP EN </w:t>
+      </w:r>
+      <w:r>
+        <w:t>DOTNET</w:t>
+      </w:r>
+      <w:r>
+        <w:t xml:space="preserve"> SIN BDD</w:t>
       </w:r>
       <w:bookmarkEnd w:id="0"/>
     </w:p>
@@ -4424,7 +4420,7 @@
         </w:p>
         <w:p>
           <w:pPr>
-            <w:pStyle w:val="TOC1"/>
+            <w:pStyle w:val="TDC1"/>
             <w:tabs>
               <w:tab w:val="right" w:leader="dot" w:pos="9020"/>
             </w:tabs>
@@ -4451,10 +4447,24 @@
           <w:hyperlink w:anchor="_Toc242251879" w:history="1">
             <w:r>
               <w:rPr>
-                <w:rStyle w:val="Hyperlink"/>
-                <w:noProof/>
-              </w:rPr>
-              <w:t>ESPECIFICACIÓN DE REQUERIMIENTOS DEL PARA SOA CON SOAP EN JAVA SIN BDD</w:t>
+                <w:rStyle w:val="Hipervnculo"/>
+                <w:noProof/>
+              </w:rPr>
+              <w:t xml:space="preserve">ESPECIFICACIÓN DE REQUERIMIENTOS DEL PARA SOA CON SOAP EN </w:t>
+            </w:r>
+            <w:r>
+              <w:rPr>
+                <w:rStyle w:val="Hipervnculo"/>
+                <w:noProof/>
+              </w:rPr>
+              <w:t xml:space="preserve">DOTNET </w:t>
+            </w:r>
+            <w:r>
+              <w:rPr>
+                <w:rStyle w:val="Hipervnculo"/>
+                <w:noProof/>
+              </w:rPr>
+              <w:t>SIN BDD</w:t>
             </w:r>
             <w:r>
               <w:rPr>
@@ -4508,7 +4518,7 @@
         </w:p>
         <w:p>
           <w:pPr>
-            <w:pStyle w:val="TOC1"/>
+            <w:pStyle w:val="TDC1"/>
             <w:tabs>
               <w:tab w:val="left" w:pos="980"/>
               <w:tab w:val="right" w:leader="dot" w:pos="9020"/>
@@ -4527,7 +4537,7 @@
           <w:hyperlink w:anchor="_Toc242251880" w:history="1">
             <w:r>
               <w:rPr>
-                <w:rStyle w:val="Hyperlink"/>
+                <w:rStyle w:val="Hipervnculo"/>
                 <w:noProof/>
               </w:rPr>
               <w:t>1.</w:t>
@@ -4547,7 +4557,7 @@
             </w:r>
             <w:r>
               <w:rPr>
-                <w:rStyle w:val="Hyperlink"/>
+                <w:rStyle w:val="Hipervnculo"/>
                 <w:noProof/>
               </w:rPr>
               <w:t>Introducción</w:t>
@@ -4604,7 +4614,7 @@
         </w:p>
         <w:p>
           <w:pPr>
-            <w:pStyle w:val="TOC1"/>
+            <w:pStyle w:val="TDC1"/>
             <w:tabs>
               <w:tab w:val="left" w:pos="980"/>
               <w:tab w:val="right" w:leader="dot" w:pos="9020"/>
@@ -4623,7 +4633,7 @@
           <w:hyperlink w:anchor="_Toc242251881" w:history="1">
             <w:r>
               <w:rPr>
-                <w:rStyle w:val="Hyperlink"/>
+                <w:rStyle w:val="Hipervnculo"/>
                 <w:noProof/>
               </w:rPr>
               <w:t>2.</w:t>
@@ -4643,7 +4653,7 @@
             </w:r>
             <w:r>
               <w:rPr>
-                <w:rStyle w:val="Hyperlink"/>
+                <w:rStyle w:val="Hipervnculo"/>
                 <w:noProof/>
               </w:rPr>
               <w:t>Propósito</w:t>
@@ -4700,7 +4710,7 @@
         </w:p>
         <w:p>
           <w:pPr>
-            <w:pStyle w:val="TOC1"/>
+            <w:pStyle w:val="TDC1"/>
             <w:tabs>
               <w:tab w:val="left" w:pos="980"/>
               <w:tab w:val="right" w:leader="dot" w:pos="9020"/>
@@ -4719,7 +4729,7 @@
           <w:hyperlink w:anchor="_Toc242251882" w:history="1">
             <w:r>
               <w:rPr>
-                <w:rStyle w:val="Hyperlink"/>
+                <w:rStyle w:val="Hipervnculo"/>
                 <w:noProof/>
               </w:rPr>
               <w:t>3.</w:t>
@@ -4739,7 +4749,7 @@
             </w:r>
             <w:r>
               <w:rPr>
-                <w:rStyle w:val="Hyperlink"/>
+                <w:rStyle w:val="Hipervnculo"/>
                 <w:noProof/>
               </w:rPr>
               <w:t>Alcance</w:t>
@@ -4796,7 +4806,7 @@
         </w:p>
         <w:p>
           <w:pPr>
-            <w:pStyle w:val="TOC1"/>
+            <w:pStyle w:val="TDC1"/>
             <w:tabs>
               <w:tab w:val="left" w:pos="980"/>
               <w:tab w:val="right" w:leader="dot" w:pos="9020"/>
@@ -4815,7 +4825,7 @@
           <w:hyperlink w:anchor="_Toc242251883" w:history="1">
             <w:r>
               <w:rPr>
-                <w:rStyle w:val="Hyperlink"/>
+                <w:rStyle w:val="Hipervnculo"/>
                 <w:noProof/>
               </w:rPr>
               <w:t>4.</w:t>
@@ -4835,7 +4845,7 @@
             </w:r>
             <w:r>
               <w:rPr>
-                <w:rStyle w:val="Hyperlink"/>
+                <w:rStyle w:val="Hipervnculo"/>
                 <w:noProof/>
               </w:rPr>
               <w:t>Definiciones, Acrónimos y Abreviaturas</w:t>
@@ -4892,7 +4902,7 @@
         </w:p>
         <w:p>
           <w:pPr>
-            <w:pStyle w:val="TOC2"/>
+            <w:pStyle w:val="TDC2"/>
             <w:tabs>
               <w:tab w:val="left" w:pos="1421"/>
               <w:tab w:val="right" w:leader="dot" w:pos="9020"/>
@@ -4911,7 +4921,7 @@
           <w:hyperlink w:anchor="_Toc242251884" w:history="1">
             <w:r>
               <w:rPr>
-                <w:rStyle w:val="Hyperlink"/>
+                <w:rStyle w:val="Hipervnculo"/>
                 <w:noProof/>
               </w:rPr>
               <w:t>4.1.</w:t>
@@ -4931,7 +4941,7 @@
             </w:r>
             <w:r>
               <w:rPr>
-                <w:rStyle w:val="Hyperlink"/>
+                <w:rStyle w:val="Hipervnculo"/>
                 <w:noProof/>
               </w:rPr>
               <w:t>Definiciones</w:t>
@@ -4988,7 +4998,7 @@
         </w:p>
         <w:p>
           <w:pPr>
-            <w:pStyle w:val="TOC2"/>
+            <w:pStyle w:val="TDC2"/>
             <w:tabs>
               <w:tab w:val="left" w:pos="1421"/>
               <w:tab w:val="right" w:leader="dot" w:pos="9020"/>
@@ -5007,7 +5017,7 @@
           <w:hyperlink w:anchor="_Toc242251885" w:history="1">
             <w:r>
               <w:rPr>
-                <w:rStyle w:val="Hyperlink"/>
+                <w:rStyle w:val="Hipervnculo"/>
                 <w:noProof/>
               </w:rPr>
               <w:t>4.2.</w:t>
@@ -5027,7 +5037,7 @@
             </w:r>
             <w:r>
               <w:rPr>
-                <w:rStyle w:val="Hyperlink"/>
+                <w:rStyle w:val="Hipervnculo"/>
                 <w:noProof/>
               </w:rPr>
               <w:t>Acrónimos y abreviaturas</w:t>
@@ -5084,7 +5094,7 @@
         </w:p>
         <w:p>
           <w:pPr>
-            <w:pStyle w:val="TOC1"/>
+            <w:pStyle w:val="TDC1"/>
             <w:tabs>
               <w:tab w:val="left" w:pos="980"/>
               <w:tab w:val="right" w:leader="dot" w:pos="9020"/>
@@ -5103,7 +5113,7 @@
           <w:hyperlink w:anchor="_Toc242251886" w:history="1">
             <w:r>
               <w:rPr>
-                <w:rStyle w:val="Hyperlink"/>
+                <w:rStyle w:val="Hipervnculo"/>
                 <w:noProof/>
               </w:rPr>
               <w:t>5.</w:t>
@@ -5123,7 +5133,7 @@
             </w:r>
             <w:r>
               <w:rPr>
-                <w:rStyle w:val="Hyperlink"/>
+                <w:rStyle w:val="Hipervnculo"/>
                 <w:noProof/>
               </w:rPr>
               <w:t>Referencias</w:t>
@@ -5180,7 +5190,7 @@
         </w:p>
         <w:p>
           <w:pPr>
-            <w:pStyle w:val="TOC1"/>
+            <w:pStyle w:val="TDC1"/>
             <w:tabs>
               <w:tab w:val="left" w:pos="980"/>
               <w:tab w:val="right" w:leader="dot" w:pos="9020"/>
@@ -5199,7 +5209,7 @@
           <w:hyperlink w:anchor="_Toc242251887" w:history="1">
             <w:r>
               <w:rPr>
-                <w:rStyle w:val="Hyperlink"/>
+                <w:rStyle w:val="Hipervnculo"/>
                 <w:noProof/>
               </w:rPr>
               <w:t>6.</w:t>
@@ -5219,7 +5229,7 @@
             </w:r>
             <w:r>
               <w:rPr>
-                <w:rStyle w:val="Hyperlink"/>
+                <w:rStyle w:val="Hipervnculo"/>
                 <w:noProof/>
               </w:rPr>
               <w:t>Visión General del Documento</w:t>
@@ -5276,7 +5286,7 @@
         </w:p>
         <w:p>
           <w:pPr>
-            <w:pStyle w:val="TOC1"/>
+            <w:pStyle w:val="TDC1"/>
             <w:tabs>
               <w:tab w:val="left" w:pos="980"/>
               <w:tab w:val="right" w:leader="dot" w:pos="9020"/>
@@ -5295,7 +5305,7 @@
           <w:hyperlink w:anchor="_Toc242251888" w:history="1">
             <w:r>
               <w:rPr>
-                <w:rStyle w:val="Hyperlink"/>
+                <w:rStyle w:val="Hipervnculo"/>
                 <w:noProof/>
               </w:rPr>
               <w:t>7.</w:t>
@@ -5315,7 +5325,7 @@
             </w:r>
             <w:r>
               <w:rPr>
-                <w:rStyle w:val="Hyperlink"/>
+                <w:rStyle w:val="Hipervnculo"/>
                 <w:noProof/>
               </w:rPr>
               <w:t>Descripción General</w:t>
@@ -5372,7 +5382,7 @@
         </w:p>
         <w:p>
           <w:pPr>
-            <w:pStyle w:val="TOC2"/>
+            <w:pStyle w:val="TDC2"/>
             <w:tabs>
               <w:tab w:val="left" w:pos="1421"/>
               <w:tab w:val="right" w:leader="dot" w:pos="9020"/>
@@ -5391,7 +5401,7 @@
           <w:hyperlink w:anchor="_Toc242251889" w:history="1">
             <w:r>
               <w:rPr>
-                <w:rStyle w:val="Hyperlink"/>
+                <w:rStyle w:val="Hipervnculo"/>
                 <w:noProof/>
               </w:rPr>
               <w:t>7.1.</w:t>
@@ -5411,7 +5421,7 @@
             </w:r>
             <w:r>
               <w:rPr>
-                <w:rStyle w:val="Hyperlink"/>
+                <w:rStyle w:val="Hipervnculo"/>
                 <w:noProof/>
               </w:rPr>
               <w:t>Perspectiva del Producto</w:t>
@@ -5468,7 +5478,7 @@
         </w:p>
         <w:p>
           <w:pPr>
-            <w:pStyle w:val="TOC2"/>
+            <w:pStyle w:val="TDC2"/>
             <w:tabs>
               <w:tab w:val="left" w:pos="1421"/>
               <w:tab w:val="right" w:leader="dot" w:pos="9020"/>
@@ -5487,7 +5497,7 @@
           <w:hyperlink w:anchor="_Toc242251890" w:history="1">
             <w:r>
               <w:rPr>
-                <w:rStyle w:val="Hyperlink"/>
+                <w:rStyle w:val="Hipervnculo"/>
                 <w:noProof/>
               </w:rPr>
               <w:t>7.2.</w:t>
@@ -5507,7 +5517,7 @@
             </w:r>
             <w:r>
               <w:rPr>
-                <w:rStyle w:val="Hyperlink"/>
+                <w:rStyle w:val="Hipervnculo"/>
                 <w:noProof/>
               </w:rPr>
               <w:t>Funciones del Producto (software)</w:t>
@@ -5564,7 +5574,7 @@
         </w:p>
         <w:p>
           <w:pPr>
-            <w:pStyle w:val="TOC2"/>
+            <w:pStyle w:val="TDC2"/>
             <w:tabs>
               <w:tab w:val="right" w:leader="dot" w:pos="9020"/>
             </w:tabs>
@@ -5582,7 +5592,7 @@
           <w:hyperlink w:anchor="_Toc242251891" w:history="1">
             <w:r>
               <w:rPr>
-                <w:rStyle w:val="Hyperlink"/>
+                <w:rStyle w:val="Hipervnculo"/>
                 <w:noProof/>
               </w:rPr>
               <w:t>7.3 Condiciones del Entorno</w:t>
@@ -5639,7 +5649,7 @@
         </w:p>
         <w:p>
           <w:pPr>
-            <w:pStyle w:val="TOC2"/>
+            <w:pStyle w:val="TDC2"/>
             <w:tabs>
               <w:tab w:val="right" w:leader="dot" w:pos="9020"/>
             </w:tabs>
@@ -5657,7 +5667,7 @@
           <w:hyperlink w:anchor="_Toc242251892" w:history="1">
             <w:r>
               <w:rPr>
-                <w:rStyle w:val="Hyperlink"/>
+                <w:rStyle w:val="Hipervnculo"/>
                 <w:noProof/>
               </w:rPr>
               <w:t>7.4 Características de los Usuarios</w:t>
@@ -5714,7 +5724,7 @@
         </w:p>
         <w:p>
           <w:pPr>
-            <w:pStyle w:val="TOC2"/>
+            <w:pStyle w:val="TDC2"/>
             <w:tabs>
               <w:tab w:val="right" w:leader="dot" w:pos="9020"/>
             </w:tabs>
@@ -5732,7 +5742,7 @@
           <w:hyperlink w:anchor="_Toc242251893" w:history="1">
             <w:r>
               <w:rPr>
-                <w:rStyle w:val="Hyperlink"/>
+                <w:rStyle w:val="Hipervnculo"/>
                 <w:noProof/>
               </w:rPr>
               <w:t>7.5 Interfaces Externas</w:t>
@@ -5789,7 +5799,7 @@
         </w:p>
         <w:p>
           <w:pPr>
-            <w:pStyle w:val="TOC2"/>
+            <w:pStyle w:val="TDC2"/>
             <w:tabs>
               <w:tab w:val="right" w:leader="dot" w:pos="9020"/>
             </w:tabs>
@@ -5807,7 +5817,7 @@
           <w:hyperlink w:anchor="_Toc242251894" w:history="1">
             <w:r>
               <w:rPr>
-                <w:rStyle w:val="Hyperlink"/>
+                <w:rStyle w:val="Hipervnculo"/>
                 <w:rFonts w:cs="Calibri"/>
                 <w:noProof/>
               </w:rPr>
@@ -5865,7 +5875,7 @@
         </w:p>
         <w:p>
           <w:pPr>
-            <w:pStyle w:val="TOC2"/>
+            <w:pStyle w:val="TDC2"/>
             <w:tabs>
               <w:tab w:val="right" w:leader="dot" w:pos="9020"/>
             </w:tabs>
@@ -5883,7 +5893,7 @@
           <w:hyperlink w:anchor="_Toc242251895" w:history="1">
             <w:r>
               <w:rPr>
-                <w:rStyle w:val="Hyperlink"/>
+                <w:rStyle w:val="Hipervnculo"/>
                 <w:noProof/>
               </w:rPr>
               <w:t>7.7 Suposiciones y Dependencias</w:t>
@@ -5940,7 +5950,7 @@
         </w:p>
         <w:p>
           <w:pPr>
-            <w:pStyle w:val="TOC1"/>
+            <w:pStyle w:val="TDC1"/>
             <w:tabs>
               <w:tab w:val="left" w:pos="980"/>
               <w:tab w:val="right" w:leader="dot" w:pos="9020"/>
@@ -5959,7 +5969,7 @@
           <w:hyperlink w:anchor="_Toc242251896" w:history="1">
             <w:r>
               <w:rPr>
-                <w:rStyle w:val="Hyperlink"/>
+                <w:rStyle w:val="Hipervnculo"/>
                 <w:noProof/>
               </w:rPr>
               <w:t>8.</w:t>
@@ -5979,7 +5989,7 @@
             </w:r>
             <w:r>
               <w:rPr>
-                <w:rStyle w:val="Hyperlink"/>
+                <w:rStyle w:val="Hipervnculo"/>
                 <w:noProof/>
               </w:rPr>
               <w:t>Especificación de Requerimientos</w:t>
@@ -6036,7 +6046,7 @@
         </w:p>
         <w:p>
           <w:pPr>
-            <w:pStyle w:val="TOC2"/>
+            <w:pStyle w:val="TDC2"/>
             <w:tabs>
               <w:tab w:val="right" w:leader="dot" w:pos="9020"/>
             </w:tabs>
@@ -6054,7 +6064,7 @@
           <w:hyperlink w:anchor="_Toc242251897" w:history="1">
             <w:r>
               <w:rPr>
-                <w:rStyle w:val="Hyperlink"/>
+                <w:rStyle w:val="Hipervnculo"/>
                 <w:noProof/>
               </w:rPr>
               <w:t>8.1 Requisitos comunes de las interfaces</w:t>
@@ -6111,7 +6121,7 @@
         </w:p>
         <w:p>
           <w:pPr>
-            <w:pStyle w:val="TOC3"/>
+            <w:pStyle w:val="TDC3"/>
             <w:tabs>
               <w:tab w:val="right" w:leader="dot" w:pos="9020"/>
             </w:tabs>
@@ -6129,7 +6139,7 @@
           <w:hyperlink w:anchor="_Toc242251898" w:history="1">
             <w:r>
               <w:rPr>
-                <w:rStyle w:val="Hyperlink"/>
+                <w:rStyle w:val="Hipervnculo"/>
                 <w:noProof/>
               </w:rPr>
               <w:t>8.1.1 Interfaces de usuario</w:t>
@@ -6186,7 +6196,7 @@
         </w:p>
         <w:p>
           <w:pPr>
-            <w:pStyle w:val="TOC3"/>
+            <w:pStyle w:val="TDC3"/>
             <w:tabs>
               <w:tab w:val="right" w:leader="dot" w:pos="9020"/>
             </w:tabs>
@@ -6204,7 +6214,7 @@
           <w:hyperlink w:anchor="_Toc242251899" w:history="1">
             <w:r>
               <w:rPr>
-                <w:rStyle w:val="Hyperlink"/>
+                <w:rStyle w:val="Hipervnculo"/>
                 <w:noProof/>
               </w:rPr>
               <w:t>8.1.2 Interfaces de hardware</w:t>
@@ -6261,7 +6271,7 @@
         </w:p>
         <w:p>
           <w:pPr>
-            <w:pStyle w:val="TOC3"/>
+            <w:pStyle w:val="TDC3"/>
             <w:tabs>
               <w:tab w:val="right" w:leader="dot" w:pos="9020"/>
             </w:tabs>
@@ -6279,7 +6289,7 @@
           <w:hyperlink w:anchor="_Toc242251900" w:history="1">
             <w:r>
               <w:rPr>
-                <w:rStyle w:val="Hyperlink"/>
+                <w:rStyle w:val="Hipervnculo"/>
                 <w:noProof/>
               </w:rPr>
               <w:t>8.1.3 Interfaces de software</w:t>
@@ -6336,7 +6346,7 @@
         </w:p>
         <w:p>
           <w:pPr>
-            <w:pStyle w:val="TOC3"/>
+            <w:pStyle w:val="TDC3"/>
             <w:tabs>
               <w:tab w:val="right" w:leader="dot" w:pos="9020"/>
             </w:tabs>
@@ -6354,7 +6364,7 @@
           <w:hyperlink w:anchor="_Toc242251901" w:history="1">
             <w:r>
               <w:rPr>
-                <w:rStyle w:val="Hyperlink"/>
+                <w:rStyle w:val="Hipervnculo"/>
                 <w:noProof/>
               </w:rPr>
               <w:t>8.1.4 Interfaces de comunicación</w:t>
@@ -6411,7 +6421,7 @@
         </w:p>
         <w:p>
           <w:pPr>
-            <w:pStyle w:val="TOC2"/>
+            <w:pStyle w:val="TDC2"/>
             <w:tabs>
               <w:tab w:val="right" w:leader="dot" w:pos="9020"/>
             </w:tabs>
@@ -6429,7 +6439,7 @@
           <w:hyperlink w:anchor="_Toc242251902" w:history="1">
             <w:r>
               <w:rPr>
-                <w:rStyle w:val="Hyperlink"/>
+                <w:rStyle w:val="Hipervnculo"/>
                 <w:noProof/>
               </w:rPr>
               <w:t>8.2 Requisitos Funcionales</w:t>
@@ -6486,7 +6496,7 @@
         </w:p>
         <w:p>
           <w:pPr>
-            <w:pStyle w:val="TOC3"/>
+            <w:pStyle w:val="TDC3"/>
             <w:tabs>
               <w:tab w:val="right" w:leader="dot" w:pos="9020"/>
             </w:tabs>
@@ -6504,7 +6514,7 @@
           <w:hyperlink w:anchor="_Toc242251903" w:history="1">
             <w:r>
               <w:rPr>
-                <w:rStyle w:val="Hyperlink"/>
+                <w:rStyle w:val="Hipervnculo"/>
                 <w:noProof/>
               </w:rPr>
               <w:t>8.2.1. Objetivo General</w:t>
@@ -6561,7 +6571,7 @@
         </w:p>
         <w:p>
           <w:pPr>
-            <w:pStyle w:val="TOC3"/>
+            <w:pStyle w:val="TDC3"/>
             <w:tabs>
               <w:tab w:val="right" w:leader="dot" w:pos="9020"/>
             </w:tabs>
@@ -6579,7 +6589,7 @@
           <w:hyperlink w:anchor="_Toc242251904" w:history="1">
             <w:r>
               <w:rPr>
-                <w:rStyle w:val="Hyperlink"/>
+                <w:rStyle w:val="Hipervnculo"/>
                 <w:noProof/>
               </w:rPr>
               <w:t>8.2.2. Objetivos Específicos</w:t>
@@ -6636,7 +6646,7 @@
         </w:p>
         <w:p>
           <w:pPr>
-            <w:pStyle w:val="TOC3"/>
+            <w:pStyle w:val="TDC3"/>
             <w:tabs>
               <w:tab w:val="right" w:leader="dot" w:pos="9020"/>
             </w:tabs>
@@ -6654,7 +6664,7 @@
           <w:hyperlink w:anchor="_Toc242251905" w:history="1">
             <w:r>
               <w:rPr>
-                <w:rStyle w:val="Hyperlink"/>
+                <w:rStyle w:val="Hipervnculo"/>
                 <w:noProof/>
               </w:rPr>
               <w:t>8.2.3. Actores</w:t>
@@ -6711,7 +6721,7 @@
         </w:p>
         <w:p>
           <w:pPr>
-            <w:pStyle w:val="TOC3"/>
+            <w:pStyle w:val="TDC3"/>
             <w:tabs>
               <w:tab w:val="right" w:leader="dot" w:pos="9020"/>
             </w:tabs>
@@ -6729,7 +6739,7 @@
           <w:hyperlink w:anchor="_Toc242251906" w:history="1">
             <w:r>
               <w:rPr>
-                <w:rStyle w:val="Hyperlink"/>
+                <w:rStyle w:val="Hipervnculo"/>
                 <w:noProof/>
               </w:rPr>
               <w:t>8.2.4. Lista de requisitos funcionales</w:t>
@@ -6786,7 +6796,7 @@
         </w:p>
         <w:p>
           <w:pPr>
-            <w:pStyle w:val="TOC3"/>
+            <w:pStyle w:val="TDC3"/>
             <w:tabs>
               <w:tab w:val="right" w:leader="dot" w:pos="9020"/>
             </w:tabs>
@@ -6804,7 +6814,7 @@
           <w:hyperlink w:anchor="_Toc242251907" w:history="1">
             <w:r>
               <w:rPr>
-                <w:rStyle w:val="Hyperlink"/>
+                <w:rStyle w:val="Hipervnculo"/>
                 <w:noProof/>
               </w:rPr>
               <w:t>8.2.5 Requisitos Funcionales</w:t>
@@ -6861,7 +6871,7 @@
         </w:p>
         <w:p>
           <w:pPr>
-            <w:pStyle w:val="TOC2"/>
+            <w:pStyle w:val="TDC2"/>
             <w:tabs>
               <w:tab w:val="right" w:leader="dot" w:pos="9020"/>
             </w:tabs>
@@ -6879,7 +6889,7 @@
           <w:hyperlink w:anchor="_Toc242251908" w:history="1">
             <w:r>
               <w:rPr>
-                <w:rStyle w:val="Hyperlink"/>
+                <w:rStyle w:val="Hipervnculo"/>
                 <w:noProof/>
               </w:rPr>
               <w:t>8.3 Requisitos No Funcionales</w:t>
@@ -6936,7 +6946,7 @@
         </w:p>
         <w:p>
           <w:pPr>
-            <w:pStyle w:val="TOC3"/>
+            <w:pStyle w:val="TDC3"/>
             <w:tabs>
               <w:tab w:val="right" w:leader="dot" w:pos="9020"/>
             </w:tabs>
@@ -6954,7 +6964,7 @@
           <w:hyperlink w:anchor="_Toc242251909" w:history="1">
             <w:r>
               <w:rPr>
-                <w:rStyle w:val="Hyperlink"/>
+                <w:rStyle w:val="Hipervnculo"/>
                 <w:noProof/>
               </w:rPr>
               <w:t>8.3.1 Objetivo General</w:t>
@@ -7011,7 +7021,7 @@
         </w:p>
         <w:p>
           <w:pPr>
-            <w:pStyle w:val="TOC2"/>
+            <w:pStyle w:val="TDC2"/>
             <w:tabs>
               <w:tab w:val="right" w:leader="dot" w:pos="9020"/>
             </w:tabs>
@@ -7029,7 +7039,7 @@
           <w:hyperlink w:anchor="_Toc242251910" w:history="1">
             <w:r>
               <w:rPr>
-                <w:rStyle w:val="Hyperlink"/>
+                <w:rStyle w:val="Hipervnculo"/>
                 <w:noProof/>
               </w:rPr>
               <w:t>8.4 Otros Requerimientos</w:t>
@@ -7086,7 +7096,7 @@
         </w:p>
         <w:p>
           <w:pPr>
-            <w:pStyle w:val="TOC3"/>
+            <w:pStyle w:val="TDC3"/>
             <w:tabs>
               <w:tab w:val="right" w:leader="dot" w:pos="9020"/>
             </w:tabs>
@@ -7104,7 +7114,7 @@
           <w:hyperlink w:anchor="_Toc242251911" w:history="1">
             <w:r>
               <w:rPr>
-                <w:rStyle w:val="Hyperlink"/>
+                <w:rStyle w:val="Hipervnculo"/>
                 <w:noProof/>
               </w:rPr>
               <w:t>8.4.1 Restricciones de Diseño</w:t>
@@ -7161,7 +7171,7 @@
         </w:p>
         <w:p>
           <w:pPr>
-            <w:pStyle w:val="TOC3"/>
+            <w:pStyle w:val="TDC3"/>
             <w:tabs>
               <w:tab w:val="right" w:leader="dot" w:pos="9020"/>
             </w:tabs>
@@ -7179,7 +7189,7 @@
           <w:hyperlink w:anchor="_Toc242251912" w:history="1">
             <w:r>
               <w:rPr>
-                <w:rStyle w:val="Hyperlink"/>
+                <w:rStyle w:val="Hipervnculo"/>
                 <w:noProof/>
               </w:rPr>
               <w:t>8.4.2 Restricciones de Hardware</w:t>
@@ -7236,7 +7246,7 @@
         </w:p>
         <w:p>
           <w:pPr>
-            <w:pStyle w:val="TOC3"/>
+            <w:pStyle w:val="TDC3"/>
             <w:tabs>
               <w:tab w:val="right" w:leader="dot" w:pos="9020"/>
             </w:tabs>
@@ -7254,7 +7264,7 @@
           <w:hyperlink w:anchor="_Toc242251913" w:history="1">
             <w:r>
               <w:rPr>
-                <w:rStyle w:val="Hyperlink"/>
+                <w:rStyle w:val="Hipervnculo"/>
                 <w:noProof/>
               </w:rPr>
               <w:t>8.4.3 Atributos de calidad</w:t>
@@ -7311,7 +7321,7 @@
         </w:p>
         <w:p>
           <w:pPr>
-            <w:pStyle w:val="TOC1"/>
+            <w:pStyle w:val="TDC1"/>
             <w:tabs>
               <w:tab w:val="right" w:leader="dot" w:pos="9020"/>
             </w:tabs>
@@ -7329,7 +7339,7 @@
           <w:hyperlink w:anchor="_Toc242251914" w:history="1">
             <w:r>
               <w:rPr>
-                <w:rStyle w:val="Hyperlink"/>
+                <w:rStyle w:val="Hipervnculo"/>
                 <w:noProof/>
               </w:rPr>
               <w:t>9. Requisitos de Rendimiento</w:t>
@@ -7386,7 +7396,7 @@
         </w:p>
         <w:p>
           <w:pPr>
-            <w:pStyle w:val="TOC2"/>
+            <w:pStyle w:val="TDC2"/>
             <w:tabs>
               <w:tab w:val="right" w:leader="dot" w:pos="9020"/>
             </w:tabs>
@@ -7404,7 +7414,7 @@
           <w:hyperlink w:anchor="_Toc242251915" w:history="1">
             <w:r>
               <w:rPr>
-                <w:rStyle w:val="Hyperlink"/>
+                <w:rStyle w:val="Hipervnculo"/>
                 <w:noProof/>
               </w:rPr>
               <w:t>9.1. Requisitos de Interfaces Externas</w:t>
@@ -7461,7 +7471,7 @@
         </w:p>
         <w:p>
           <w:pPr>
-            <w:pStyle w:val="TOC3"/>
+            <w:pStyle w:val="TDC3"/>
             <w:tabs>
               <w:tab w:val="right" w:leader="dot" w:pos="9020"/>
             </w:tabs>
@@ -7479,7 +7489,7 @@
           <w:hyperlink w:anchor="_Toc242251916" w:history="1">
             <w:r>
               <w:rPr>
-                <w:rStyle w:val="Hyperlink"/>
+                <w:rStyle w:val="Hipervnculo"/>
                 <w:noProof/>
               </w:rPr>
               <w:t>9.1.1. Interfaces de Usuario</w:t>
@@ -7536,7 +7546,7 @@
         </w:p>
         <w:p>
           <w:pPr>
-            <w:pStyle w:val="TOC3"/>
+            <w:pStyle w:val="TDC3"/>
             <w:tabs>
               <w:tab w:val="right" w:leader="dot" w:pos="9020"/>
             </w:tabs>
@@ -7554,7 +7564,7 @@
           <w:hyperlink w:anchor="_Toc242251917" w:history="1">
             <w:r>
               <w:rPr>
-                <w:rStyle w:val="Hyperlink"/>
+                <w:rStyle w:val="Hipervnculo"/>
                 <w:noProof/>
               </w:rPr>
               <w:t>9.1.2. Interfaces de Hardware</w:t>
@@ -7611,7 +7621,7 @@
         </w:p>
         <w:p>
           <w:pPr>
-            <w:pStyle w:val="TOC3"/>
+            <w:pStyle w:val="TDC3"/>
             <w:tabs>
               <w:tab w:val="right" w:leader="dot" w:pos="9020"/>
             </w:tabs>
@@ -7629,7 +7639,7 @@
           <w:hyperlink w:anchor="_Toc242251918" w:history="1">
             <w:r>
               <w:rPr>
-                <w:rStyle w:val="Hyperlink"/>
+                <w:rStyle w:val="Hipervnculo"/>
                 <w:noProof/>
               </w:rPr>
               <w:t>9.1.3. Interfaces de Software</w:t>
@@ -7686,7 +7696,7 @@
         </w:p>
         <w:p>
           <w:pPr>
-            <w:pStyle w:val="TOC3"/>
+            <w:pStyle w:val="TDC3"/>
             <w:tabs>
               <w:tab w:val="right" w:leader="dot" w:pos="9020"/>
             </w:tabs>
@@ -7704,7 +7714,7 @@
           <w:hyperlink w:anchor="_Toc242251919" w:history="1">
             <w:r>
               <w:rPr>
-                <w:rStyle w:val="Hyperlink"/>
+                <w:rStyle w:val="Hipervnculo"/>
                 <w:noProof/>
               </w:rPr>
               <w:t>9.1.4. Interfaces de Comunicación</w:t>
@@ -7787,7 +7797,7 @@
     </w:p>
     <w:p>
       <w:pPr>
-        <w:pStyle w:val="TOCHeading"/>
+        <w:pStyle w:val="TtuloTDC"/>
       </w:pPr>
       <w:r>
         <w:lastRenderedPageBreak/>
@@ -7799,7 +7809,7 @@
     </w:p>
     <w:p>
       <w:pPr>
-        <w:pStyle w:val="TableofFigures"/>
+        <w:pStyle w:val="Tabladeilustraciones"/>
         <w:tabs>
           <w:tab w:val="right" w:leader="dot" w:pos="9020"/>
         </w:tabs>
@@ -7826,7 +7836,7 @@
       <w:hyperlink w:anchor="_Toc242251965" w:history="1">
         <w:r>
           <w:rPr>
-            <w:rStyle w:val="Hyperlink"/>
+            <w:rStyle w:val="Hipervnculo"/>
             <w:noProof/>
           </w:rPr>
           <w:t>Ilustración 1. Diagrama de casos de uso del sistema</w:t>
@@ -7897,7 +7907,7 @@
     </w:p>
     <w:p>
       <w:pPr>
-        <w:pStyle w:val="TOCHeading"/>
+        <w:pStyle w:val="TtuloTDC"/>
       </w:pPr>
       <w:r>
         <w:lastRenderedPageBreak/>
@@ -7909,7 +7919,7 @@
     </w:p>
     <w:p>
       <w:pPr>
-        <w:pStyle w:val="TableofFigures"/>
+        <w:pStyle w:val="Tabladeilustraciones"/>
         <w:tabs>
           <w:tab w:val="right" w:leader="dot" w:pos="9020"/>
         </w:tabs>
@@ -7936,7 +7946,7 @@
       <w:hyperlink w:anchor="_Toc242251932" w:history="1">
         <w:r>
           <w:rPr>
-            <w:rStyle w:val="Hyperlink"/>
+            <w:rStyle w:val="Hipervnculo"/>
             <w:noProof/>
           </w:rPr>
           <w:t>Tabla 1. Definiciones</w:t>
@@ -7993,7 +8003,7 @@
     </w:p>
     <w:p>
       <w:pPr>
-        <w:pStyle w:val="TableofFigures"/>
+        <w:pStyle w:val="Tabladeilustraciones"/>
         <w:tabs>
           <w:tab w:val="right" w:leader="dot" w:pos="9020"/>
         </w:tabs>
@@ -8011,7 +8021,7 @@
       <w:hyperlink w:anchor="_Toc242251933" w:history="1">
         <w:r>
           <w:rPr>
-            <w:rStyle w:val="Hyperlink"/>
+            <w:rStyle w:val="Hipervnculo"/>
             <w:noProof/>
           </w:rPr>
           <w:t>Tabla 2. Acrónimo y abreviaturas</w:t>
@@ -8068,7 +8078,7 @@
     </w:p>
     <w:p>
       <w:pPr>
-        <w:pStyle w:val="TableofFigures"/>
+        <w:pStyle w:val="Tabladeilustraciones"/>
         <w:tabs>
           <w:tab w:val="right" w:leader="dot" w:pos="9020"/>
         </w:tabs>
@@ -8086,7 +8096,7 @@
       <w:hyperlink w:anchor="_Toc242251934" w:history="1">
         <w:r>
           <w:rPr>
-            <w:rStyle w:val="Hyperlink"/>
+            <w:rStyle w:val="Hipervnculo"/>
             <w:noProof/>
           </w:rPr>
           <w:t>Tabla 3. Referencias</w:t>
@@ -8143,7 +8153,7 @@
     </w:p>
     <w:p>
       <w:pPr>
-        <w:pStyle w:val="TableofFigures"/>
+        <w:pStyle w:val="Tabladeilustraciones"/>
         <w:tabs>
           <w:tab w:val="right" w:leader="dot" w:pos="9020"/>
         </w:tabs>
@@ -8161,7 +8171,7 @@
       <w:hyperlink w:anchor="_Toc242251935" w:history="1">
         <w:r>
           <w:rPr>
-            <w:rStyle w:val="Hyperlink"/>
+            <w:rStyle w:val="Hipervnculo"/>
             <w:noProof/>
           </w:rPr>
           <w:t>Tabla 4. Usuario final</w:t>
@@ -8218,7 +8228,7 @@
     </w:p>
     <w:p>
       <w:pPr>
-        <w:pStyle w:val="TableofFigures"/>
+        <w:pStyle w:val="Tabladeilustraciones"/>
         <w:tabs>
           <w:tab w:val="right" w:leader="dot" w:pos="9020"/>
         </w:tabs>
@@ -8236,7 +8246,7 @@
       <w:hyperlink w:anchor="_Toc242251936" w:history="1">
         <w:r>
           <w:rPr>
-            <w:rStyle w:val="Hyperlink"/>
+            <w:rStyle w:val="Hipervnculo"/>
             <w:noProof/>
           </w:rPr>
           <w:t>Tabla 8. Requisitos de interfaces de hardware</w:t>
@@ -8293,7 +8303,7 @@
     </w:p>
     <w:p>
       <w:pPr>
-        <w:pStyle w:val="TableofFigures"/>
+        <w:pStyle w:val="Tabladeilustraciones"/>
         <w:tabs>
           <w:tab w:val="right" w:leader="dot" w:pos="9020"/>
         </w:tabs>
@@ -8311,7 +8321,7 @@
       <w:hyperlink w:anchor="_Toc242251937" w:history="1">
         <w:r>
           <w:rPr>
-            <w:rStyle w:val="Hyperlink"/>
+            <w:rStyle w:val="Hipervnculo"/>
             <w:noProof/>
           </w:rPr>
           <w:t>Tabla 9.Interfaces de software</w:t>
@@ -8368,7 +8378,7 @@
     </w:p>
     <w:p>
       <w:pPr>
-        <w:pStyle w:val="TableofFigures"/>
+        <w:pStyle w:val="Tabladeilustraciones"/>
         <w:tabs>
           <w:tab w:val="right" w:leader="dot" w:pos="9020"/>
         </w:tabs>
@@ -8386,7 +8396,7 @@
       <w:hyperlink w:anchor="_Toc242251938" w:history="1">
         <w:r>
           <w:rPr>
-            <w:rStyle w:val="Hyperlink"/>
+            <w:rStyle w:val="Hipervnculo"/>
             <w:noProof/>
           </w:rPr>
           <w:t>Tabla 10. Autenticar el acceso de los clientes</w:t>
@@ -8443,7 +8453,7 @@
     </w:p>
     <w:p>
       <w:pPr>
-        <w:pStyle w:val="TableofFigures"/>
+        <w:pStyle w:val="Tabladeilustraciones"/>
         <w:tabs>
           <w:tab w:val="right" w:leader="dot" w:pos="9020"/>
         </w:tabs>
@@ -8461,7 +8471,7 @@
       <w:hyperlink w:anchor="_Toc242251939" w:history="1">
         <w:r>
           <w:rPr>
-            <w:rStyle w:val="Hyperlink"/>
+            <w:rStyle w:val="Hipervnculo"/>
             <w:noProof/>
           </w:rPr>
           <w:t>Tabla 11. Realizar conversiones</w:t>
@@ -8518,7 +8528,7 @@
     </w:p>
     <w:p>
       <w:pPr>
-        <w:pStyle w:val="TableofFigures"/>
+        <w:pStyle w:val="Tabladeilustraciones"/>
         <w:tabs>
           <w:tab w:val="right" w:leader="dot" w:pos="9020"/>
         </w:tabs>
@@ -8536,7 +8546,7 @@
       <w:hyperlink w:anchor="_Toc242251940" w:history="1">
         <w:r>
           <w:rPr>
-            <w:rStyle w:val="Hyperlink"/>
+            <w:rStyle w:val="Hipervnculo"/>
             <w:noProof/>
           </w:rPr>
           <w:t>Tabla 12. Consultar el catálogo de unidades</w:t>
@@ -8593,7 +8603,7 @@
     </w:p>
     <w:p>
       <w:pPr>
-        <w:pStyle w:val="TableofFigures"/>
+        <w:pStyle w:val="Tabladeilustraciones"/>
         <w:tabs>
           <w:tab w:val="right" w:leader="dot" w:pos="9020"/>
         </w:tabs>
@@ -8611,7 +8621,7 @@
       <w:hyperlink w:anchor="_Toc242251941" w:history="1">
         <w:r>
           <w:rPr>
-            <w:rStyle w:val="Hyperlink"/>
+            <w:rStyle w:val="Hipervnculo"/>
             <w:noProof/>
           </w:rPr>
           <w:t>Tabla 13. Respuestas Estructuradas</w:t>
@@ -8668,7 +8678,7 @@
     </w:p>
     <w:p>
       <w:pPr>
-        <w:pStyle w:val="TableofFigures"/>
+        <w:pStyle w:val="Tabladeilustraciones"/>
         <w:tabs>
           <w:tab w:val="right" w:leader="dot" w:pos="9020"/>
         </w:tabs>
@@ -8686,7 +8696,7 @@
       <w:hyperlink w:anchor="_Toc242251942" w:history="1">
         <w:r>
           <w:rPr>
-            <w:rStyle w:val="Hyperlink"/>
+            <w:rStyle w:val="Hipervnculo"/>
             <w:noProof/>
           </w:rPr>
           <w:t>Tabla 14. Actor Usuario</w:t>
@@ -8743,7 +8753,7 @@
     </w:p>
     <w:p>
       <w:pPr>
-        <w:pStyle w:val="TableofFigures"/>
+        <w:pStyle w:val="Tabladeilustraciones"/>
         <w:tabs>
           <w:tab w:val="right" w:leader="dot" w:pos="9020"/>
         </w:tabs>
@@ -8761,7 +8771,7 @@
       <w:hyperlink w:anchor="_Toc242251943" w:history="1">
         <w:r>
           <w:rPr>
-            <w:rStyle w:val="Hyperlink"/>
+            <w:rStyle w:val="Hipervnculo"/>
             <w:noProof/>
           </w:rPr>
           <w:t>Tabla 15. Actor Cliente Consola</w:t>
@@ -8818,7 +8828,7 @@
     </w:p>
     <w:p>
       <w:pPr>
-        <w:pStyle w:val="TableofFigures"/>
+        <w:pStyle w:val="Tabladeilustraciones"/>
         <w:tabs>
           <w:tab w:val="right" w:leader="dot" w:pos="9020"/>
         </w:tabs>
@@ -8836,7 +8846,7 @@
       <w:hyperlink w:anchor="_Toc242251944" w:history="1">
         <w:r>
           <w:rPr>
-            <w:rStyle w:val="Hyperlink"/>
+            <w:rStyle w:val="Hipervnculo"/>
             <w:noProof/>
           </w:rPr>
           <w:t>Tabla 16. Actor Cliente Escritorio</w:t>
@@ -8893,7 +8903,7 @@
     </w:p>
     <w:p>
       <w:pPr>
-        <w:pStyle w:val="TableofFigures"/>
+        <w:pStyle w:val="Tabladeilustraciones"/>
         <w:tabs>
           <w:tab w:val="right" w:leader="dot" w:pos="9020"/>
         </w:tabs>
@@ -8911,7 +8921,7 @@
       <w:hyperlink w:anchor="_Toc242251945" w:history="1">
         <w:r>
           <w:rPr>
-            <w:rStyle w:val="Hyperlink"/>
+            <w:rStyle w:val="Hipervnculo"/>
             <w:noProof/>
           </w:rPr>
           <w:t>Tabla 17. Actor Cliente Web</w:t>
@@ -8968,7 +8978,7 @@
     </w:p>
     <w:p>
       <w:pPr>
-        <w:pStyle w:val="TableofFigures"/>
+        <w:pStyle w:val="Tabladeilustraciones"/>
         <w:tabs>
           <w:tab w:val="right" w:leader="dot" w:pos="9020"/>
         </w:tabs>
@@ -8986,7 +8996,7 @@
       <w:hyperlink w:anchor="_Toc242251946" w:history="1">
         <w:r>
           <w:rPr>
-            <w:rStyle w:val="Hyperlink"/>
+            <w:rStyle w:val="Hipervnculo"/>
             <w:noProof/>
           </w:rPr>
           <w:t>Tabla 18. Actor Cliente Móvil Android</w:t>
@@ -9043,7 +9053,7 @@
     </w:p>
     <w:p>
       <w:pPr>
-        <w:pStyle w:val="TableofFigures"/>
+        <w:pStyle w:val="Tabladeilustraciones"/>
         <w:tabs>
           <w:tab w:val="right" w:leader="dot" w:pos="9020"/>
         </w:tabs>
@@ -9061,7 +9071,7 @@
       <w:hyperlink w:anchor="_Toc242251947" w:history="1">
         <w:r>
           <w:rPr>
-            <w:rStyle w:val="Hyperlink"/>
+            <w:rStyle w:val="Hipervnculo"/>
             <w:noProof/>
           </w:rPr>
           <w:t>Tabla 19. Lista de requisitos funcionales</w:t>
@@ -9118,7 +9128,7 @@
     </w:p>
     <w:p>
       <w:pPr>
-        <w:pStyle w:val="TableofFigures"/>
+        <w:pStyle w:val="Tabladeilustraciones"/>
         <w:tabs>
           <w:tab w:val="right" w:leader="dot" w:pos="9020"/>
         </w:tabs>
@@ -9136,7 +9146,7 @@
       <w:hyperlink w:anchor="_Toc242251948" w:history="1">
         <w:r>
           <w:rPr>
-            <w:rStyle w:val="Hyperlink"/>
+            <w:rStyle w:val="Hipervnculo"/>
             <w:noProof/>
           </w:rPr>
           <w:t>Tabla 20. Autenticar Cliente</w:t>
@@ -9193,7 +9203,7 @@
     </w:p>
     <w:p>
       <w:pPr>
-        <w:pStyle w:val="TableofFigures"/>
+        <w:pStyle w:val="Tabladeilustraciones"/>
         <w:tabs>
           <w:tab w:val="right" w:leader="dot" w:pos="9020"/>
         </w:tabs>
@@ -9211,7 +9221,7 @@
       <w:hyperlink w:anchor="_Toc242251949" w:history="1">
         <w:r>
           <w:rPr>
-            <w:rStyle w:val="Hyperlink"/>
+            <w:rStyle w:val="Hipervnculo"/>
             <w:noProof/>
           </w:rPr>
           <w:t>Tabla 21. Consultar catálogo</w:t>
@@ -9268,7 +9278,7 @@
     </w:p>
     <w:p>
       <w:pPr>
-        <w:pStyle w:val="TableofFigures"/>
+        <w:pStyle w:val="Tabladeilustraciones"/>
         <w:tabs>
           <w:tab w:val="right" w:leader="dot" w:pos="9020"/>
         </w:tabs>
@@ -9286,7 +9296,7 @@
       <w:hyperlink w:anchor="_Toc242251950" w:history="1">
         <w:r>
           <w:rPr>
-            <w:rStyle w:val="Hyperlink"/>
+            <w:rStyle w:val="Hipervnculo"/>
             <w:noProof/>
           </w:rPr>
           <w:t>Tabla 22. Consultar unidades por categoría</w:t>
@@ -9343,7 +9353,7 @@
     </w:p>
     <w:p>
       <w:pPr>
-        <w:pStyle w:val="TableofFigures"/>
+        <w:pStyle w:val="Tabladeilustraciones"/>
         <w:tabs>
           <w:tab w:val="right" w:leader="dot" w:pos="9020"/>
         </w:tabs>
@@ -9361,7 +9371,7 @@
       <w:hyperlink w:anchor="_Toc242251951" w:history="1">
         <w:r>
           <w:rPr>
-            <w:rStyle w:val="Hyperlink"/>
+            <w:rStyle w:val="Hipervnculo"/>
             <w:noProof/>
           </w:rPr>
           <w:t>Tabla 23. Convertir longitud</w:t>
@@ -9418,7 +9428,7 @@
     </w:p>
     <w:p>
       <w:pPr>
-        <w:pStyle w:val="TableofFigures"/>
+        <w:pStyle w:val="Tabladeilustraciones"/>
         <w:tabs>
           <w:tab w:val="right" w:leader="dot" w:pos="9020"/>
         </w:tabs>
@@ -9436,7 +9446,7 @@
       <w:hyperlink w:anchor="_Toc242251952" w:history="1">
         <w:r>
           <w:rPr>
-            <w:rStyle w:val="Hyperlink"/>
+            <w:rStyle w:val="Hipervnculo"/>
             <w:noProof/>
           </w:rPr>
           <w:t>Tabla 24. Convertir masa</w:t>
@@ -9493,7 +9503,7 @@
     </w:p>
     <w:p>
       <w:pPr>
-        <w:pStyle w:val="TableofFigures"/>
+        <w:pStyle w:val="Tabladeilustraciones"/>
         <w:tabs>
           <w:tab w:val="right" w:leader="dot" w:pos="9020"/>
         </w:tabs>
@@ -9511,7 +9521,7 @@
       <w:hyperlink w:anchor="_Toc242251953" w:history="1">
         <w:r>
           <w:rPr>
-            <w:rStyle w:val="Hyperlink"/>
+            <w:rStyle w:val="Hipervnculo"/>
             <w:noProof/>
           </w:rPr>
           <w:t>Tabla 25. Convertir temperatura</w:t>
@@ -9568,7 +9578,7 @@
     </w:p>
     <w:p>
       <w:pPr>
-        <w:pStyle w:val="TableofFigures"/>
+        <w:pStyle w:val="Tabladeilustraciones"/>
         <w:tabs>
           <w:tab w:val="right" w:leader="dot" w:pos="9020"/>
         </w:tabs>
@@ -9586,7 +9596,7 @@
       <w:hyperlink w:anchor="_Toc242251954" w:history="1">
         <w:r>
           <w:rPr>
-            <w:rStyle w:val="Hyperlink"/>
+            <w:rStyle w:val="Hipervnculo"/>
             <w:noProof/>
           </w:rPr>
           <w:t>Tabla 26. Validar token</w:t>
@@ -9643,7 +9653,7 @@
     </w:p>
     <w:p>
       <w:pPr>
-        <w:pStyle w:val="TableofFigures"/>
+        <w:pStyle w:val="Tabladeilustraciones"/>
         <w:tabs>
           <w:tab w:val="right" w:leader="dot" w:pos="9020"/>
         </w:tabs>
@@ -9661,7 +9671,7 @@
       <w:hyperlink w:anchor="_Toc242251955" w:history="1">
         <w:r>
           <w:rPr>
-            <w:rStyle w:val="Hyperlink"/>
+            <w:rStyle w:val="Hipervnculo"/>
             <w:noProof/>
           </w:rPr>
           <w:t>Tabla 27. Validar datos</w:t>
@@ -9718,7 +9728,7 @@
     </w:p>
     <w:p>
       <w:pPr>
-        <w:pStyle w:val="TableofFigures"/>
+        <w:pStyle w:val="Tabladeilustraciones"/>
         <w:tabs>
           <w:tab w:val="right" w:leader="dot" w:pos="9020"/>
         </w:tabs>
@@ -9736,7 +9746,7 @@
       <w:hyperlink w:anchor="_Toc242251956" w:history="1">
         <w:r>
           <w:rPr>
-            <w:rStyle w:val="Hyperlink"/>
+            <w:rStyle w:val="Hipervnculo"/>
             <w:noProof/>
           </w:rPr>
           <w:t>Tabla 28. Generar respuesta estructurada</w:t>
@@ -9793,7 +9803,7 @@
     </w:p>
     <w:p>
       <w:pPr>
-        <w:pStyle w:val="TableofFigures"/>
+        <w:pStyle w:val="Tabladeilustraciones"/>
         <w:tabs>
           <w:tab w:val="right" w:leader="dot" w:pos="9020"/>
         </w:tabs>
@@ -9811,7 +9821,7 @@
       <w:hyperlink w:anchor="_Toc242251957" w:history="1">
         <w:r>
           <w:rPr>
-            <w:rStyle w:val="Hyperlink"/>
+            <w:rStyle w:val="Hipervnculo"/>
             <w:noProof/>
           </w:rPr>
           <w:t>Tabla 29. Gestionar errores</w:t>
@@ -9868,7 +9878,7 @@
     </w:p>
     <w:p>
       <w:pPr>
-        <w:pStyle w:val="TableofFigures"/>
+        <w:pStyle w:val="Tabladeilustraciones"/>
         <w:tabs>
           <w:tab w:val="right" w:leader="dot" w:pos="9020"/>
         </w:tabs>
@@ -9886,7 +9896,7 @@
       <w:hyperlink w:anchor="_Toc242251958" w:history="1">
         <w:r>
           <w:rPr>
-            <w:rStyle w:val="Hyperlink"/>
+            <w:rStyle w:val="Hipervnculo"/>
             <w:noProof/>
           </w:rPr>
           <w:t>Tabla 30. Requerimiento no funcional Protocolo de Arquitectura (SOAP)</w:t>
@@ -9943,7 +9953,7 @@
     </w:p>
     <w:p>
       <w:pPr>
-        <w:pStyle w:val="TableofFigures"/>
+        <w:pStyle w:val="Tabladeilustraciones"/>
         <w:tabs>
           <w:tab w:val="right" w:leader="dot" w:pos="9020"/>
         </w:tabs>
@@ -9961,7 +9971,7 @@
       <w:hyperlink w:anchor="_Toc242251959" w:history="1">
         <w:r>
           <w:rPr>
-            <w:rStyle w:val="Hyperlink"/>
+            <w:rStyle w:val="Hipervnculo"/>
             <w:noProof/>
           </w:rPr>
           <w:t>Tabla 31. Requerimiento no funcional Especificación de Software.</w:t>
@@ -10018,7 +10028,7 @@
     </w:p>
     <w:p>
       <w:pPr>
-        <w:pStyle w:val="TableofFigures"/>
+        <w:pStyle w:val="Tabladeilustraciones"/>
         <w:tabs>
           <w:tab w:val="right" w:leader="dot" w:pos="9020"/>
         </w:tabs>
@@ -10036,7 +10046,7 @@
       <w:hyperlink w:anchor="_Toc242251960" w:history="1">
         <w:r>
           <w:rPr>
-            <w:rStyle w:val="Hyperlink"/>
+            <w:rStyle w:val="Hipervnculo"/>
             <w:noProof/>
           </w:rPr>
           <w:t>Tabla 32. Requerimiento no funcional Entorno de Desarrollo</w:t>
@@ -10093,7 +10103,7 @@
     </w:p>
     <w:p>
       <w:pPr>
-        <w:pStyle w:val="TableofFigures"/>
+        <w:pStyle w:val="Tabladeilustraciones"/>
         <w:tabs>
           <w:tab w:val="right" w:leader="dot" w:pos="9020"/>
         </w:tabs>
@@ -10111,7 +10121,7 @@
       <w:hyperlink w:anchor="_Toc242251961" w:history="1">
         <w:r>
           <w:rPr>
-            <w:rStyle w:val="Hyperlink"/>
+            <w:rStyle w:val="Hipervnculo"/>
             <w:noProof/>
           </w:rPr>
           <w:t>Tabla 33. Requerimiento no funcional Servidor de Aplicaciones</w:t>
@@ -10168,7 +10178,7 @@
     </w:p>
     <w:p>
       <w:pPr>
-        <w:pStyle w:val="TableofFigures"/>
+        <w:pStyle w:val="Tabladeilustraciones"/>
         <w:tabs>
           <w:tab w:val="right" w:leader="dot" w:pos="9020"/>
         </w:tabs>
@@ -10186,7 +10196,7 @@
       <w:hyperlink w:anchor="_Toc242251962" w:history="1">
         <w:r>
           <w:rPr>
-            <w:rStyle w:val="Hyperlink"/>
+            <w:rStyle w:val="Hipervnculo"/>
             <w:noProof/>
           </w:rPr>
           <w:t>Tabla 34. Requerimiento no funcional Seguridad y autorización de Token.</w:t>
@@ -10243,7 +10253,7 @@
     </w:p>
     <w:p>
       <w:pPr>
-        <w:pStyle w:val="TableofFigures"/>
+        <w:pStyle w:val="Tabladeilustraciones"/>
         <w:tabs>
           <w:tab w:val="right" w:leader="dot" w:pos="9020"/>
         </w:tabs>
@@ -10261,7 +10271,7 @@
       <w:hyperlink w:anchor="_Toc242251963" w:history="1">
         <w:r>
           <w:rPr>
-            <w:rStyle w:val="Hyperlink"/>
+            <w:rStyle w:val="Hipervnculo"/>
             <w:noProof/>
           </w:rPr>
           <w:t>Tabla 35. Requerimiento no funcional Accesibilidad.</w:t>
@@ -10318,7 +10328,7 @@
     </w:p>
     <w:p>
       <w:pPr>
-        <w:pStyle w:val="TableofFigures"/>
+        <w:pStyle w:val="Tabladeilustraciones"/>
         <w:tabs>
           <w:tab w:val="right" w:leader="dot" w:pos="9020"/>
         </w:tabs>
@@ -10336,7 +10346,7 @@
       <w:hyperlink w:anchor="_Toc242251964" w:history="1">
         <w:r>
           <w:rPr>
-            <w:rStyle w:val="Hyperlink"/>
+            <w:rStyle w:val="Hipervnculo"/>
             <w:noProof/>
           </w:rPr>
           <w:t>Tabla 36. Requerimiento no funcional Mantenimiento.</w:t>
@@ -10398,7 +10408,7 @@
     </w:p>
     <w:p>
       <w:pPr>
-        <w:pStyle w:val="TOCHeading"/>
+        <w:pStyle w:val="TtuloTDC"/>
       </w:pPr>
       <w:bookmarkStart w:id="1" w:name="_bookmark0"/>
       <w:bookmarkStart w:id="2" w:name="_Hlk241086724"/>
@@ -10441,7 +10451,7 @@
     </w:p>
     <w:p>
       <w:pPr>
-        <w:pStyle w:val="ListParagraph"/>
+        <w:pStyle w:val="Prrafodelista"/>
         <w:numPr>
           <w:ilvl w:val="0"/>
           <w:numId w:val="34"/>
@@ -10453,7 +10463,7 @@
     </w:p>
     <w:p>
       <w:pPr>
-        <w:pStyle w:val="ListParagraph"/>
+        <w:pStyle w:val="Prrafodelista"/>
         <w:numPr>
           <w:ilvl w:val="0"/>
           <w:numId w:val="34"/>
@@ -10465,7 +10475,7 @@
     </w:p>
     <w:p>
       <w:pPr>
-        <w:pStyle w:val="ListParagraph"/>
+        <w:pStyle w:val="Prrafodelista"/>
         <w:numPr>
           <w:ilvl w:val="0"/>
           <w:numId w:val="34"/>
@@ -10477,7 +10487,7 @@
     </w:p>
     <w:p>
       <w:pPr>
-        <w:pStyle w:val="ListParagraph"/>
+        <w:pStyle w:val="Prrafodelista"/>
         <w:numPr>
           <w:ilvl w:val="0"/>
           <w:numId w:val="34"/>
@@ -10489,12 +10499,18 @@
       </w:r>
       <w:proofErr w:type="spellEnd"/>
       <w:r>
-        <w:t>: La aplicación se despliega como cliente de consola, cliente de escritorio (Java Swing), aplicación Web (navegador) y Aplicación Móvil (Android), todas consumiendo el mismo servicio backend para garantizar consistencia en los resultados independientemente del canal.</w:t>
+        <w:t>: La aplicación se despliega como cliente de consola, cliente de escritorio (</w:t>
+      </w:r>
+      <w:r>
+        <w:t xml:space="preserve">MAUI) </w:t>
+      </w:r>
+      <w:r>
+        <w:t>aplicación Web (navegador) y Aplicación Móvil (Android), todas consumiendo el mismo servicio backend para garantizar consistencia en los resultados independientemente del canal.</w:t>
       </w:r>
     </w:p>
     <w:p>
       <w:pPr>
-        <w:pStyle w:val="ListParagraph"/>
+        <w:pStyle w:val="Prrafodelista"/>
         <w:numPr>
           <w:ilvl w:val="0"/>
           <w:numId w:val="34"/>
@@ -10509,7 +10525,7 @@
     </w:p>
     <w:p>
       <w:pPr>
-        <w:pStyle w:val="ListParagraph"/>
+        <w:pStyle w:val="Prrafodelista"/>
         <w:numPr>
           <w:ilvl w:val="0"/>
           <w:numId w:val="34"/>
@@ -10521,7 +10537,7 @@
     </w:p>
     <w:p>
       <w:pPr>
-        <w:pStyle w:val="ListParagraph"/>
+        <w:pStyle w:val="Prrafodelista"/>
         <w:numPr>
           <w:ilvl w:val="0"/>
           <w:numId w:val="34"/>
@@ -10533,7 +10549,7 @@
     </w:p>
     <w:p>
       <w:pPr>
-        <w:pStyle w:val="ListParagraph"/>
+        <w:pStyle w:val="Prrafodelista"/>
         <w:numPr>
           <w:ilvl w:val="0"/>
           <w:numId w:val="34"/>
@@ -10560,7 +10576,7 @@
     </w:p>
     <w:p>
       <w:pPr>
-        <w:pStyle w:val="ListParagraph"/>
+        <w:pStyle w:val="Prrafodelista"/>
         <w:numPr>
           <w:ilvl w:val="0"/>
           <w:numId w:val="34"/>
@@ -10572,7 +10588,7 @@
     </w:p>
     <w:p>
       <w:pPr>
-        <w:pStyle w:val="ListParagraph"/>
+        <w:pStyle w:val="Prrafodelista"/>
         <w:numPr>
           <w:ilvl w:val="0"/>
           <w:numId w:val="34"/>
@@ -10584,17 +10600,25 @@
     </w:p>
     <w:p>
       <w:pPr>
-        <w:pStyle w:val="ListParagraph"/>
+        <w:pStyle w:val="Prrafodelista"/>
         <w:numPr>
           <w:ilvl w:val="0"/>
           <w:numId w:val="34"/>
         </w:numPr>
       </w:pPr>
       <w:r>
-        <w:t xml:space="preserve">El sistema será desarrollado con NetBeans como IDE y sin uso base de datos. La arquitectura es SOA (Service </w:t>
+        <w:t>El sistema será desarrollado con NetBeans como IDE y sin uso base de datos. La arquitectura es SOA (</w:t>
       </w:r>
       <w:proofErr w:type="spellStart"/>
       <w:r>
+        <w:t>Service</w:t>
+      </w:r>
+      <w:proofErr w:type="spellEnd"/>
+      <w:r>
+        <w:t xml:space="preserve"> </w:t>
+      </w:r>
+      <w:proofErr w:type="spellStart"/>
+      <w:r>
         <w:t>Oriented</w:t>
       </w:r>
       <w:proofErr w:type="spellEnd"/>
@@ -10607,7 +10631,10 @@
       </w:r>
       <w:proofErr w:type="spellEnd"/>
       <w:r>
-        <w:t>) usando Servicios Web SOAP con Java (JAX-WS)</w:t>
+        <w:t xml:space="preserve">) usando Servicios Web SOAP con </w:t>
+      </w:r>
+      <w:r>
+        <w:t>DOTNET</w:t>
       </w:r>
       <w:bookmarkEnd w:id="2"/>
     </w:p>
@@ -10631,7 +10658,7 @@
     </w:p>
     <w:p>
       <w:pPr>
-        <w:pStyle w:val="Heading1"/>
+        <w:pStyle w:val="Ttulo1"/>
         <w:numPr>
           <w:ilvl w:val="0"/>
           <w:numId w:val="20"/>
@@ -10665,7 +10692,7 @@
     </w:p>
     <w:p>
       <w:pPr>
-        <w:pStyle w:val="Heading1"/>
+        <w:pStyle w:val="Ttulo1"/>
         <w:numPr>
           <w:ilvl w:val="0"/>
           <w:numId w:val="20"/>
@@ -10744,7 +10771,7 @@
     </w:p>
     <w:p>
       <w:pPr>
-        <w:pStyle w:val="Heading1"/>
+        <w:pStyle w:val="Ttulo1"/>
         <w:numPr>
           <w:ilvl w:val="0"/>
           <w:numId w:val="20"/>
@@ -10960,7 +10987,7 @@
     </w:p>
     <w:p>
       <w:pPr>
-        <w:pStyle w:val="Heading1"/>
+        <w:pStyle w:val="Ttulo1"/>
         <w:numPr>
           <w:ilvl w:val="0"/>
           <w:numId w:val="20"/>
@@ -10977,7 +11004,7 @@
     </w:p>
     <w:p>
       <w:pPr>
-        <w:pStyle w:val="Heading2"/>
+        <w:pStyle w:val="Ttulo2"/>
         <w:numPr>
           <w:ilvl w:val="1"/>
           <w:numId w:val="20"/>
@@ -10991,7 +11018,7 @@
     </w:p>
     <w:p>
       <w:pPr>
-        <w:pStyle w:val="Caption"/>
+        <w:pStyle w:val="Descripcin"/>
       </w:pPr>
       <w:bookmarkStart w:id="13" w:name="_Toc242251932"/>
       <w:r>
@@ -11025,7 +11052,7 @@
     </w:p>
     <w:tbl>
       <w:tblPr>
-        <w:tblStyle w:val="GridTable4-Accent1"/>
+        <w:tblStyle w:val="Tablaconcuadrcula4-nfasis1"/>
         <w:tblW w:w="0" w:type="auto"/>
         <w:tblLook w:val="04A0" w:firstRow="1" w:lastRow="0" w:firstColumn="1" w:lastColumn="0" w:noHBand="0" w:noVBand="1"/>
       </w:tblPr>
@@ -11788,7 +11815,7 @@
     </w:p>
     <w:p>
       <w:pPr>
-        <w:pStyle w:val="Heading2"/>
+        <w:pStyle w:val="Ttulo2"/>
         <w:numPr>
           <w:ilvl w:val="1"/>
           <w:numId w:val="20"/>
@@ -11804,7 +11831,7 @@
     </w:p>
     <w:p>
       <w:pPr>
-        <w:pStyle w:val="Caption"/>
+        <w:pStyle w:val="Descripcin"/>
       </w:pPr>
       <w:bookmarkStart w:id="21" w:name="_Toc242251933"/>
       <w:r>
@@ -11841,7 +11868,7 @@
     </w:p>
     <w:tbl>
       <w:tblPr>
-        <w:tblStyle w:val="GridTable4-Accent1"/>
+        <w:tblStyle w:val="Tablaconcuadrcula4-nfasis1"/>
         <w:tblW w:w="5000" w:type="pct"/>
         <w:tblLayout w:type="fixed"/>
         <w:tblLook w:val="04A0" w:firstRow="1" w:lastRow="0" w:firstColumn="1" w:lastColumn="0" w:noHBand="0" w:noVBand="1"/>
@@ -11947,7 +11974,21 @@
               <w:rPr>
                 <w:rFonts w:cs="Calibri"/>
               </w:rPr>
-              <w:t xml:space="preserve">Arquitectura Orientada a Servicios (Service-Oriented </w:t>
+              <w:t>Arquitectura Orientada a Servicios (</w:t>
+            </w:r>
+            <w:proofErr w:type="spellStart"/>
+            <w:r>
+              <w:rPr>
+                <w:rFonts w:cs="Calibri"/>
+              </w:rPr>
+              <w:t>Service-Oriented</w:t>
+            </w:r>
+            <w:proofErr w:type="spellEnd"/>
+            <w:r>
+              <w:rPr>
+                <w:rFonts w:cs="Calibri"/>
+              </w:rPr>
+              <w:t xml:space="preserve"> </w:t>
             </w:r>
             <w:proofErr w:type="spellStart"/>
             <w:r>
@@ -12193,7 +12234,21 @@
               <w:rPr>
                 <w:rFonts w:cs="Calibri"/>
               </w:rPr>
-              <w:t xml:space="preserve"> State Transfer). </w:t>
+              <w:t xml:space="preserve"> </w:t>
+            </w:r>
+            <w:proofErr w:type="spellStart"/>
+            <w:r>
+              <w:rPr>
+                <w:rFonts w:cs="Calibri"/>
+              </w:rPr>
+              <w:t>State</w:t>
+            </w:r>
+            <w:proofErr w:type="spellEnd"/>
+            <w:r>
+              <w:rPr>
+                <w:rFonts w:cs="Calibri"/>
+              </w:rPr>
+              <w:t xml:space="preserve"> Transfer). </w:t>
             </w:r>
           </w:p>
         </w:tc>
@@ -12609,13 +12664,13 @@
     </w:tbl>
     <w:p>
       <w:pPr>
-        <w:pStyle w:val="Heading1"/>
+        <w:pStyle w:val="Ttulo1"/>
         <w:ind w:left="360"/>
       </w:pPr>
     </w:p>
     <w:p>
       <w:pPr>
-        <w:pStyle w:val="Heading1"/>
+        <w:pStyle w:val="Ttulo1"/>
         <w:numPr>
           <w:ilvl w:val="0"/>
           <w:numId w:val="20"/>
@@ -12629,7 +12684,7 @@
     </w:p>
     <w:p>
       <w:pPr>
-        <w:pStyle w:val="Caption"/>
+        <w:pStyle w:val="Descripcin"/>
       </w:pPr>
       <w:bookmarkStart w:id="25" w:name="_Toc242251934"/>
       <w:r>
@@ -12663,7 +12718,7 @@
     </w:p>
     <w:tbl>
       <w:tblPr>
-        <w:tblStyle w:val="GridTable4-Accent1"/>
+        <w:tblStyle w:val="Tablaconcuadrcula4-nfasis1"/>
         <w:tblW w:w="5000" w:type="pct"/>
         <w:tblLayout w:type="fixed"/>
         <w:tblLook w:val="04A0" w:firstRow="1" w:lastRow="0" w:firstColumn="1" w:lastColumn="0" w:noHBand="0" w:noVBand="1"/>
@@ -12851,7 +12906,7 @@
             <w:hyperlink r:id="rId12">
               <w:r>
                 <w:rPr>
-                  <w:rStyle w:val="Hyperlink"/>
+                  <w:rStyle w:val="Hipervnculo"/>
                   <w:rFonts w:asciiTheme="minorHAnsi" w:hAnsiTheme="minorHAnsi" w:cstheme="minorHAnsi"/>
                 </w:rPr>
                 <w:t>http://www.qualitatis.org</w:t>
@@ -12901,7 +12956,7 @@
     </w:tbl>
     <w:p>
       <w:pPr>
-        <w:pStyle w:val="Heading1"/>
+        <w:pStyle w:val="Ttulo1"/>
         <w:ind w:left="360"/>
       </w:pPr>
       <w:bookmarkStart w:id="26" w:name="_bookmark6"/>
@@ -12909,7 +12964,7 @@
     </w:p>
     <w:p>
       <w:pPr>
-        <w:pStyle w:val="Heading1"/>
+        <w:pStyle w:val="Ttulo1"/>
         <w:numPr>
           <w:ilvl w:val="0"/>
           <w:numId w:val="20"/>
@@ -12971,7 +13026,7 @@
     </w:p>
     <w:p>
       <w:pPr>
-        <w:pStyle w:val="Heading1"/>
+        <w:pStyle w:val="Ttulo1"/>
         <w:numPr>
           <w:ilvl w:val="0"/>
           <w:numId w:val="20"/>
@@ -13033,7 +13088,7 @@
     </w:p>
     <w:p>
       <w:pPr>
-        <w:pStyle w:val="Heading2"/>
+        <w:pStyle w:val="Ttulo2"/>
         <w:numPr>
           <w:ilvl w:val="1"/>
           <w:numId w:val="20"/>
@@ -13062,7 +13117,7 @@
     </w:p>
     <w:p>
       <w:pPr>
-        <w:pStyle w:val="Heading2"/>
+        <w:pStyle w:val="Ttulo2"/>
         <w:numPr>
           <w:ilvl w:val="1"/>
           <w:numId w:val="20"/>
@@ -13102,7 +13157,7 @@
     </w:p>
     <w:p>
       <w:pPr>
-        <w:pStyle w:val="ListParagraph"/>
+        <w:pStyle w:val="Prrafodelista"/>
         <w:numPr>
           <w:ilvl w:val="0"/>
           <w:numId w:val="40"/>
@@ -13121,7 +13176,7 @@
     </w:p>
     <w:p>
       <w:pPr>
-        <w:pStyle w:val="ListParagraph"/>
+        <w:pStyle w:val="Prrafodelista"/>
         <w:numPr>
           <w:ilvl w:val="0"/>
           <w:numId w:val="40"/>
@@ -13140,7 +13195,7 @@
     </w:p>
     <w:p>
       <w:pPr>
-        <w:pStyle w:val="ListParagraph"/>
+        <w:pStyle w:val="Prrafodelista"/>
         <w:numPr>
           <w:ilvl w:val="0"/>
           <w:numId w:val="40"/>
@@ -13159,7 +13214,7 @@
     </w:p>
     <w:p>
       <w:pPr>
-        <w:pStyle w:val="ListParagraph"/>
+        <w:pStyle w:val="Prrafodelista"/>
         <w:numPr>
           <w:ilvl w:val="0"/>
           <w:numId w:val="40"/>
@@ -13178,7 +13233,7 @@
     </w:p>
     <w:p>
       <w:pPr>
-        <w:pStyle w:val="ListParagraph"/>
+        <w:pStyle w:val="Prrafodelista"/>
         <w:numPr>
           <w:ilvl w:val="0"/>
           <w:numId w:val="40"/>
@@ -13197,7 +13252,7 @@
     </w:p>
     <w:p>
       <w:pPr>
-        <w:pStyle w:val="ListParagraph"/>
+        <w:pStyle w:val="Prrafodelista"/>
         <w:numPr>
           <w:ilvl w:val="0"/>
           <w:numId w:val="40"/>
@@ -13216,7 +13271,7 @@
     </w:p>
     <w:p>
       <w:pPr>
-        <w:pStyle w:val="ListParagraph"/>
+        <w:pStyle w:val="Prrafodelista"/>
         <w:numPr>
           <w:ilvl w:val="0"/>
           <w:numId w:val="40"/>
@@ -13235,7 +13290,7 @@
     </w:p>
     <w:p>
       <w:pPr>
-        <w:pStyle w:val="ListParagraph"/>
+        <w:pStyle w:val="Prrafodelista"/>
         <w:numPr>
           <w:ilvl w:val="0"/>
           <w:numId w:val="40"/>
@@ -13254,7 +13309,7 @@
     </w:p>
     <w:p>
       <w:pPr>
-        <w:pStyle w:val="ListParagraph"/>
+        <w:pStyle w:val="Prrafodelista"/>
         <w:numPr>
           <w:ilvl w:val="0"/>
           <w:numId w:val="40"/>
@@ -13279,7 +13334,7 @@
     </w:p>
     <w:p>
       <w:pPr>
-        <w:pStyle w:val="Caption"/>
+        <w:pStyle w:val="Descripcin"/>
       </w:pPr>
       <w:bookmarkStart w:id="33" w:name="_Toc242251965"/>
       <w:r>
@@ -13373,7 +13428,7 @@
     <w:bookmarkStart w:id="34" w:name="_Toc242251891"/>
     <w:p>
       <w:pPr>
-        <w:pStyle w:val="Heading2"/>
+        <w:pStyle w:val="Ttulo2"/>
         <w:spacing w:before="0" w:after="0"/>
       </w:pPr>
       <w:r>
@@ -13448,7 +13503,7 @@
               </wp:anchor>
             </w:drawing>
           </mc:Choice>
-          <mc:Fallback>
+          <mc:Fallback xmlns:w16sdtfl="http://schemas.microsoft.com/office/word/2024/wordml/sdtformatlock" xmlns:w16du="http://schemas.microsoft.com/office/word/2023/wordml/word16du" xmlns:oel="http://schemas.microsoft.com/office/2019/extlst">
             <w:pict>
               <v:rect w14:anchorId="6C311DD8" id="Rectangle 1979" o:spid="_x0000_s1026" style="position:absolute;margin-left:113.45pt;margin-top:12.85pt;width:3.85pt;height:1.4pt;z-index:-251658240;visibility:visible;mso-wrap-style:square;mso-width-percent:0;mso-height-percent:0;mso-wrap-distance-left:9pt;mso-wrap-distance-top:0;mso-wrap-distance-right:9pt;mso-wrap-distance-bottom:0;mso-position-horizontal:absolute;mso-position-horizontal-relative:page;mso-position-vertical:absolute;mso-position-vertical-relative:text;mso-width-percent:0;mso-height-percent:0;mso-width-relative:page;mso-height-relative:page;v-text-anchor:top" o:gfxdata="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" fillcolor="black" stroked="f">
                 <w10:wrap anchorx="page"/>
@@ -13483,7 +13538,7 @@
     </w:p>
     <w:p>
       <w:pPr>
-        <w:pStyle w:val="Heading2"/>
+        <w:pStyle w:val="Ttulo2"/>
         <w:spacing w:before="0" w:after="0"/>
       </w:pPr>
       <w:bookmarkStart w:id="36" w:name="_bookmark11"/>
@@ -13513,7 +13568,7 @@
     </w:p>
     <w:p>
       <w:pPr>
-        <w:pStyle w:val="Caption"/>
+        <w:pStyle w:val="Descripcin"/>
         <w:spacing w:before="0" w:after="0"/>
       </w:pPr>
       <w:bookmarkStart w:id="38" w:name="_Toc242251935"/>
@@ -13551,7 +13606,7 @@
     </w:p>
     <w:tbl>
       <w:tblPr>
-        <w:tblStyle w:val="GridTable4-Accent1"/>
+        <w:tblStyle w:val="Tablaconcuadrcula4-nfasis1"/>
         <w:tblW w:w="9133" w:type="dxa"/>
         <w:tblLook w:val="04A0" w:firstRow="1" w:lastRow="0" w:firstColumn="1" w:lastColumn="0" w:noHBand="0" w:noVBand="1"/>
       </w:tblPr>
@@ -13681,14 +13736,14 @@
     </w:tbl>
     <w:p>
       <w:pPr>
-        <w:pStyle w:val="Heading2"/>
+        <w:pStyle w:val="Ttulo2"/>
       </w:pPr>
       <w:bookmarkStart w:id="39" w:name="_bookmark12"/>
       <w:bookmarkEnd w:id="39"/>
     </w:p>
     <w:p>
       <w:pPr>
-        <w:pStyle w:val="Heading2"/>
+        <w:pStyle w:val="Ttulo2"/>
         <w:spacing w:before="0" w:after="0"/>
       </w:pPr>
       <w:bookmarkStart w:id="40" w:name="_Toc242251893"/>
@@ -13715,7 +13770,7 @@
     </w:p>
     <w:p>
       <w:pPr>
-        <w:pStyle w:val="Heading2"/>
+        <w:pStyle w:val="Ttulo2"/>
         <w:spacing w:before="0" w:after="0"/>
         <w:rPr>
           <w:rFonts w:cs="Calibri"/>
@@ -13741,7 +13796,7 @@
     </w:p>
     <w:p>
       <w:pPr>
-        <w:pStyle w:val="ListParagraph"/>
+        <w:pStyle w:val="Prrafodelista"/>
         <w:numPr>
           <w:ilvl w:val="0"/>
           <w:numId w:val="41"/>
@@ -13749,20 +13804,12 @@
         <w:spacing w:before="0" w:after="0"/>
       </w:pPr>
       <w:r>
-        <w:t xml:space="preserve">Hardware: los equipos para el servidor y los clientes deben contar con especificaciones básicas, por </w:t>
-      </w:r>
-      <w:proofErr w:type="gramStart"/>
-      <w:r>
-        <w:t>ejemplo</w:t>
-      </w:r>
-      <w:proofErr w:type="gramEnd"/>
-      <w:r>
-        <w:t xml:space="preserve"> procesador Intel i3-10100, 4 GB de RAM y tarjeta de red funcional.</w:t>
+        <w:t>Hardware: los equipos para el servidor y los clientes deben contar con especificaciones básicas, por ejemplo procesador Intel i3-10100, 4 GB de RAM y tarjeta de red funcional.</w:t>
       </w:r>
     </w:p>
     <w:p>
       <w:pPr>
-        <w:pStyle w:val="ListParagraph"/>
+        <w:pStyle w:val="Prrafodelista"/>
         <w:numPr>
           <w:ilvl w:val="0"/>
           <w:numId w:val="41"/>
@@ -13775,7 +13822,7 @@
     </w:p>
     <w:p>
       <w:pPr>
-        <w:pStyle w:val="ListParagraph"/>
+        <w:pStyle w:val="Prrafodelista"/>
         <w:numPr>
           <w:ilvl w:val="0"/>
           <w:numId w:val="41"/>
@@ -13788,7 +13835,7 @@
     </w:p>
     <w:p>
       <w:pPr>
-        <w:pStyle w:val="ListParagraph"/>
+        <w:pStyle w:val="Prrafodelista"/>
         <w:numPr>
           <w:ilvl w:val="0"/>
           <w:numId w:val="41"/>
@@ -13801,7 +13848,7 @@
     </w:p>
     <w:p>
       <w:pPr>
-        <w:pStyle w:val="ListParagraph"/>
+        <w:pStyle w:val="Prrafodelista"/>
         <w:numPr>
           <w:ilvl w:val="0"/>
           <w:numId w:val="41"/>
@@ -13814,7 +13861,7 @@
     </w:p>
     <w:p>
       <w:pPr>
-        <w:pStyle w:val="ListParagraph"/>
+        <w:pStyle w:val="Prrafodelista"/>
         <w:numPr>
           <w:ilvl w:val="0"/>
           <w:numId w:val="41"/>
@@ -13827,7 +13874,7 @@
     </w:p>
     <w:p>
       <w:pPr>
-        <w:pStyle w:val="ListParagraph"/>
+        <w:pStyle w:val="Prrafodelista"/>
         <w:numPr>
           <w:ilvl w:val="0"/>
           <w:numId w:val="41"/>
@@ -13856,7 +13903,7 @@
     </w:p>
     <w:p>
       <w:pPr>
-        <w:pStyle w:val="ListParagraph"/>
+        <w:pStyle w:val="Prrafodelista"/>
         <w:numPr>
           <w:ilvl w:val="0"/>
           <w:numId w:val="41"/>
@@ -13869,7 +13916,7 @@
     </w:p>
     <w:p>
       <w:pPr>
-        <w:pStyle w:val="ListParagraph"/>
+        <w:pStyle w:val="Prrafodelista"/>
         <w:numPr>
           <w:ilvl w:val="0"/>
           <w:numId w:val="41"/>
@@ -13901,7 +13948,7 @@
     </w:p>
     <w:p>
       <w:pPr>
-        <w:pStyle w:val="Heading2"/>
+        <w:pStyle w:val="Ttulo2"/>
         <w:spacing w:before="0" w:after="0"/>
       </w:pPr>
       <w:bookmarkStart w:id="43" w:name="_bookmark14"/>
@@ -13985,7 +14032,7 @@
     </w:p>
     <w:p>
       <w:pPr>
-        <w:pStyle w:val="Heading1"/>
+        <w:pStyle w:val="Ttulo1"/>
         <w:numPr>
           <w:ilvl w:val="0"/>
           <w:numId w:val="20"/>
@@ -14000,7 +14047,7 @@
     </w:p>
     <w:p>
       <w:pPr>
-        <w:pStyle w:val="Heading2"/>
+        <w:pStyle w:val="Ttulo2"/>
       </w:pPr>
       <w:bookmarkStart w:id="46" w:name="_bookmark16"/>
       <w:bookmarkStart w:id="47" w:name="_Toc242251897"/>
@@ -14015,7 +14062,7 @@
     </w:p>
     <w:p>
       <w:pPr>
-        <w:pStyle w:val="Heading3"/>
+        <w:pStyle w:val="Ttulo3"/>
       </w:pPr>
       <w:bookmarkStart w:id="48" w:name="_Toc242251898"/>
       <w:r>
@@ -14050,7 +14097,7 @@
     </w:p>
     <w:p>
       <w:pPr>
-        <w:pStyle w:val="Heading3"/>
+        <w:pStyle w:val="Ttulo3"/>
       </w:pPr>
       <w:bookmarkStart w:id="49" w:name="_Toc242251899"/>
       <w:r>
@@ -14063,7 +14110,7 @@
     </w:p>
     <w:p>
       <w:pPr>
-        <w:pStyle w:val="Caption"/>
+        <w:pStyle w:val="Descripcin"/>
       </w:pPr>
       <w:bookmarkStart w:id="50" w:name="_Toc242251936"/>
       <w:r>
@@ -14097,7 +14144,7 @@
     </w:p>
     <w:tbl>
       <w:tblPr>
-        <w:tblStyle w:val="GridTable4-Accent1"/>
+        <w:tblStyle w:val="Tablaconcuadrcula4-nfasis1"/>
         <w:tblW w:w="0" w:type="auto"/>
         <w:tblLook w:val="04A0" w:firstRow="1" w:lastRow="0" w:firstColumn="1" w:lastColumn="0" w:noHBand="0" w:noVBand="1"/>
       </w:tblPr>
@@ -15001,7 +15048,7 @@
     </w:tbl>
     <w:p>
       <w:pPr>
-        <w:pStyle w:val="Heading3"/>
+        <w:pStyle w:val="Ttulo3"/>
       </w:pPr>
       <w:bookmarkStart w:id="51" w:name="_Toc242251900"/>
       <w:r>
@@ -15015,7 +15062,7 @@
     </w:p>
     <w:p>
       <w:pPr>
-        <w:pStyle w:val="Caption"/>
+        <w:pStyle w:val="Descripcin"/>
       </w:pPr>
       <w:bookmarkStart w:id="52" w:name="_Toc242251937"/>
       <w:r>
@@ -15049,7 +15096,7 @@
     </w:p>
     <w:tbl>
       <w:tblPr>
-        <w:tblStyle w:val="GridTable4-Accent1"/>
+        <w:tblStyle w:val="Tablaconcuadrcula4-nfasis1"/>
         <w:tblW w:w="5000" w:type="pct"/>
         <w:tblLook w:val="04A0" w:firstRow="1" w:lastRow="0" w:firstColumn="1" w:lastColumn="0" w:noHBand="0" w:noVBand="1"/>
       </w:tblPr>
@@ -15167,7 +15214,7 @@
             <w:hyperlink r:id="rId14" w:history="1">
               <w:r>
                 <w:rPr>
-                  <w:rStyle w:val="Hyperlink"/>
+                  <w:rStyle w:val="Hipervnculo"/>
                 </w:rPr>
                 <w:t xml:space="preserve"> http://windows.microsoft.com/</w:t>
               </w:r>
@@ -15280,7 +15327,7 @@
             <w:hyperlink r:id="rId15" w:history="1">
               <w:r>
                 <w:rPr>
-                  <w:rStyle w:val="Hyperlink"/>
+                  <w:rStyle w:val="Hipervnculo"/>
                 </w:rPr>
                 <w:t>https://visualstudio.microsoft.com</w:t>
               </w:r>
@@ -15292,13 +15339,7 @@
               <w:cnfStyle w:val="000000000000" w:firstRow="0" w:lastRow="0" w:firstColumn="0" w:lastColumn="0" w:oddVBand="0" w:evenVBand="0" w:oddHBand="0" w:evenHBand="0" w:firstRowFirstColumn="0" w:firstRowLastColumn="0" w:lastRowFirstColumn="0" w:lastRowLastColumn="0"/>
             </w:pPr>
             <w:r>
-              <w:t>Distribución:</w:t>
-            </w:r>
-            <w:r>
-              <w:t xml:space="preserve"> </w:t>
-            </w:r>
-            <w:r>
-              <w:t>Licencia gratuita (Community)</w:t>
+              <w:t>Distribución: Licencia gratuita (Community)</w:t>
             </w:r>
           </w:p>
         </w:tc>
@@ -15367,7 +15408,15 @@
               <w:cnfStyle w:val="000000100000" w:firstRow="0" w:lastRow="0" w:firstColumn="0" w:lastColumn="0" w:oddVBand="0" w:evenVBand="0" w:oddHBand="1" w:evenHBand="0" w:firstRowFirstColumn="0" w:firstRowLastColumn="0" w:lastRowFirstColumn="0" w:lastRowLastColumn="0"/>
             </w:pPr>
             <w:r>
-              <w:t xml:space="preserve">Nombre: Power </w:t>
+              <w:t xml:space="preserve">Nombre: </w:t>
+            </w:r>
+            <w:proofErr w:type="spellStart"/>
+            <w:r>
+              <w:t>Power</w:t>
+            </w:r>
+            <w:proofErr w:type="spellEnd"/>
+            <w:r>
+              <w:t xml:space="preserve"> </w:t>
             </w:r>
             <w:proofErr w:type="spellStart"/>
             <w:r>
@@ -15486,13 +15535,7 @@
               <w:cnfStyle w:val="000000000000" w:firstRow="0" w:lastRow="0" w:firstColumn="0" w:lastColumn="0" w:oddVBand="0" w:evenVBand="0" w:oddHBand="0" w:evenHBand="0" w:firstRowFirstColumn="0" w:firstRowLastColumn="0" w:lastRowFirstColumn="0" w:lastRowLastColumn="0"/>
             </w:pPr>
             <w:r>
-              <w:t>Versión:</w:t>
-            </w:r>
-            <w:r>
-              <w:t xml:space="preserve"> </w:t>
-            </w:r>
-            <w:r>
-              <w:t>6/7(según implementación)</w:t>
+              <w:t>Versión: 6/7(según implementación)</w:t>
             </w:r>
           </w:p>
           <w:p>
@@ -15626,7 +15669,7 @@
             <w:hyperlink r:id="rId16" w:history="1">
               <w:r>
                 <w:rPr>
-                  <w:rStyle w:val="Hyperlink"/>
+                  <w:rStyle w:val="Hipervnculo"/>
                 </w:rPr>
                 <w:t>https://www.iis.net/</w:t>
               </w:r>
@@ -15679,7 +15722,7 @@
     </w:tbl>
     <w:p>
       <w:pPr>
-        <w:pStyle w:val="Heading3"/>
+        <w:pStyle w:val="Ttulo3"/>
       </w:pPr>
       <w:bookmarkStart w:id="53" w:name="_Toc242251901"/>
       <w:r>
@@ -15721,7 +15764,7 @@
     </w:p>
     <w:p>
       <w:pPr>
-        <w:pStyle w:val="ListParagraph"/>
+        <w:pStyle w:val="Prrafodelista"/>
         <w:numPr>
           <w:ilvl w:val="0"/>
           <w:numId w:val="24"/>
@@ -15750,7 +15793,7 @@
     </w:p>
     <w:p>
       <w:pPr>
-        <w:pStyle w:val="ListParagraph"/>
+        <w:pStyle w:val="Prrafodelista"/>
         <w:numPr>
           <w:ilvl w:val="0"/>
           <w:numId w:val="24"/>
@@ -15783,7 +15826,7 @@
     </w:p>
     <w:p>
       <w:pPr>
-        <w:pStyle w:val="ListParagraph"/>
+        <w:pStyle w:val="Prrafodelista"/>
         <w:numPr>
           <w:ilvl w:val="0"/>
           <w:numId w:val="24"/>
@@ -15808,7 +15851,7 @@
     </w:p>
     <w:p>
       <w:pPr>
-        <w:pStyle w:val="Heading2"/>
+        <w:pStyle w:val="Ttulo2"/>
       </w:pPr>
       <w:bookmarkStart w:id="54" w:name="_Toc242251902"/>
       <w:r>
@@ -15821,7 +15864,7 @@
     </w:p>
     <w:p>
       <w:pPr>
-        <w:pStyle w:val="Heading3"/>
+        <w:pStyle w:val="Ttulo3"/>
       </w:pPr>
       <w:bookmarkStart w:id="55" w:name="_Toc242251903"/>
       <w:r>
@@ -15845,7 +15888,7 @@
     </w:p>
     <w:p>
       <w:pPr>
-        <w:pStyle w:val="Heading3"/>
+        <w:pStyle w:val="Ttulo3"/>
       </w:pPr>
       <w:bookmarkStart w:id="56" w:name="_Toc242251904"/>
       <w:r>
@@ -15869,7 +15912,7 @@
     </w:p>
     <w:p>
       <w:pPr>
-        <w:pStyle w:val="Caption"/>
+        <w:pStyle w:val="Descripcin"/>
         <w:rPr>
           <w:rFonts w:ascii="Verdana" w:eastAsia="Droid Sans Fallback" w:hAnsi="Verdana" w:cstheme="minorHAnsi"/>
           <w:sz w:val="24"/>
@@ -15908,7 +15951,7 @@
     </w:p>
     <w:tbl>
       <w:tblPr>
-        <w:tblStyle w:val="GridTable4-Accent1"/>
+        <w:tblStyle w:val="Tablaconcuadrcula4-nfasis1"/>
         <w:tblW w:w="0" w:type="auto"/>
         <w:tblLook w:val="04A0" w:firstRow="1" w:lastRow="0" w:firstColumn="1" w:lastColumn="0" w:noHBand="0" w:noVBand="1"/>
       </w:tblPr>
@@ -16039,7 +16082,7 @@
     </w:tbl>
     <w:p>
       <w:pPr>
-        <w:pStyle w:val="Caption"/>
+        <w:pStyle w:val="Descripcin"/>
       </w:pPr>
       <w:bookmarkStart w:id="58" w:name="_Toc242251939"/>
       <w:r>
@@ -16076,7 +16119,7 @@
     </w:p>
     <w:tbl>
       <w:tblPr>
-        <w:tblStyle w:val="GridTable4-Accent1"/>
+        <w:tblStyle w:val="Tablaconcuadrcula4-nfasis1"/>
         <w:tblW w:w="0" w:type="auto"/>
         <w:tblLook w:val="04A0" w:firstRow="1" w:lastRow="0" w:firstColumn="1" w:lastColumn="0" w:noHBand="0" w:noVBand="1"/>
       </w:tblPr>
@@ -16212,7 +16255,7 @@
     </w:tbl>
     <w:p>
       <w:pPr>
-        <w:pStyle w:val="Caption"/>
+        <w:pStyle w:val="Descripcin"/>
       </w:pPr>
       <w:bookmarkStart w:id="59" w:name="_Toc242251940"/>
       <w:r>
@@ -16246,7 +16289,7 @@
     </w:p>
     <w:tbl>
       <w:tblPr>
-        <w:tblStyle w:val="GridTable4-Accent1"/>
+        <w:tblStyle w:val="Tablaconcuadrcula4-nfasis1"/>
         <w:tblW w:w="0" w:type="auto"/>
         <w:tblLook w:val="04A0" w:firstRow="1" w:lastRow="0" w:firstColumn="1" w:lastColumn="0" w:noHBand="0" w:noVBand="1"/>
       </w:tblPr>
@@ -16380,7 +16423,7 @@
     </w:tbl>
     <w:p>
       <w:pPr>
-        <w:pStyle w:val="Caption"/>
+        <w:pStyle w:val="Descripcin"/>
       </w:pPr>
       <w:bookmarkStart w:id="60" w:name="_Toc242251941"/>
       <w:r>
@@ -16417,7 +16460,7 @@
     </w:p>
     <w:tbl>
       <w:tblPr>
-        <w:tblStyle w:val="GridTable4-Accent1"/>
+        <w:tblStyle w:val="Tablaconcuadrcula4-nfasis1"/>
         <w:tblW w:w="0" w:type="auto"/>
         <w:tblLook w:val="04A0" w:firstRow="1" w:lastRow="0" w:firstColumn="1" w:lastColumn="0" w:noHBand="0" w:noVBand="1"/>
       </w:tblPr>
@@ -16551,12 +16594,12 @@
     </w:tbl>
     <w:p>
       <w:pPr>
-        <w:pStyle w:val="Heading3"/>
+        <w:pStyle w:val="Ttulo3"/>
       </w:pPr>
     </w:p>
     <w:p>
       <w:pPr>
-        <w:pStyle w:val="Heading3"/>
+        <w:pStyle w:val="Ttulo3"/>
       </w:pPr>
       <w:bookmarkStart w:id="61" w:name="_Toc242251905"/>
       <w:r>
@@ -16566,7 +16609,7 @@
     </w:p>
     <w:p>
       <w:pPr>
-        <w:pStyle w:val="Caption"/>
+        <w:pStyle w:val="Descripcin"/>
       </w:pPr>
       <w:bookmarkStart w:id="62" w:name="_Toc242251942"/>
       <w:r>
@@ -16600,7 +16643,7 @@
     </w:p>
     <w:tbl>
       <w:tblPr>
-        <w:tblStyle w:val="GridTable4-Accent1"/>
+        <w:tblStyle w:val="Tablaconcuadrcula4-nfasis1"/>
         <w:tblW w:w="0" w:type="auto"/>
         <w:tblLook w:val="04A0" w:firstRow="1" w:lastRow="0" w:firstColumn="1" w:lastColumn="0" w:noHBand="0" w:noVBand="1"/>
       </w:tblPr>
@@ -16778,7 +16821,7 @@
     </w:tbl>
     <w:p>
       <w:pPr>
-        <w:pStyle w:val="Caption"/>
+        <w:pStyle w:val="Descripcin"/>
       </w:pPr>
       <w:bookmarkStart w:id="63" w:name="_Toc242251943"/>
       <w:r>
@@ -16818,7 +16861,7 @@
     </w:p>
     <w:tbl>
       <w:tblPr>
-        <w:tblStyle w:val="GridTable4-Accent1"/>
+        <w:tblStyle w:val="Tablaconcuadrcula4-nfasis1"/>
         <w:tblW w:w="0" w:type="auto"/>
         <w:tblLook w:val="04A0" w:firstRow="1" w:lastRow="0" w:firstColumn="1" w:lastColumn="0" w:noHBand="0" w:noVBand="1"/>
       </w:tblPr>
@@ -16943,7 +16986,23 @@
                 <w:sz w:val="22"/>
                 <w:szCs w:val="22"/>
               </w:rPr>
-              <w:t>Aplicación Java ejecutada desde la línea de comandos.</w:t>
+              <w:t xml:space="preserve">Aplicación </w:t>
+            </w:r>
+            <w:r>
+              <w:rPr>
+                <w:rFonts w:ascii="Calibri" w:hAnsi="Calibri" w:cstheme="minorHAnsi"/>
+                <w:sz w:val="22"/>
+                <w:szCs w:val="22"/>
+              </w:rPr>
+              <w:t>DOTNET</w:t>
+            </w:r>
+            <w:r>
+              <w:rPr>
+                <w:rFonts w:ascii="Calibri" w:hAnsi="Calibri" w:cstheme="minorHAnsi"/>
+                <w:sz w:val="22"/>
+                <w:szCs w:val="22"/>
+              </w:rPr>
+              <w:t xml:space="preserve"> ejecutada desde la línea de comandos.</w:t>
             </w:r>
           </w:p>
         </w:tc>
@@ -17004,7 +17063,7 @@
     </w:tbl>
     <w:p>
       <w:pPr>
-        <w:pStyle w:val="Caption"/>
+        <w:pStyle w:val="Descripcin"/>
       </w:pPr>
       <w:bookmarkStart w:id="64" w:name="_Toc242251944"/>
       <w:r>
@@ -17044,7 +17103,7 @@
     </w:p>
     <w:tbl>
       <w:tblPr>
-        <w:tblStyle w:val="GridTable4-Accent1"/>
+        <w:tblStyle w:val="Tablaconcuadrcula4-nfasis1"/>
         <w:tblW w:w="0" w:type="auto"/>
         <w:tblLook w:val="04A0" w:firstRow="1" w:lastRow="0" w:firstColumn="1" w:lastColumn="0" w:noHBand="0" w:noVBand="1"/>
       </w:tblPr>
@@ -17169,7 +17228,15 @@
                 <w:sz w:val="22"/>
                 <w:szCs w:val="22"/>
               </w:rPr>
-              <w:t>Aplicación de escritorio desarrollada con Java Swing.</w:t>
+              <w:t xml:space="preserve">Aplicación de escritorio desarrollada con </w:t>
+            </w:r>
+            <w:r>
+              <w:rPr>
+                <w:rFonts w:ascii="Calibri" w:hAnsi="Calibri" w:cstheme="minorHAnsi"/>
+                <w:sz w:val="22"/>
+                <w:szCs w:val="22"/>
+              </w:rPr>
+              <w:t>DOTNET y MAUI</w:t>
             </w:r>
           </w:p>
         </w:tc>
@@ -17230,7 +17297,7 @@
     </w:tbl>
     <w:p>
       <w:pPr>
-        <w:pStyle w:val="Caption"/>
+        <w:pStyle w:val="Descripcin"/>
       </w:pPr>
       <w:bookmarkStart w:id="65" w:name="_Toc242251945"/>
       <w:r>
@@ -17270,7 +17337,7 @@
     </w:p>
     <w:tbl>
       <w:tblPr>
-        <w:tblStyle w:val="GridTable4-Accent1"/>
+        <w:tblStyle w:val="Tablaconcuadrcula4-nfasis1"/>
         <w:tblW w:w="0" w:type="auto"/>
         <w:tblLook w:val="04A0" w:firstRow="1" w:lastRow="0" w:firstColumn="1" w:lastColumn="0" w:noHBand="0" w:noVBand="1"/>
       </w:tblPr>
@@ -17456,7 +17523,7 @@
     </w:tbl>
     <w:p>
       <w:pPr>
-        <w:pStyle w:val="Caption"/>
+        <w:pStyle w:val="Descripcin"/>
       </w:pPr>
       <w:bookmarkStart w:id="66" w:name="_Toc242251946"/>
       <w:r>
@@ -17496,7 +17563,7 @@
     </w:p>
     <w:tbl>
       <w:tblPr>
-        <w:tblStyle w:val="GridTable4-Accent1"/>
+        <w:tblStyle w:val="Tablaconcuadrcula4-nfasis1"/>
         <w:tblW w:w="0" w:type="auto"/>
         <w:tblLook w:val="04A0" w:firstRow="1" w:lastRow="0" w:firstColumn="1" w:lastColumn="0" w:noHBand="0" w:noVBand="1"/>
       </w:tblPr>
@@ -17683,22 +17750,22 @@
     </w:tbl>
     <w:p>
       <w:pPr>
-        <w:pStyle w:val="Heading3"/>
+        <w:pStyle w:val="Ttulo3"/>
       </w:pPr>
     </w:p>
     <w:p>
       <w:pPr>
-        <w:pStyle w:val="Heading3"/>
+        <w:pStyle w:val="Ttulo3"/>
       </w:pPr>
     </w:p>
     <w:p>
       <w:pPr>
-        <w:pStyle w:val="Heading3"/>
+        <w:pStyle w:val="Ttulo3"/>
       </w:pPr>
     </w:p>
     <w:p>
       <w:pPr>
-        <w:pStyle w:val="Heading3"/>
+        <w:pStyle w:val="Ttulo3"/>
       </w:pPr>
       <w:bookmarkStart w:id="67" w:name="_Toc242251906"/>
       <w:r>
@@ -17725,7 +17792,7 @@
     </w:p>
     <w:p>
       <w:pPr>
-        <w:pStyle w:val="Caption"/>
+        <w:pStyle w:val="Descripcin"/>
       </w:pPr>
       <w:bookmarkStart w:id="68" w:name="_Toc242251947"/>
       <w:r>
@@ -17762,7 +17829,7 @@
     </w:p>
     <w:tbl>
       <w:tblPr>
-        <w:tblStyle w:val="GridTable4-Accent1"/>
+        <w:tblStyle w:val="Tablaconcuadrcula4-nfasis1"/>
         <w:tblW w:w="5003" w:type="pct"/>
         <w:tblLook w:val="04A0" w:firstRow="1" w:lastRow="0" w:firstColumn="1" w:lastColumn="0" w:noHBand="0" w:noVBand="1"/>
       </w:tblPr>
@@ -18415,12 +18482,12 @@
     </w:tbl>
     <w:p>
       <w:pPr>
-        <w:pStyle w:val="Heading3"/>
+        <w:pStyle w:val="Ttulo3"/>
       </w:pPr>
     </w:p>
     <w:p>
       <w:pPr>
-        <w:pStyle w:val="Heading3"/>
+        <w:pStyle w:val="Ttulo3"/>
       </w:pPr>
       <w:bookmarkStart w:id="69" w:name="_Toc242251907"/>
       <w:r>
@@ -18444,7 +18511,7 @@
     </w:p>
     <w:p>
       <w:pPr>
-        <w:pStyle w:val="Caption"/>
+        <w:pStyle w:val="Descripcin"/>
       </w:pPr>
       <w:bookmarkStart w:id="70" w:name="_Toc242251948"/>
       <w:r>
@@ -18481,7 +18548,7 @@
     </w:p>
     <w:tbl>
       <w:tblPr>
-        <w:tblStyle w:val="GridTable4-Accent1"/>
+        <w:tblStyle w:val="Tablaconcuadrcula4-nfasis1"/>
         <w:tblW w:w="9020" w:type="dxa"/>
         <w:tblLook w:val="04A0" w:firstRow="1" w:lastRow="0" w:firstColumn="1" w:lastColumn="0" w:noHBand="0" w:noVBand="1"/>
       </w:tblPr>
@@ -18876,7 +18943,7 @@
     </w:tbl>
     <w:p>
       <w:pPr>
-        <w:pStyle w:val="Caption"/>
+        <w:pStyle w:val="Descripcin"/>
       </w:pPr>
       <w:bookmarkStart w:id="71" w:name="_Toc242251949"/>
       <w:r>
@@ -18916,7 +18983,7 @@
     </w:p>
     <w:tbl>
       <w:tblPr>
-        <w:tblStyle w:val="GridTable4-Accent1"/>
+        <w:tblStyle w:val="Tablaconcuadrcula4-nfasis1"/>
         <w:tblW w:w="9020" w:type="dxa"/>
         <w:tblLook w:val="04A0" w:firstRow="1" w:lastRow="0" w:firstColumn="1" w:lastColumn="0" w:noHBand="0" w:noVBand="1"/>
       </w:tblPr>
@@ -19327,7 +19394,7 @@
     </w:tbl>
     <w:p>
       <w:pPr>
-        <w:pStyle w:val="Caption"/>
+        <w:pStyle w:val="Descripcin"/>
       </w:pPr>
       <w:bookmarkStart w:id="72" w:name="_Toc242251950"/>
       <w:r>
@@ -19367,7 +19434,7 @@
     </w:p>
     <w:tbl>
       <w:tblPr>
-        <w:tblStyle w:val="GridTable4-Accent1"/>
+        <w:tblStyle w:val="Tablaconcuadrcula4-nfasis1"/>
         <w:tblW w:w="9020" w:type="dxa"/>
         <w:tblLook w:val="04A0" w:firstRow="1" w:lastRow="0" w:firstColumn="1" w:lastColumn="0" w:noHBand="0" w:noVBand="1"/>
       </w:tblPr>
@@ -19778,7 +19845,7 @@
     </w:tbl>
     <w:p>
       <w:pPr>
-        <w:pStyle w:val="Caption"/>
+        <w:pStyle w:val="Descripcin"/>
       </w:pPr>
       <w:bookmarkStart w:id="73" w:name="_Toc242251951"/>
       <w:r>
@@ -19818,7 +19885,7 @@
     </w:p>
     <w:tbl>
       <w:tblPr>
-        <w:tblStyle w:val="GridTable4-Accent1"/>
+        <w:tblStyle w:val="Tablaconcuadrcula4-nfasis1"/>
         <w:tblW w:w="9020" w:type="dxa"/>
         <w:tblLook w:val="04A0" w:firstRow="1" w:lastRow="0" w:firstColumn="1" w:lastColumn="0" w:noHBand="0" w:noVBand="1"/>
       </w:tblPr>
@@ -20230,7 +20297,7 @@
     </w:tbl>
     <w:p>
       <w:pPr>
-        <w:pStyle w:val="Caption"/>
+        <w:pStyle w:val="Descripcin"/>
       </w:pPr>
       <w:bookmarkStart w:id="74" w:name="_Toc242251952"/>
       <w:r>
@@ -20270,7 +20337,7 @@
     </w:p>
     <w:tbl>
       <w:tblPr>
-        <w:tblStyle w:val="GridTable4-Accent1"/>
+        <w:tblStyle w:val="Tablaconcuadrcula4-nfasis1"/>
         <w:tblW w:w="9020" w:type="dxa"/>
         <w:tblLook w:val="04A0" w:firstRow="1" w:lastRow="0" w:firstColumn="1" w:lastColumn="0" w:noHBand="0" w:noVBand="1"/>
       </w:tblPr>
@@ -20681,7 +20748,7 @@
     </w:tbl>
     <w:p>
       <w:pPr>
-        <w:pStyle w:val="Caption"/>
+        <w:pStyle w:val="Descripcin"/>
       </w:pPr>
       <w:bookmarkStart w:id="75" w:name="_Toc242251953"/>
       <w:r>
@@ -20721,7 +20788,7 @@
     </w:p>
     <w:tbl>
       <w:tblPr>
-        <w:tblStyle w:val="GridTable4-Accent1"/>
+        <w:tblStyle w:val="Tablaconcuadrcula4-nfasis1"/>
         <w:tblW w:w="9020" w:type="dxa"/>
         <w:tblLook w:val="04A0" w:firstRow="1" w:lastRow="0" w:firstColumn="1" w:lastColumn="0" w:noHBand="0" w:noVBand="1"/>
       </w:tblPr>
@@ -21132,7 +21199,7 @@
     </w:tbl>
     <w:p>
       <w:pPr>
-        <w:pStyle w:val="Caption"/>
+        <w:pStyle w:val="Descripcin"/>
       </w:pPr>
       <w:bookmarkStart w:id="76" w:name="_Toc242251954"/>
       <w:r>
@@ -21172,7 +21239,7 @@
     </w:p>
     <w:tbl>
       <w:tblPr>
-        <w:tblStyle w:val="GridTable4-Accent1"/>
+        <w:tblStyle w:val="Tablaconcuadrcula4-nfasis1"/>
         <w:tblW w:w="9020" w:type="dxa"/>
         <w:tblLook w:val="04A0" w:firstRow="1" w:lastRow="0" w:firstColumn="1" w:lastColumn="0" w:noHBand="0" w:noVBand="1"/>
       </w:tblPr>
@@ -21575,7 +21642,7 @@
     </w:tbl>
     <w:p>
       <w:pPr>
-        <w:pStyle w:val="Caption"/>
+        <w:pStyle w:val="Descripcin"/>
       </w:pPr>
       <w:bookmarkStart w:id="77" w:name="_Toc242251955"/>
       <w:r>
@@ -21615,7 +21682,7 @@
     </w:p>
     <w:tbl>
       <w:tblPr>
-        <w:tblStyle w:val="GridTable4-Accent1"/>
+        <w:tblStyle w:val="Tablaconcuadrcula4-nfasis1"/>
         <w:tblW w:w="9020" w:type="dxa"/>
         <w:tblLook w:val="04A0" w:firstRow="1" w:lastRow="0" w:firstColumn="1" w:lastColumn="0" w:noHBand="0" w:noVBand="1"/>
       </w:tblPr>
@@ -22026,7 +22093,7 @@
     </w:tbl>
     <w:p>
       <w:pPr>
-        <w:pStyle w:val="Caption"/>
+        <w:pStyle w:val="Descripcin"/>
       </w:pPr>
       <w:bookmarkStart w:id="78" w:name="_Toc242251956"/>
       <w:r>
@@ -22066,7 +22133,7 @@
     </w:p>
     <w:tbl>
       <w:tblPr>
-        <w:tblStyle w:val="GridTable4-Accent1"/>
+        <w:tblStyle w:val="Tablaconcuadrcula4-nfasis1"/>
         <w:tblW w:w="9020" w:type="dxa"/>
         <w:tblLook w:val="04A0" w:firstRow="1" w:lastRow="0" w:firstColumn="1" w:lastColumn="0" w:noHBand="0" w:noVBand="1"/>
       </w:tblPr>
@@ -22486,7 +22553,7 @@
     </w:tbl>
     <w:p>
       <w:pPr>
-        <w:pStyle w:val="Caption"/>
+        <w:pStyle w:val="Descripcin"/>
       </w:pPr>
       <w:bookmarkStart w:id="79" w:name="_Toc242251957"/>
       <w:r>
@@ -22520,7 +22587,7 @@
     </w:p>
     <w:tbl>
       <w:tblPr>
-        <w:tblStyle w:val="GridTable4-Accent1"/>
+        <w:tblStyle w:val="Tablaconcuadrcula4-nfasis1"/>
         <w:tblW w:w="9020" w:type="dxa"/>
         <w:tblLook w:val="04A0" w:firstRow="1" w:lastRow="0" w:firstColumn="1" w:lastColumn="0" w:noHBand="0" w:noVBand="1"/>
       </w:tblPr>
@@ -22939,12 +23006,12 @@
     </w:tbl>
     <w:p>
       <w:pPr>
-        <w:pStyle w:val="Heading2"/>
+        <w:pStyle w:val="Ttulo2"/>
       </w:pPr>
     </w:p>
     <w:p>
       <w:pPr>
-        <w:pStyle w:val="Heading2"/>
+        <w:pStyle w:val="Ttulo2"/>
       </w:pPr>
       <w:bookmarkStart w:id="80" w:name="_Toc242251908"/>
       <w:r>
@@ -22963,7 +23030,7 @@
     </w:p>
     <w:p>
       <w:pPr>
-        <w:pStyle w:val="Heading3"/>
+        <w:pStyle w:val="Ttulo3"/>
       </w:pPr>
       <w:bookmarkStart w:id="81" w:name="_Toc58077507"/>
       <w:bookmarkStart w:id="82" w:name="_Toc242251909"/>
@@ -22989,7 +23056,7 @@
     </w:p>
     <w:p>
       <w:pPr>
-        <w:pStyle w:val="Caption"/>
+        <w:pStyle w:val="Descripcin"/>
       </w:pPr>
       <w:bookmarkStart w:id="83" w:name="_Toc242251958"/>
       <w:r>
@@ -23023,7 +23090,7 @@
     </w:p>
     <w:tbl>
       <w:tblPr>
-        <w:tblStyle w:val="GridTable4-Accent1"/>
+        <w:tblStyle w:val="Tablaconcuadrcula4-nfasis1"/>
         <w:tblW w:w="5000" w:type="pct"/>
         <w:tblLook w:val="04A0" w:firstRow="1" w:lastRow="0" w:firstColumn="1" w:lastColumn="0" w:noHBand="0" w:noVBand="1"/>
       </w:tblPr>
@@ -23042,7 +23109,7 @@
           </w:tcPr>
           <w:p>
             <w:pPr>
-              <w:pStyle w:val="Caption"/>
+              <w:pStyle w:val="Descripcin"/>
               <w:spacing w:before="0" w:after="0"/>
               <w:rPr>
                 <w:rFonts w:ascii="Arial" w:hAnsi="Arial"/>
@@ -23068,7 +23135,7 @@
           </w:tcPr>
           <w:p>
             <w:pPr>
-              <w:pStyle w:val="Caption"/>
+              <w:pStyle w:val="Descripcin"/>
               <w:spacing w:before="0" w:after="0"/>
               <w:cnfStyle w:val="100000000000" w:firstRow="1" w:lastRow="0" w:firstColumn="0" w:lastColumn="0" w:oddVBand="0" w:evenVBand="0" w:oddHBand="0" w:evenHBand="0" w:firstRowFirstColumn="0" w:firstRowLastColumn="0" w:lastRowFirstColumn="0" w:lastRowLastColumn="0"/>
               <w:rPr>
@@ -23101,7 +23168,7 @@
           </w:tcPr>
           <w:p>
             <w:pPr>
-              <w:pStyle w:val="Caption"/>
+              <w:pStyle w:val="Descripcin"/>
               <w:spacing w:before="0" w:after="0"/>
               <w:rPr>
                 <w:rFonts w:ascii="Arial" w:hAnsi="Arial"/>
@@ -23127,7 +23194,7 @@
           </w:tcPr>
           <w:p>
             <w:pPr>
-              <w:pStyle w:val="Caption"/>
+              <w:pStyle w:val="Descripcin"/>
               <w:spacing w:before="0" w:after="0"/>
               <w:cnfStyle w:val="000000100000" w:firstRow="0" w:lastRow="0" w:firstColumn="0" w:lastColumn="0" w:oddVBand="0" w:evenVBand="0" w:oddHBand="1" w:evenHBand="0" w:firstRowFirstColumn="0" w:firstRowLastColumn="0" w:lastRowFirstColumn="0" w:lastRowLastColumn="0"/>
               <w:rPr>
@@ -23154,7 +23221,7 @@
           </w:tcPr>
           <w:p>
             <w:pPr>
-              <w:pStyle w:val="Caption"/>
+              <w:pStyle w:val="Descripcin"/>
               <w:spacing w:before="0" w:after="0"/>
               <w:rPr>
                 <w:rFonts w:ascii="Arial" w:hAnsi="Arial"/>
@@ -23180,7 +23247,7 @@
           </w:tcPr>
           <w:p>
             <w:pPr>
-              <w:pStyle w:val="Caption"/>
+              <w:pStyle w:val="Descripcin"/>
               <w:spacing w:before="0" w:after="0"/>
               <w:cnfStyle w:val="000000000000" w:firstRow="0" w:lastRow="0" w:firstColumn="0" w:lastColumn="0" w:oddVBand="0" w:evenVBand="0" w:oddHBand="0" w:evenHBand="0" w:firstRowFirstColumn="0" w:firstRowLastColumn="0" w:lastRowFirstColumn="0" w:lastRowLastColumn="0"/>
               <w:rPr>
@@ -23218,7 +23285,7 @@
           </w:tcPr>
           <w:p>
             <w:pPr>
-              <w:pStyle w:val="Caption"/>
+              <w:pStyle w:val="Descripcin"/>
               <w:spacing w:before="0" w:after="0"/>
               <w:rPr>
                 <w:rFonts w:ascii="Arial" w:hAnsi="Arial"/>
@@ -23244,7 +23311,7 @@
           </w:tcPr>
           <w:p>
             <w:pPr>
-              <w:pStyle w:val="Caption"/>
+              <w:pStyle w:val="Descripcin"/>
               <w:spacing w:before="0" w:after="0"/>
               <w:cnfStyle w:val="000000100000" w:firstRow="0" w:lastRow="0" w:firstColumn="0" w:lastColumn="0" w:oddVBand="0" w:evenVBand="0" w:oddHBand="1" w:evenHBand="0" w:firstRowFirstColumn="0" w:firstRowLastColumn="0" w:lastRowFirstColumn="0" w:lastRowLastColumn="0"/>
               <w:rPr>
@@ -23274,7 +23341,7 @@
     </w:tbl>
     <w:p>
       <w:pPr>
-        <w:pStyle w:val="Caption"/>
+        <w:pStyle w:val="Descripcin"/>
       </w:pPr>
       <w:bookmarkStart w:id="84" w:name="_Toc242251959"/>
       <w:r>
@@ -23311,7 +23378,7 @@
     </w:p>
     <w:tbl>
       <w:tblPr>
-        <w:tblStyle w:val="GridTable4-Accent1"/>
+        <w:tblStyle w:val="Tablaconcuadrcula4-nfasis1"/>
         <w:tblW w:w="5000" w:type="pct"/>
         <w:tblLook w:val="04A0" w:firstRow="1" w:lastRow="0" w:firstColumn="1" w:lastColumn="0" w:noHBand="0" w:noVBand="1"/>
       </w:tblPr>
@@ -23330,7 +23397,7 @@
           </w:tcPr>
           <w:p>
             <w:pPr>
-              <w:pStyle w:val="Caption"/>
+              <w:pStyle w:val="Descripcin"/>
               <w:spacing w:before="0" w:after="0"/>
               <w:rPr>
                 <w:rFonts w:ascii="Arial" w:hAnsi="Arial"/>
@@ -23364,7 +23431,7 @@
           </w:tcPr>
           <w:p>
             <w:pPr>
-              <w:pStyle w:val="Caption"/>
+              <w:pStyle w:val="Descripcin"/>
               <w:spacing w:before="0" w:after="0"/>
               <w:cnfStyle w:val="100000000000" w:firstRow="1" w:lastRow="0" w:firstColumn="0" w:lastColumn="0" w:oddVBand="0" w:evenVBand="0" w:oddHBand="0" w:evenHBand="0" w:firstRowFirstColumn="0" w:firstRowLastColumn="0" w:lastRowFirstColumn="0" w:lastRowLastColumn="0"/>
               <w:rPr>
@@ -23397,7 +23464,7 @@
           </w:tcPr>
           <w:p>
             <w:pPr>
-              <w:pStyle w:val="Caption"/>
+              <w:pStyle w:val="Descripcin"/>
               <w:spacing w:before="0" w:after="0"/>
               <w:rPr>
                 <w:rFonts w:ascii="Arial" w:hAnsi="Arial"/>
@@ -23423,7 +23490,7 @@
           </w:tcPr>
           <w:p>
             <w:pPr>
-              <w:pStyle w:val="Caption"/>
+              <w:pStyle w:val="Descripcin"/>
               <w:spacing w:before="0" w:after="0"/>
               <w:cnfStyle w:val="000000100000" w:firstRow="0" w:lastRow="0" w:firstColumn="0" w:lastColumn="0" w:oddVBand="0" w:evenVBand="0" w:oddHBand="1" w:evenHBand="0" w:firstRowFirstColumn="0" w:firstRowLastColumn="0" w:lastRowFirstColumn="0" w:lastRowLastColumn="0"/>
               <w:rPr>
@@ -23437,7 +23504,7 @@
                 <w:iCs w:val="0"/>
                 <w:color w:val="365F91" w:themeColor="accent1" w:themeShade="BF"/>
               </w:rPr>
-              <w:t xml:space="preserve">El backend del sistema debe ser desarrollado utilizando el lenguaje Java e implementando obligatoriamente la especificación </w:t>
+              <w:t xml:space="preserve">El backend del sistema debe ser desarrollado utilizando el lenguaje </w:t>
             </w:r>
             <w:r>
               <w:rPr>
@@ -23446,7 +23513,7 @@
                 <w:iCs w:val="0"/>
                 <w:color w:val="365F91" w:themeColor="accent1" w:themeShade="BF"/>
               </w:rPr>
-              <w:t>Dotnet</w:t>
+              <w:t>C# (DOTNET)</w:t>
             </w:r>
             <w:r>
               <w:rPr>
@@ -23455,28 +23522,17 @@
                 <w:iCs w:val="0"/>
                 <w:color w:val="365F91" w:themeColor="accent1" w:themeShade="BF"/>
               </w:rPr>
-              <w:t xml:space="preserve"> para la construcción de los servicios web.</w:t>
-            </w:r>
-          </w:p>
-        </w:tc>
-      </w:tr>
-      <w:tr>
-        <w:tc>
-          <w:tcPr>
-            <w:cnfStyle w:val="001000000000" w:firstRow="0" w:lastRow="0" w:firstColumn="1" w:lastColumn="0" w:oddVBand="0" w:evenVBand="0" w:oddHBand="0" w:evenHBand="0" w:firstRowFirstColumn="0" w:firstRowLastColumn="0" w:lastRowFirstColumn="0" w:lastRowLastColumn="0"/>
-            <w:tcW w:w="1109" w:type="pct"/>
-          </w:tcPr>
-          <w:p>
-            <w:pPr>
-              <w:pStyle w:val="Caption"/>
-              <w:spacing w:before="0" w:after="0"/>
+              <w:t xml:space="preserve"> e implementando obligatoriamente la especificación </w:t>
+            </w:r>
+            <w:r>
               <w:rPr>
                 <w:rFonts w:ascii="Arial" w:hAnsi="Arial"/>
                 <w:i w:val="0"/>
                 <w:iCs w:val="0"/>
                 <w:color w:val="365F91" w:themeColor="accent1" w:themeShade="BF"/>
               </w:rPr>
-            </w:pPr>
+              <w:t>Dotnet</w:t>
+            </w:r>
             <w:r>
               <w:rPr>
                 <w:rFonts w:ascii="Arial" w:hAnsi="Arial"/>
@@ -23484,6 +23540,35 @@
                 <w:iCs w:val="0"/>
                 <w:color w:val="365F91" w:themeColor="accent1" w:themeShade="BF"/>
               </w:rPr>
+              <w:t xml:space="preserve"> para la construcción de los servicios web.</w:t>
+            </w:r>
+          </w:p>
+        </w:tc>
+      </w:tr>
+      <w:tr>
+        <w:tc>
+          <w:tcPr>
+            <w:cnfStyle w:val="001000000000" w:firstRow="0" w:lastRow="0" w:firstColumn="1" w:lastColumn="0" w:oddVBand="0" w:evenVBand="0" w:oddHBand="0" w:evenHBand="0" w:firstRowFirstColumn="0" w:firstRowLastColumn="0" w:lastRowFirstColumn="0" w:lastRowLastColumn="0"/>
+            <w:tcW w:w="1109" w:type="pct"/>
+          </w:tcPr>
+          <w:p>
+            <w:pPr>
+              <w:pStyle w:val="Descripcin"/>
+              <w:spacing w:before="0" w:after="0"/>
+              <w:rPr>
+                <w:rFonts w:ascii="Arial" w:hAnsi="Arial"/>
+                <w:i w:val="0"/>
+                <w:iCs w:val="0"/>
+                <w:color w:val="365F91" w:themeColor="accent1" w:themeShade="BF"/>
+              </w:rPr>
+            </w:pPr>
+            <w:r>
+              <w:rPr>
+                <w:rFonts w:ascii="Arial" w:hAnsi="Arial"/>
+                <w:i w:val="0"/>
+                <w:iCs w:val="0"/>
+                <w:color w:val="365F91" w:themeColor="accent1" w:themeShade="BF"/>
+              </w:rPr>
               <w:t>Importancia</w:t>
             </w:r>
           </w:p>
@@ -23494,7 +23579,7 @@
           </w:tcPr>
           <w:p>
             <w:pPr>
-              <w:pStyle w:val="Caption"/>
+              <w:pStyle w:val="Descripcin"/>
               <w:spacing w:before="0" w:after="0"/>
               <w:cnfStyle w:val="000000000000" w:firstRow="0" w:lastRow="0" w:firstColumn="0" w:lastColumn="0" w:oddVBand="0" w:evenVBand="0" w:oddHBand="0" w:evenHBand="0" w:firstRowFirstColumn="0" w:firstRowLastColumn="0" w:lastRowFirstColumn="0" w:lastRowLastColumn="0"/>
               <w:rPr>
@@ -23532,7 +23617,7 @@
           </w:tcPr>
           <w:p>
             <w:pPr>
-              <w:pStyle w:val="Caption"/>
+              <w:pStyle w:val="Descripcin"/>
               <w:spacing w:before="0" w:after="0"/>
               <w:rPr>
                 <w:rFonts w:ascii="Arial" w:hAnsi="Arial"/>
@@ -23558,7 +23643,7 @@
           </w:tcPr>
           <w:p>
             <w:pPr>
-              <w:pStyle w:val="Caption"/>
+              <w:pStyle w:val="Descripcin"/>
               <w:spacing w:before="0" w:after="0"/>
               <w:cnfStyle w:val="000000100000" w:firstRow="0" w:lastRow="0" w:firstColumn="0" w:lastColumn="0" w:oddVBand="0" w:evenVBand="0" w:oddHBand="1" w:evenHBand="0" w:firstRowFirstColumn="0" w:firstRowLastColumn="0" w:lastRowFirstColumn="0" w:lastRowLastColumn="0"/>
               <w:rPr>
@@ -23588,7 +23673,7 @@
     </w:tbl>
     <w:p>
       <w:pPr>
-        <w:pStyle w:val="Caption"/>
+        <w:pStyle w:val="Descripcin"/>
       </w:pPr>
       <w:bookmarkStart w:id="85" w:name="_Toc242251960"/>
       <w:r>
@@ -23625,7 +23710,7 @@
     </w:p>
     <w:tbl>
       <w:tblPr>
-        <w:tblStyle w:val="GridTable4-Accent1"/>
+        <w:tblStyle w:val="Tablaconcuadrcula4-nfasis1"/>
         <w:tblW w:w="5000" w:type="pct"/>
         <w:tblLook w:val="04A0" w:firstRow="1" w:lastRow="0" w:firstColumn="1" w:lastColumn="0" w:noHBand="0" w:noVBand="1"/>
       </w:tblPr>
@@ -23644,7 +23729,7 @@
           </w:tcPr>
           <w:p>
             <w:pPr>
-              <w:pStyle w:val="Caption"/>
+              <w:pStyle w:val="Descripcin"/>
               <w:spacing w:before="0" w:after="0"/>
               <w:rPr>
                 <w:rFonts w:ascii="Arial" w:hAnsi="Arial"/>
@@ -23678,7 +23763,7 @@
           </w:tcPr>
           <w:p>
             <w:pPr>
-              <w:pStyle w:val="Caption"/>
+              <w:pStyle w:val="Descripcin"/>
               <w:spacing w:before="0" w:after="0"/>
               <w:cnfStyle w:val="100000000000" w:firstRow="1" w:lastRow="0" w:firstColumn="0" w:lastColumn="0" w:oddVBand="0" w:evenVBand="0" w:oddHBand="0" w:evenHBand="0" w:firstRowFirstColumn="0" w:firstRowLastColumn="0" w:lastRowFirstColumn="0" w:lastRowLastColumn="0"/>
               <w:rPr>
@@ -23712,7 +23797,7 @@
           </w:tcPr>
           <w:p>
             <w:pPr>
-              <w:pStyle w:val="Caption"/>
+              <w:pStyle w:val="Descripcin"/>
               <w:spacing w:before="0" w:after="0"/>
               <w:rPr>
                 <w:rFonts w:ascii="Arial" w:hAnsi="Arial"/>
@@ -23738,7 +23823,7 @@
           </w:tcPr>
           <w:p>
             <w:pPr>
-              <w:pStyle w:val="Caption"/>
+              <w:pStyle w:val="Descripcin"/>
               <w:spacing w:before="0" w:after="0"/>
               <w:cnfStyle w:val="000000100000" w:firstRow="0" w:lastRow="0" w:firstColumn="0" w:lastColumn="0" w:oddVBand="0" w:evenVBand="0" w:oddHBand="1" w:evenHBand="0" w:firstRowFirstColumn="0" w:firstRowLastColumn="0" w:lastRowFirstColumn="0" w:lastRowLastColumn="0"/>
               <w:rPr>
@@ -23785,7 +23870,7 @@
           </w:tcPr>
           <w:p>
             <w:pPr>
-              <w:pStyle w:val="Caption"/>
+              <w:pStyle w:val="Descripcin"/>
               <w:spacing w:before="0" w:after="0"/>
               <w:rPr>
                 <w:rFonts w:ascii="Arial" w:hAnsi="Arial"/>
@@ -23811,7 +23896,7 @@
           </w:tcPr>
           <w:p>
             <w:pPr>
-              <w:pStyle w:val="Caption"/>
+              <w:pStyle w:val="Descripcin"/>
               <w:spacing w:before="0" w:after="0"/>
               <w:cnfStyle w:val="000000000000" w:firstRow="0" w:lastRow="0" w:firstColumn="0" w:lastColumn="0" w:oddVBand="0" w:evenVBand="0" w:oddHBand="0" w:evenHBand="0" w:firstRowFirstColumn="0" w:firstRowLastColumn="0" w:lastRowFirstColumn="0" w:lastRowLastColumn="0"/>
               <w:rPr>
@@ -23849,7 +23934,7 @@
           </w:tcPr>
           <w:p>
             <w:pPr>
-              <w:pStyle w:val="Caption"/>
+              <w:pStyle w:val="Descripcin"/>
               <w:spacing w:before="0" w:after="0"/>
               <w:rPr>
                 <w:rFonts w:ascii="Arial" w:hAnsi="Arial"/>
@@ -23875,7 +23960,7 @@
           </w:tcPr>
           <w:p>
             <w:pPr>
-              <w:pStyle w:val="Caption"/>
+              <w:pStyle w:val="Descripcin"/>
               <w:spacing w:before="0" w:after="0"/>
               <w:cnfStyle w:val="000000100000" w:firstRow="0" w:lastRow="0" w:firstColumn="0" w:lastColumn="0" w:oddVBand="0" w:evenVBand="0" w:oddHBand="1" w:evenHBand="0" w:firstRowFirstColumn="0" w:firstRowLastColumn="0" w:lastRowFirstColumn="0" w:lastRowLastColumn="0"/>
               <w:rPr>
@@ -23905,7 +23990,7 @@
     </w:tbl>
     <w:p>
       <w:pPr>
-        <w:pStyle w:val="Caption"/>
+        <w:pStyle w:val="Descripcin"/>
       </w:pPr>
       <w:bookmarkStart w:id="86" w:name="_Toc242251961"/>
       <w:r>
@@ -23942,7 +24027,7 @@
     </w:p>
     <w:tbl>
       <w:tblPr>
-        <w:tblStyle w:val="GridTable4-Accent1"/>
+        <w:tblStyle w:val="Tablaconcuadrcula4-nfasis1"/>
         <w:tblW w:w="5000" w:type="pct"/>
         <w:tblLook w:val="04A0" w:firstRow="1" w:lastRow="0" w:firstColumn="1" w:lastColumn="0" w:noHBand="0" w:noVBand="1"/>
       </w:tblPr>
@@ -23961,7 +24046,7 @@
           </w:tcPr>
           <w:p>
             <w:pPr>
-              <w:pStyle w:val="Caption"/>
+              <w:pStyle w:val="Descripcin"/>
               <w:spacing w:before="0" w:after="0"/>
               <w:rPr>
                 <w:rFonts w:ascii="Arial" w:hAnsi="Arial"/>
@@ -23995,7 +24080,7 @@
           </w:tcPr>
           <w:p>
             <w:pPr>
-              <w:pStyle w:val="Caption"/>
+              <w:pStyle w:val="Descripcin"/>
               <w:spacing w:before="0" w:after="0"/>
               <w:cnfStyle w:val="100000000000" w:firstRow="1" w:lastRow="0" w:firstColumn="0" w:lastColumn="0" w:oddVBand="0" w:evenVBand="0" w:oddHBand="0" w:evenHBand="0" w:firstRowFirstColumn="0" w:firstRowLastColumn="0" w:lastRowFirstColumn="0" w:lastRowLastColumn="0"/>
               <w:rPr>
@@ -24028,7 +24113,7 @@
           </w:tcPr>
           <w:p>
             <w:pPr>
-              <w:pStyle w:val="Caption"/>
+              <w:pStyle w:val="Descripcin"/>
               <w:spacing w:before="0" w:after="0"/>
               <w:rPr>
                 <w:rFonts w:ascii="Arial" w:hAnsi="Arial"/>
@@ -24054,7 +24139,7 @@
           </w:tcPr>
           <w:p>
             <w:pPr>
-              <w:pStyle w:val="Caption"/>
+              <w:pStyle w:val="Descripcin"/>
               <w:spacing w:before="0" w:after="0"/>
               <w:cnfStyle w:val="000000100000" w:firstRow="0" w:lastRow="0" w:firstColumn="0" w:lastColumn="0" w:oddVBand="0" w:evenVBand="0" w:oddHBand="1" w:evenHBand="0" w:firstRowFirstColumn="0" w:firstRowLastColumn="0" w:lastRowFirstColumn="0" w:lastRowLastColumn="0"/>
             </w:pPr>
@@ -24087,7 +24172,7 @@
           </w:tcPr>
           <w:p>
             <w:pPr>
-              <w:pStyle w:val="Caption"/>
+              <w:pStyle w:val="Descripcin"/>
               <w:spacing w:before="0" w:after="0"/>
               <w:rPr>
                 <w:rFonts w:ascii="Arial" w:hAnsi="Arial"/>
@@ -24113,7 +24198,7 @@
           </w:tcPr>
           <w:p>
             <w:pPr>
-              <w:pStyle w:val="Caption"/>
+              <w:pStyle w:val="Descripcin"/>
               <w:spacing w:before="0" w:after="0"/>
               <w:cnfStyle w:val="000000000000" w:firstRow="0" w:lastRow="0" w:firstColumn="0" w:lastColumn="0" w:oddVBand="0" w:evenVBand="0" w:oddHBand="0" w:evenHBand="0" w:firstRowFirstColumn="0" w:firstRowLastColumn="0" w:lastRowFirstColumn="0" w:lastRowLastColumn="0"/>
               <w:rPr>
@@ -24151,7 +24236,7 @@
           </w:tcPr>
           <w:p>
             <w:pPr>
-              <w:pStyle w:val="Caption"/>
+              <w:pStyle w:val="Descripcin"/>
               <w:spacing w:before="0" w:after="0"/>
               <w:rPr>
                 <w:rFonts w:ascii="Arial" w:hAnsi="Arial"/>
@@ -24178,7 +24263,7 @@
           </w:tcPr>
           <w:p>
             <w:pPr>
-              <w:pStyle w:val="Caption"/>
+              <w:pStyle w:val="Descripcin"/>
               <w:spacing w:before="0" w:after="0"/>
               <w:cnfStyle w:val="000000100000" w:firstRow="0" w:lastRow="0" w:firstColumn="0" w:lastColumn="0" w:oddVBand="0" w:evenVBand="0" w:oddHBand="1" w:evenHBand="0" w:firstRowFirstColumn="0" w:firstRowLastColumn="0" w:lastRowFirstColumn="0" w:lastRowLastColumn="0"/>
               <w:rPr>
@@ -24208,7 +24293,7 @@
     </w:tbl>
     <w:p>
       <w:pPr>
-        <w:pStyle w:val="Caption"/>
+        <w:pStyle w:val="Descripcin"/>
       </w:pPr>
       <w:bookmarkStart w:id="87" w:name="_Toc242251962"/>
       <w:r>
@@ -24245,7 +24330,7 @@
     </w:p>
     <w:tbl>
       <w:tblPr>
-        <w:tblStyle w:val="GridTable4-Accent1"/>
+        <w:tblStyle w:val="Tablaconcuadrcula4-nfasis1"/>
         <w:tblW w:w="5000" w:type="pct"/>
         <w:tblLook w:val="04A0" w:firstRow="1" w:lastRow="0" w:firstColumn="1" w:lastColumn="0" w:noHBand="0" w:noVBand="1"/>
       </w:tblPr>
@@ -24264,7 +24349,7 @@
           </w:tcPr>
           <w:p>
             <w:pPr>
-              <w:pStyle w:val="Caption"/>
+              <w:pStyle w:val="Descripcin"/>
               <w:spacing w:before="0" w:after="0"/>
               <w:rPr>
                 <w:rFonts w:ascii="Arial" w:hAnsi="Arial"/>
@@ -24298,7 +24383,7 @@
           </w:tcPr>
           <w:p>
             <w:pPr>
-              <w:pStyle w:val="Caption"/>
+              <w:pStyle w:val="Descripcin"/>
               <w:spacing w:before="0" w:after="0"/>
               <w:cnfStyle w:val="100000000000" w:firstRow="1" w:lastRow="0" w:firstColumn="0" w:lastColumn="0" w:oddVBand="0" w:evenVBand="0" w:oddHBand="0" w:evenHBand="0" w:firstRowFirstColumn="0" w:firstRowLastColumn="0" w:lastRowFirstColumn="0" w:lastRowLastColumn="0"/>
               <w:rPr>
@@ -24330,7 +24415,7 @@
           </w:tcPr>
           <w:p>
             <w:pPr>
-              <w:pStyle w:val="Caption"/>
+              <w:pStyle w:val="Descripcin"/>
               <w:spacing w:before="0" w:after="0"/>
               <w:rPr>
                 <w:rFonts w:ascii="Arial" w:hAnsi="Arial"/>
@@ -24356,7 +24441,7 @@
           </w:tcPr>
           <w:p>
             <w:pPr>
-              <w:pStyle w:val="Caption"/>
+              <w:pStyle w:val="Descripcin"/>
               <w:spacing w:before="0" w:after="0"/>
               <w:cnfStyle w:val="000000100000" w:firstRow="0" w:lastRow="0" w:firstColumn="0" w:lastColumn="0" w:oddVBand="0" w:evenVBand="0" w:oddHBand="1" w:evenHBand="0" w:firstRowFirstColumn="0" w:firstRowLastColumn="0" w:lastRowFirstColumn="0" w:lastRowLastColumn="0"/>
             </w:pPr>
@@ -24380,7 +24465,7 @@
           </w:tcPr>
           <w:p>
             <w:pPr>
-              <w:pStyle w:val="Caption"/>
+              <w:pStyle w:val="Descripcin"/>
               <w:spacing w:before="0" w:after="0"/>
               <w:rPr>
                 <w:rFonts w:ascii="Arial" w:hAnsi="Arial"/>
@@ -24406,7 +24491,7 @@
           </w:tcPr>
           <w:p>
             <w:pPr>
-              <w:pStyle w:val="Caption"/>
+              <w:pStyle w:val="Descripcin"/>
               <w:spacing w:before="0" w:after="0"/>
               <w:cnfStyle w:val="000000000000" w:firstRow="0" w:lastRow="0" w:firstColumn="0" w:lastColumn="0" w:oddVBand="0" w:evenVBand="0" w:oddHBand="0" w:evenHBand="0" w:firstRowFirstColumn="0" w:firstRowLastColumn="0" w:lastRowFirstColumn="0" w:lastRowLastColumn="0"/>
               <w:rPr>
@@ -24443,7 +24528,7 @@
           </w:tcPr>
           <w:p>
             <w:pPr>
-              <w:pStyle w:val="Caption"/>
+              <w:pStyle w:val="Descripcin"/>
               <w:spacing w:before="0" w:after="0"/>
               <w:rPr>
                 <w:rFonts w:ascii="Arial" w:hAnsi="Arial"/>
@@ -24469,7 +24554,7 @@
           </w:tcPr>
           <w:p>
             <w:pPr>
-              <w:pStyle w:val="Caption"/>
+              <w:pStyle w:val="Descripcin"/>
               <w:spacing w:before="0" w:after="0"/>
               <w:cnfStyle w:val="000000100000" w:firstRow="0" w:lastRow="0" w:firstColumn="0" w:lastColumn="0" w:oddVBand="0" w:evenVBand="0" w:oddHBand="1" w:evenHBand="0" w:firstRowFirstColumn="0" w:firstRowLastColumn="0" w:lastRowFirstColumn="0" w:lastRowLastColumn="0"/>
               <w:rPr>
@@ -24498,7 +24583,7 @@
     </w:tbl>
     <w:p>
       <w:pPr>
-        <w:pStyle w:val="Caption"/>
+        <w:pStyle w:val="Descripcin"/>
       </w:pPr>
       <w:bookmarkStart w:id="88" w:name="_Toc242251963"/>
       <w:r>
@@ -24535,7 +24620,7 @@
     </w:p>
     <w:tbl>
       <w:tblPr>
-        <w:tblStyle w:val="GridTable4-Accent1"/>
+        <w:tblStyle w:val="Tablaconcuadrcula4-nfasis1"/>
         <w:tblpPr w:leftFromText="141" w:rightFromText="141" w:vertAnchor="text" w:horzAnchor="margin" w:tblpXSpec="center" w:tblpY="128"/>
         <w:tblW w:w="5000" w:type="pct"/>
         <w:tblLook w:val="04A0" w:firstRow="1" w:lastRow="0" w:firstColumn="1" w:lastColumn="0" w:noHBand="0" w:noVBand="1"/>
@@ -24606,7 +24691,7 @@
           </w:tcPr>
           <w:p>
             <w:pPr>
-              <w:pStyle w:val="Caption"/>
+              <w:pStyle w:val="Descripcin"/>
               <w:spacing w:before="0" w:after="0"/>
               <w:rPr>
                 <w:rFonts w:ascii="Arial" w:hAnsi="Arial"/>
@@ -24632,7 +24717,7 @@
           </w:tcPr>
           <w:p>
             <w:pPr>
-              <w:pStyle w:val="Caption"/>
+              <w:pStyle w:val="Descripcin"/>
               <w:spacing w:before="0" w:after="0"/>
               <w:cnfStyle w:val="000000100000" w:firstRow="0" w:lastRow="0" w:firstColumn="0" w:lastColumn="0" w:oddVBand="0" w:evenVBand="0" w:oddHBand="1" w:evenHBand="0" w:firstRowFirstColumn="0" w:firstRowLastColumn="0" w:lastRowFirstColumn="0" w:lastRowLastColumn="0"/>
               <w:rPr>
@@ -24661,7 +24746,7 @@
           </w:tcPr>
           <w:p>
             <w:pPr>
-              <w:pStyle w:val="Caption"/>
+              <w:pStyle w:val="Descripcin"/>
               <w:spacing w:before="0" w:after="0"/>
               <w:rPr>
                 <w:rFonts w:ascii="Arial" w:hAnsi="Arial"/>
@@ -24687,7 +24772,7 @@
           </w:tcPr>
           <w:p>
             <w:pPr>
-              <w:pStyle w:val="Caption"/>
+              <w:pStyle w:val="Descripcin"/>
               <w:spacing w:before="0" w:after="0"/>
               <w:cnfStyle w:val="000000000000" w:firstRow="0" w:lastRow="0" w:firstColumn="0" w:lastColumn="0" w:oddVBand="0" w:evenVBand="0" w:oddHBand="0" w:evenHBand="0" w:firstRowFirstColumn="0" w:firstRowLastColumn="0" w:lastRowFirstColumn="0" w:lastRowLastColumn="0"/>
               <w:rPr>
@@ -24724,7 +24809,7 @@
           </w:tcPr>
           <w:p>
             <w:pPr>
-              <w:pStyle w:val="Caption"/>
+              <w:pStyle w:val="Descripcin"/>
               <w:spacing w:before="0" w:after="0"/>
               <w:rPr>
                 <w:rFonts w:ascii="Arial" w:hAnsi="Arial"/>
@@ -24750,7 +24835,7 @@
           </w:tcPr>
           <w:p>
             <w:pPr>
-              <w:pStyle w:val="Caption"/>
+              <w:pStyle w:val="Descripcin"/>
               <w:spacing w:before="0" w:after="0"/>
               <w:cnfStyle w:val="000000100000" w:firstRow="0" w:lastRow="0" w:firstColumn="0" w:lastColumn="0" w:oddVBand="0" w:evenVBand="0" w:oddHBand="1" w:evenHBand="0" w:firstRowFirstColumn="0" w:firstRowLastColumn="0" w:lastRowFirstColumn="0" w:lastRowLastColumn="0"/>
               <w:rPr>
@@ -24779,7 +24864,7 @@
     </w:tbl>
     <w:p>
       <w:pPr>
-        <w:pStyle w:val="Caption"/>
+        <w:pStyle w:val="Descripcin"/>
       </w:pPr>
       <w:bookmarkStart w:id="89" w:name="_Toc242251964"/>
       <w:r>
@@ -24816,7 +24901,7 @@
     </w:p>
     <w:tbl>
       <w:tblPr>
-        <w:tblStyle w:val="GridTable4-Accent1"/>
+        <w:tblStyle w:val="Tablaconcuadrcula4-nfasis1"/>
         <w:tblpPr w:leftFromText="141" w:rightFromText="141" w:vertAnchor="text" w:horzAnchor="margin" w:tblpXSpec="center" w:tblpY="128"/>
         <w:tblW w:w="5000" w:type="pct"/>
         <w:tblLook w:val="04A0" w:firstRow="1" w:lastRow="0" w:firstColumn="1" w:lastColumn="0" w:noHBand="0" w:noVBand="1"/>
@@ -24881,7 +24966,7 @@
           </w:tcPr>
           <w:p>
             <w:pPr>
-              <w:pStyle w:val="Caption"/>
+              <w:pStyle w:val="Descripcin"/>
               <w:spacing w:before="0" w:after="0"/>
               <w:rPr>
                 <w:rFonts w:ascii="Arial" w:hAnsi="Arial"/>
@@ -24907,7 +24992,7 @@
           </w:tcPr>
           <w:p>
             <w:pPr>
-              <w:pStyle w:val="Caption"/>
+              <w:pStyle w:val="Descripcin"/>
               <w:spacing w:before="0" w:after="0"/>
               <w:cnfStyle w:val="000000100000" w:firstRow="0" w:lastRow="0" w:firstColumn="0" w:lastColumn="0" w:oddVBand="0" w:evenVBand="0" w:oddHBand="1" w:evenHBand="0" w:firstRowFirstColumn="0" w:firstRowLastColumn="0" w:lastRowFirstColumn="0" w:lastRowLastColumn="0"/>
               <w:rPr>
@@ -24935,7 +25020,7 @@
           </w:tcPr>
           <w:p>
             <w:pPr>
-              <w:pStyle w:val="Caption"/>
+              <w:pStyle w:val="Descripcin"/>
               <w:spacing w:before="0" w:after="0"/>
               <w:rPr>
                 <w:rFonts w:ascii="Arial" w:hAnsi="Arial"/>
@@ -24961,7 +25046,7 @@
           </w:tcPr>
           <w:p>
             <w:pPr>
-              <w:pStyle w:val="Caption"/>
+              <w:pStyle w:val="Descripcin"/>
               <w:spacing w:before="0" w:after="0"/>
               <w:cnfStyle w:val="000000000000" w:firstRow="0" w:lastRow="0" w:firstColumn="0" w:lastColumn="0" w:oddVBand="0" w:evenVBand="0" w:oddHBand="0" w:evenHBand="0" w:firstRowFirstColumn="0" w:firstRowLastColumn="0" w:lastRowFirstColumn="0" w:lastRowLastColumn="0"/>
               <w:rPr>
@@ -24998,7 +25083,7 @@
           </w:tcPr>
           <w:p>
             <w:pPr>
-              <w:pStyle w:val="Caption"/>
+              <w:pStyle w:val="Descripcin"/>
               <w:spacing w:before="0" w:after="0"/>
               <w:rPr>
                 <w:rFonts w:ascii="Arial" w:hAnsi="Arial"/>
@@ -25024,7 +25109,7 @@
           </w:tcPr>
           <w:p>
             <w:pPr>
-              <w:pStyle w:val="Caption"/>
+              <w:pStyle w:val="Descripcin"/>
               <w:spacing w:before="0" w:after="0"/>
               <w:cnfStyle w:val="000000100000" w:firstRow="0" w:lastRow="0" w:firstColumn="0" w:lastColumn="0" w:oddVBand="0" w:evenVBand="0" w:oddHBand="1" w:evenHBand="0" w:firstRowFirstColumn="0" w:firstRowLastColumn="0" w:lastRowFirstColumn="0" w:lastRowLastColumn="0"/>
               <w:rPr>
@@ -25053,13 +25138,13 @@
     </w:tbl>
     <w:p>
       <w:pPr>
-        <w:pStyle w:val="Caption"/>
+        <w:pStyle w:val="Descripcin"/>
         <w:spacing w:before="0" w:after="0"/>
       </w:pPr>
     </w:p>
     <w:p>
       <w:pPr>
-        <w:pStyle w:val="ListParagraph"/>
+        <w:pStyle w:val="Prrafodelista"/>
         <w:ind w:left="720"/>
         <w:rPr>
           <w:b/>
@@ -25162,7 +25247,7 @@
     </w:p>
     <w:p>
       <w:pPr>
-        <w:pStyle w:val="Heading2"/>
+        <w:pStyle w:val="Ttulo2"/>
       </w:pPr>
       <w:bookmarkStart w:id="90" w:name="_Toc242251910"/>
       <w:r>
@@ -25175,7 +25260,7 @@
     </w:p>
     <w:p>
       <w:pPr>
-        <w:pStyle w:val="Heading3"/>
+        <w:pStyle w:val="Ttulo3"/>
       </w:pPr>
       <w:bookmarkStart w:id="91" w:name="_Toc242251911"/>
       <w:r>
@@ -25223,7 +25308,7 @@
     </w:p>
     <w:p>
       <w:pPr>
-        <w:pStyle w:val="Heading3"/>
+        <w:pStyle w:val="Ttulo3"/>
       </w:pPr>
       <w:bookmarkStart w:id="93" w:name="_2xcytpi" w:colFirst="0" w:colLast="0"/>
       <w:bookmarkStart w:id="94" w:name="_Toc58077511"/>
@@ -25283,7 +25368,7 @@
     </w:p>
     <w:p>
       <w:pPr>
-        <w:pStyle w:val="Heading3"/>
+        <w:pStyle w:val="Ttulo3"/>
       </w:pPr>
       <w:bookmarkStart w:id="96" w:name="_Toc58077512"/>
       <w:bookmarkStart w:id="97" w:name="_Toc242251913"/>
@@ -25301,7 +25386,7 @@
     </w:p>
     <w:p>
       <w:pPr>
-        <w:pStyle w:val="ListParagraph"/>
+        <w:pStyle w:val="Prrafodelista"/>
         <w:numPr>
           <w:ilvl w:val="0"/>
           <w:numId w:val="43"/>
@@ -25329,7 +25414,7 @@
     </w:p>
     <w:p>
       <w:pPr>
-        <w:pStyle w:val="ListParagraph"/>
+        <w:pStyle w:val="Prrafodelista"/>
         <w:numPr>
           <w:ilvl w:val="0"/>
           <w:numId w:val="43"/>
@@ -25357,7 +25442,7 @@
     </w:p>
     <w:p>
       <w:pPr>
-        <w:pStyle w:val="ListParagraph"/>
+        <w:pStyle w:val="Prrafodelista"/>
         <w:numPr>
           <w:ilvl w:val="0"/>
           <w:numId w:val="43"/>
@@ -25386,7 +25471,7 @@
     </w:p>
     <w:p>
       <w:pPr>
-        <w:pStyle w:val="ListParagraph"/>
+        <w:pStyle w:val="Prrafodelista"/>
         <w:numPr>
           <w:ilvl w:val="0"/>
           <w:numId w:val="43"/>
@@ -25411,7 +25496,7 @@
     </w:p>
     <w:p>
       <w:pPr>
-        <w:pStyle w:val="Heading1"/>
+        <w:pStyle w:val="Ttulo1"/>
       </w:pPr>
       <w:bookmarkStart w:id="98" w:name="_Toc23846806"/>
       <w:bookmarkStart w:id="99" w:name="_Toc58077513"/>
@@ -25428,7 +25513,7 @@
     </w:p>
     <w:p>
       <w:pPr>
-        <w:pStyle w:val="Heading2"/>
+        <w:pStyle w:val="Ttulo2"/>
       </w:pPr>
       <w:bookmarkStart w:id="101" w:name="_Toc23846807"/>
       <w:bookmarkStart w:id="102" w:name="_Toc58077514"/>
@@ -25442,7 +25527,7 @@
     </w:p>
     <w:p>
       <w:pPr>
-        <w:pStyle w:val="Heading3"/>
+        <w:pStyle w:val="Ttulo3"/>
       </w:pPr>
       <w:bookmarkStart w:id="104" w:name="_Toc58077515"/>
       <w:bookmarkStart w:id="105" w:name="_Toc242251916"/>
@@ -25475,7 +25560,7 @@
     </w:p>
     <w:p>
       <w:pPr>
-        <w:pStyle w:val="ListParagraph"/>
+        <w:pStyle w:val="Prrafodelista"/>
         <w:numPr>
           <w:ilvl w:val="0"/>
           <w:numId w:val="39"/>
@@ -25496,7 +25581,7 @@
     </w:p>
     <w:p>
       <w:pPr>
-        <w:pStyle w:val="ListParagraph"/>
+        <w:pStyle w:val="Prrafodelista"/>
         <w:numPr>
           <w:ilvl w:val="1"/>
           <w:numId w:val="39"/>
@@ -25515,7 +25600,7 @@
     </w:p>
     <w:p>
       <w:pPr>
-        <w:pStyle w:val="ListParagraph"/>
+        <w:pStyle w:val="Prrafodelista"/>
         <w:numPr>
           <w:ilvl w:val="1"/>
           <w:numId w:val="39"/>
@@ -25534,7 +25619,7 @@
     </w:p>
     <w:p>
       <w:pPr>
-        <w:pStyle w:val="ListParagraph"/>
+        <w:pStyle w:val="Prrafodelista"/>
         <w:numPr>
           <w:ilvl w:val="1"/>
           <w:numId w:val="39"/>
@@ -25553,7 +25638,7 @@
     </w:p>
     <w:p>
       <w:pPr>
-        <w:pStyle w:val="ListParagraph"/>
+        <w:pStyle w:val="Prrafodelista"/>
         <w:numPr>
           <w:ilvl w:val="1"/>
           <w:numId w:val="39"/>
@@ -25572,7 +25657,7 @@
     </w:p>
     <w:p>
       <w:pPr>
-        <w:pStyle w:val="ListParagraph"/>
+        <w:pStyle w:val="Prrafodelista"/>
         <w:numPr>
           <w:ilvl w:val="0"/>
           <w:numId w:val="39"/>
@@ -25593,7 +25678,7 @@
     </w:p>
     <w:p>
       <w:pPr>
-        <w:pStyle w:val="ListParagraph"/>
+        <w:pStyle w:val="Prrafodelista"/>
         <w:numPr>
           <w:ilvl w:val="1"/>
           <w:numId w:val="39"/>
@@ -25624,7 +25709,7 @@
     </w:p>
     <w:p>
       <w:pPr>
-        <w:pStyle w:val="Heading3"/>
+        <w:pStyle w:val="Ttulo3"/>
       </w:pPr>
       <w:bookmarkStart w:id="107" w:name="_Toc242251917"/>
       <w:r>
@@ -25697,7 +25782,7 @@
     </w:p>
     <w:p>
       <w:pPr>
-        <w:pStyle w:val="Heading3"/>
+        <w:pStyle w:val="Ttulo3"/>
       </w:pPr>
       <w:bookmarkStart w:id="108" w:name="_Toc58077517"/>
       <w:bookmarkStart w:id="109" w:name="_Toc242251918"/>
@@ -25709,7 +25794,7 @@
     </w:p>
     <w:p>
       <w:pPr>
-        <w:pStyle w:val="ListParagraph"/>
+        <w:pStyle w:val="Prrafodelista"/>
         <w:numPr>
           <w:ilvl w:val="0"/>
           <w:numId w:val="31"/>
@@ -25721,7 +25806,7 @@
     </w:p>
     <w:p>
       <w:pPr>
-        <w:pStyle w:val="ListParagraph"/>
+        <w:pStyle w:val="Prrafodelista"/>
         <w:numPr>
           <w:ilvl w:val="0"/>
           <w:numId w:val="31"/>
@@ -25733,7 +25818,7 @@
     </w:p>
     <w:p>
       <w:pPr>
-        <w:pStyle w:val="Heading3"/>
+        <w:pStyle w:val="Ttulo3"/>
       </w:pPr>
       <w:bookmarkStart w:id="110" w:name="_Toc58077518"/>
       <w:bookmarkStart w:id="111" w:name="_Toc242251919"/>
@@ -25771,7 +25856,7 @@
     </w:p>
     <w:p>
       <w:pPr>
-        <w:pStyle w:val="TOCHeading"/>
+        <w:pStyle w:val="TtuloTDC"/>
       </w:pPr>
       <w:bookmarkStart w:id="113" w:name="_Toc58077520"/>
       <w:r>
@@ -25781,7 +25866,7 @@
     </w:p>
     <w:p>
       <w:pPr>
-        <w:pStyle w:val="ListParagraph"/>
+        <w:pStyle w:val="Prrafodelista"/>
         <w:numPr>
           <w:ilvl w:val="0"/>
           <w:numId w:val="33"/>
@@ -25793,7 +25878,7 @@
     </w:p>
     <w:p>
       <w:pPr>
-        <w:pStyle w:val="ListParagraph"/>
+        <w:pStyle w:val="Prrafodelista"/>
         <w:numPr>
           <w:ilvl w:val="0"/>
           <w:numId w:val="33"/>
@@ -25808,7 +25893,7 @@
     </w:p>
     <w:p>
       <w:pPr>
-        <w:pStyle w:val="TOCHeading"/>
+        <w:pStyle w:val="TtuloTDC"/>
       </w:pPr>
       <w:bookmarkStart w:id="114" w:name="_Toc58077521"/>
       <w:r>
@@ -25818,7 +25903,7 @@
     </w:p>
     <w:p>
       <w:pPr>
-        <w:pStyle w:val="ListParagraph"/>
+        <w:pStyle w:val="Prrafodelista"/>
         <w:numPr>
           <w:ilvl w:val="0"/>
           <w:numId w:val="32"/>
@@ -25830,7 +25915,7 @@
     </w:p>
     <w:p>
       <w:pPr>
-        <w:pStyle w:val="ListParagraph"/>
+        <w:pStyle w:val="Prrafodelista"/>
         <w:numPr>
           <w:ilvl w:val="0"/>
           <w:numId w:val="32"/>
@@ -25842,7 +25927,7 @@
     </w:p>
     <w:p>
       <w:pPr>
-        <w:pStyle w:val="ListParagraph"/>
+        <w:pStyle w:val="Prrafodelista"/>
         <w:numPr>
           <w:ilvl w:val="0"/>
           <w:numId w:val="32"/>
@@ -25856,7 +25941,7 @@
     <w:bookmarkEnd w:id="115"/>
     <w:p>
       <w:pPr>
-        <w:pStyle w:val="TOCHeading"/>
+        <w:pStyle w:val="TtuloTDC"/>
         <w:rPr>
           <w:rFonts w:cstheme="minorHAnsi"/>
         </w:rPr>
@@ -25881,7 +25966,7 @@
 </file>
 
 <file path=word/endnotes.xml><?xml version="1.0" encoding="utf-8"?>
-<w:endnotes xmlns:wpc="http://schemas.microsoft.com/office/word/2010/wordprocessingCanvas" xmlns:cx="http://schemas.microsoft.com/office/drawing/2014/chartex" xmlns:cx1="http://schemas.microsoft.com/office/drawing/2015/9/8/chartex" xmlns:cx2="http://schemas.microsoft.com/office/drawing/2015/10/21/chartex" xmlns:cx3="http://schemas.microsoft.com/office/drawing/2016/5/9/chartex" xmlns:cx4="http://schemas.microsoft.com/office/drawing/2016/5/10/chartex" xmlns:cx5="http://schemas.microsoft.com/office/drawing/2016/5/11/chartex" xmlns:cx6="http://schemas.microsoft.com/office/drawing/2016/5/12/chartex" xmlns:cx7="http://schemas.microsoft.com/office/drawing/2016/5/13/chartex" xmlns:cx8="http://schemas.microsoft.com/office/drawing/2016/5/14/chartex" xmlns:mc="http://schemas.openxmlformats.org/markup-compatibility/2006" xmlns:aink="http://schemas.microsoft.com/office/drawing/2016/ink" xmlns:am3d="http://schemas.microsoft.com/office/drawing/2017/model3d" xmlns:o="urn:schemas-microsoft-com:office:office" xmlns:oel="http://schemas.microsoft.com/office/2019/extlst" xmlns:r="http://schemas.openxmlformats.org/officeDocument/2006/relationships" xmlns:m="http://schemas.openxmlformats.org/officeDocument/2006/math" xmlns:v="urn:schemas-microsoft-com:vml" xmlns:wp14="http://schemas.microsoft.com/office/word/2010/wordprocessingDrawing" xmlns:wp="http://schemas.openxmlformats.org/drawingml/2006/wordprocessingDrawing" xmlns:w10="urn:schemas-microsoft-com:office:word" xmlns:w="http://schemas.openxmlformats.org/wordprocessingml/2006/main" xmlns:w14="http://schemas.microsoft.com/office/word/2010/wordml" xmlns:w15="http://schemas.microsoft.com/office/word/2012/wordml" xmlns:w16cex="http://schemas.microsoft.com/office/word/2018/wordml/cex" xmlns:w16cid="http://schemas.microsoft.com/office/word/2016/wordml/cid" xmlns:w16="http://schemas.microsoft.com/office/word/2018/wordml" xmlns:w16du="http://schemas.microsoft.com/office/word/2023/wordml/word16du" xmlns:w16sdtdh="http://schemas.microsoft.com/office/word/2020/wordml/sdtdatahash" xmlns:w16sdtfl="http://schemas.microsoft.com/office/word/2024/wordml/sdtformatlock" xmlns:w16se="http://schemas.microsoft.com/office/word/2015/wordml/symex" xmlns:wpg="http://schemas.microsoft.com/office/word/2010/wordprocessingGroup" xmlns:wpi="http://schemas.microsoft.com/office/word/2010/wordprocessingInk" xmlns:wne="http://schemas.microsoft.com/office/word/2006/wordml" xmlns:wps="http://schemas.microsoft.com/office/word/2010/wordprocessingShape" mc:Ignorable="w14 w15 w16se w16cid w16 w16cex w16sdtdh w16sdtfl w16du wp14">
+<w:endnotes xmlns:wpc="http://schemas.microsoft.com/office/word/2010/wordprocessingCanvas" xmlns:cx="http://schemas.microsoft.com/office/drawing/2014/chartex" xmlns:cx1="http://schemas.microsoft.com/office/drawing/2015/9/8/chartex" xmlns:cx2="http://schemas.microsoft.com/office/drawing/2015/10/21/chartex" xmlns:cx3="http://schemas.microsoft.com/office/drawing/2016/5/9/chartex" xmlns:cx4="http://schemas.microsoft.com/office/drawing/2016/5/10/chartex" xmlns:cx5="http://schemas.microsoft.com/office/drawing/2016/5/11/chartex" xmlns:cx6="http://schemas.microsoft.com/office/drawing/2016/5/12/chartex" xmlns:cx7="http://schemas.microsoft.com/office/drawing/2016/5/13/chartex" xmlns:cx8="http://schemas.microsoft.com/office/drawing/2016/5/14/chartex" xmlns:mc="http://schemas.openxmlformats.org/markup-compatibility/2006" xmlns:aink="http://schemas.microsoft.com/office/drawing/2016/ink" xmlns:am3d="http://schemas.microsoft.com/office/drawing/2017/model3d" xmlns:o="urn:schemas-microsoft-com:office:office" xmlns:r="http://schemas.openxmlformats.org/officeDocument/2006/relationships" xmlns:m="http://schemas.openxmlformats.org/officeDocument/2006/math" xmlns:v="urn:schemas-microsoft-com:vml" xmlns:wp14="http://schemas.microsoft.com/office/word/2010/wordprocessingDrawing" xmlns:wp="http://schemas.openxmlformats.org/drawingml/2006/wordprocessingDrawing" xmlns:w10="urn:schemas-microsoft-com:office:word" xmlns:w="http://schemas.openxmlformats.org/wordprocessingml/2006/main" xmlns:w14="http://schemas.microsoft.com/office/word/2010/wordml" xmlns:w15="http://schemas.microsoft.com/office/word/2012/wordml" xmlns:w16cex="http://schemas.microsoft.com/office/word/2018/wordml/cex" xmlns:w16cid="http://schemas.microsoft.com/office/word/2016/wordml/cid" xmlns:w16="http://schemas.microsoft.com/office/word/2018/wordml" xmlns:w16sdtdh="http://schemas.microsoft.com/office/word/2020/wordml/sdtdatahash" xmlns:w16se="http://schemas.microsoft.com/office/word/2015/wordml/symex" xmlns:wpg="http://schemas.microsoft.com/office/word/2010/wordprocessingGroup" xmlns:wpi="http://schemas.microsoft.com/office/word/2010/wordprocessingInk" xmlns:wne="http://schemas.microsoft.com/office/word/2006/wordml" xmlns:wps="http://schemas.microsoft.com/office/word/2010/wordprocessingShape" mc:Ignorable="w14 w15 w16se w16cid w16 w16cex w16sdtdh wp14">
   <w:endnote w:type="separator" w:id="-1">
     <w:p>
       <w:r>
@@ -25907,7 +25992,7 @@
 </file>
 
 <file path=word/footer1.xml><?xml version="1.0" encoding="utf-8"?>
-<w:ftr xmlns:wpc="http://schemas.microsoft.com/office/word/2010/wordprocessingCanvas" xmlns:cx="http://schemas.microsoft.com/office/drawing/2014/chartex" xmlns:cx1="http://schemas.microsoft.com/office/drawing/2015/9/8/chartex" xmlns:cx2="http://schemas.microsoft.com/office/drawing/2015/10/21/chartex" xmlns:cx3="http://schemas.microsoft.com/office/drawing/2016/5/9/chartex" xmlns:cx4="http://schemas.microsoft.com/office/drawing/2016/5/10/chartex" xmlns:cx5="http://schemas.microsoft.com/office/drawing/2016/5/11/chartex" xmlns:cx6="http://schemas.microsoft.com/office/drawing/2016/5/12/chartex" xmlns:cx7="http://schemas.microsoft.com/office/drawing/2016/5/13/chartex" xmlns:cx8="http://schemas.microsoft.com/office/drawing/2016/5/14/chartex" xmlns:mc="http://schemas.openxmlformats.org/markup-compatibility/2006" xmlns:aink="http://schemas.microsoft.com/office/drawing/2016/ink" xmlns:am3d="http://schemas.microsoft.com/office/drawing/2017/model3d" xmlns:o="urn:schemas-microsoft-com:office:office" xmlns:oel="http://schemas.microsoft.com/office/2019/extlst" xmlns:r="http://schemas.openxmlformats.org/officeDocument/2006/relationships" xmlns:m="http://schemas.openxmlformats.org/officeDocument/2006/math" xmlns:v="urn:schemas-microsoft-com:vml" xmlns:wp14="http://schemas.microsoft.com/office/word/2010/wordprocessingDrawing" xmlns:wp="http://schemas.openxmlformats.org/drawingml/2006/wordprocessingDrawing" xmlns:w10="urn:schemas-microsoft-com:office:word" xmlns:w="http://schemas.openxmlformats.org/wordprocessingml/2006/main" xmlns:w14="http://schemas.microsoft.com/office/word/2010/wordml" xmlns:w15="http://schemas.microsoft.com/office/word/2012/wordml" xmlns:w16cex="http://schemas.microsoft.com/office/word/2018/wordml/cex" xmlns:w16cid="http://schemas.microsoft.com/office/word/2016/wordml/cid" xmlns:w16="http://schemas.microsoft.com/office/word/2018/wordml" xmlns:w16du="http://schemas.microsoft.com/office/word/2023/wordml/word16du" xmlns:w16sdtdh="http://schemas.microsoft.com/office/word/2020/wordml/sdtdatahash" xmlns:w16sdtfl="http://schemas.microsoft.com/office/word/2024/wordml/sdtformatlock" xmlns:w16se="http://schemas.microsoft.com/office/word/2015/wordml/symex" xmlns:wpg="http://schemas.microsoft.com/office/word/2010/wordprocessingGroup" xmlns:wpi="http://schemas.microsoft.com/office/word/2010/wordprocessingInk" xmlns:wne="http://schemas.microsoft.com/office/word/2006/wordml" xmlns:wps="http://schemas.microsoft.com/office/word/2010/wordprocessingShape" mc:Ignorable="w14 w15 w16se w16cid w16 w16cex w16sdtdh w16sdtfl w16du wp14">
+<w:ftr xmlns:wpc="http://schemas.microsoft.com/office/word/2010/wordprocessingCanvas" xmlns:cx="http://schemas.microsoft.com/office/drawing/2014/chartex" xmlns:cx1="http://schemas.microsoft.com/office/drawing/2015/9/8/chartex" xmlns:cx2="http://schemas.microsoft.com/office/drawing/2015/10/21/chartex" xmlns:cx3="http://schemas.microsoft.com/office/drawing/2016/5/9/chartex" xmlns:cx4="http://schemas.microsoft.com/office/drawing/2016/5/10/chartex" xmlns:cx5="http://schemas.microsoft.com/office/drawing/2016/5/11/chartex" xmlns:cx6="http://schemas.microsoft.com/office/drawing/2016/5/12/chartex" xmlns:cx7="http://schemas.microsoft.com/office/drawing/2016/5/13/chartex" xmlns:cx8="http://schemas.microsoft.com/office/drawing/2016/5/14/chartex" xmlns:mc="http://schemas.openxmlformats.org/markup-compatibility/2006" xmlns:aink="http://schemas.microsoft.com/office/drawing/2016/ink" xmlns:am3d="http://schemas.microsoft.com/office/drawing/2017/model3d" xmlns:o="urn:schemas-microsoft-com:office:office" xmlns:r="http://schemas.openxmlformats.org/officeDocument/2006/relationships" xmlns:m="http://schemas.openxmlformats.org/officeDocument/2006/math" xmlns:v="urn:schemas-microsoft-com:vml" xmlns:wp14="http://schemas.microsoft.com/office/word/2010/wordprocessingDrawing" xmlns:wp="http://schemas.openxmlformats.org/drawingml/2006/wordprocessingDrawing" xmlns:w10="urn:schemas-microsoft-com:office:word" xmlns:w="http://schemas.openxmlformats.org/wordprocessingml/2006/main" xmlns:w14="http://schemas.microsoft.com/office/word/2010/wordml" xmlns:w15="http://schemas.microsoft.com/office/word/2012/wordml" xmlns:w16cex="http://schemas.microsoft.com/office/word/2018/wordml/cex" xmlns:w16cid="http://schemas.microsoft.com/office/word/2016/wordml/cid" xmlns:w16="http://schemas.microsoft.com/office/word/2018/wordml" xmlns:w16sdtdh="http://schemas.microsoft.com/office/word/2020/wordml/sdtdatahash" xmlns:w16se="http://schemas.microsoft.com/office/word/2015/wordml/symex" xmlns:wpg="http://schemas.microsoft.com/office/word/2010/wordprocessingGroup" xmlns:wpi="http://schemas.microsoft.com/office/word/2010/wordprocessingInk" xmlns:wne="http://schemas.microsoft.com/office/word/2006/wordml" xmlns:wps="http://schemas.microsoft.com/office/word/2010/wordprocessingShape" mc:Ignorable="w14 w15 w16se w16cid w16 w16cex w16sdtdh wp14">
   <w:sdt>
     <w:sdtPr>
       <w:id w:val="910883225"/>
@@ -25920,7 +26005,7 @@
     <w:sdtContent>
       <w:p>
         <w:pPr>
-          <w:pStyle w:val="Footer"/>
+          <w:pStyle w:val="Piedepgina"/>
           <w:jc w:val="right"/>
         </w:pPr>
         <w:r>
@@ -25946,24 +26031,24 @@
   </w:sdt>
   <w:p>
     <w:pPr>
-      <w:pStyle w:val="Footer"/>
+      <w:pStyle w:val="Piedepgina"/>
     </w:pPr>
   </w:p>
 </w:ftr>
 </file>
 
 <file path=word/footer2.xml><?xml version="1.0" encoding="utf-8"?>
-<w:ftr xmlns:wpc="http://schemas.microsoft.com/office/word/2010/wordprocessingCanvas" xmlns:cx="http://schemas.microsoft.com/office/drawing/2014/chartex" xmlns:cx1="http://schemas.microsoft.com/office/drawing/2015/9/8/chartex" xmlns:cx2="http://schemas.microsoft.com/office/drawing/2015/10/21/chartex" xmlns:cx3="http://schemas.microsoft.com/office/drawing/2016/5/9/chartex" xmlns:cx4="http://schemas.microsoft.com/office/drawing/2016/5/10/chartex" xmlns:cx5="http://schemas.microsoft.com/office/drawing/2016/5/11/chartex" xmlns:cx6="http://schemas.microsoft.com/office/drawing/2016/5/12/chartex" xmlns:cx7="http://schemas.microsoft.com/office/drawing/2016/5/13/chartex" xmlns:cx8="http://schemas.microsoft.com/office/drawing/2016/5/14/chartex" xmlns:mc="http://schemas.openxmlformats.org/markup-compatibility/2006" xmlns:aink="http://schemas.microsoft.com/office/drawing/2016/ink" xmlns:am3d="http://schemas.microsoft.com/office/drawing/2017/model3d" xmlns:o="urn:schemas-microsoft-com:office:office" xmlns:oel="http://schemas.microsoft.com/office/2019/extlst" xmlns:r="http://schemas.openxmlformats.org/officeDocument/2006/relationships" xmlns:m="http://schemas.openxmlformats.org/officeDocument/2006/math" xmlns:v="urn:schemas-microsoft-com:vml" xmlns:wp14="http://schemas.microsoft.com/office/word/2010/wordprocessingDrawing" xmlns:wp="http://schemas.openxmlformats.org/drawingml/2006/wordprocessingDrawing" xmlns:w10="urn:schemas-microsoft-com:office:word" xmlns:w="http://schemas.openxmlformats.org/wordprocessingml/2006/main" xmlns:w14="http://schemas.microsoft.com/office/word/2010/wordml" xmlns:w15="http://schemas.microsoft.com/office/word/2012/wordml" xmlns:w16cex="http://schemas.microsoft.com/office/word/2018/wordml/cex" xmlns:w16cid="http://schemas.microsoft.com/office/word/2016/wordml/cid" xmlns:w16="http://schemas.microsoft.com/office/word/2018/wordml" xmlns:w16du="http://schemas.microsoft.com/office/word/2023/wordml/word16du" xmlns:w16sdtdh="http://schemas.microsoft.com/office/word/2020/wordml/sdtdatahash" xmlns:w16sdtfl="http://schemas.microsoft.com/office/word/2024/wordml/sdtformatlock" xmlns:w16se="http://schemas.microsoft.com/office/word/2015/wordml/symex" xmlns:wpg="http://schemas.microsoft.com/office/word/2010/wordprocessingGroup" xmlns:wpi="http://schemas.microsoft.com/office/word/2010/wordprocessingInk" xmlns:wne="http://schemas.microsoft.com/office/word/2006/wordml" xmlns:wps="http://schemas.microsoft.com/office/word/2010/wordprocessingShape" mc:Ignorable="w14 w15 w16se w16cid w16 w16cex w16sdtdh w16sdtfl w16du wp14">
+<w:ftr xmlns:wpc="http://schemas.microsoft.com/office/word/2010/wordprocessingCanvas" xmlns:cx="http://schemas.microsoft.com/office/drawing/2014/chartex" xmlns:cx1="http://schemas.microsoft.com/office/drawing/2015/9/8/chartex" xmlns:cx2="http://schemas.microsoft.com/office/drawing/2015/10/21/chartex" xmlns:cx3="http://schemas.microsoft.com/office/drawing/2016/5/9/chartex" xmlns:cx4="http://schemas.microsoft.com/office/drawing/2016/5/10/chartex" xmlns:cx5="http://schemas.microsoft.com/office/drawing/2016/5/11/chartex" xmlns:cx6="http://schemas.microsoft.com/office/drawing/2016/5/12/chartex" xmlns:cx7="http://schemas.microsoft.com/office/drawing/2016/5/13/chartex" xmlns:cx8="http://schemas.microsoft.com/office/drawing/2016/5/14/chartex" xmlns:mc="http://schemas.openxmlformats.org/markup-compatibility/2006" xmlns:aink="http://schemas.microsoft.com/office/drawing/2016/ink" xmlns:am3d="http://schemas.microsoft.com/office/drawing/2017/model3d" xmlns:o="urn:schemas-microsoft-com:office:office" xmlns:r="http://schemas.openxmlformats.org/officeDocument/2006/relationships" xmlns:m="http://schemas.openxmlformats.org/officeDocument/2006/math" xmlns:v="urn:schemas-microsoft-com:vml" xmlns:wp14="http://schemas.microsoft.com/office/word/2010/wordprocessingDrawing" xmlns:wp="http://schemas.openxmlformats.org/drawingml/2006/wordprocessingDrawing" xmlns:w10="urn:schemas-microsoft-com:office:word" xmlns:w="http://schemas.openxmlformats.org/wordprocessingml/2006/main" xmlns:w14="http://schemas.microsoft.com/office/word/2010/wordml" xmlns:w15="http://schemas.microsoft.com/office/word/2012/wordml" xmlns:w16cex="http://schemas.microsoft.com/office/word/2018/wordml/cex" xmlns:w16cid="http://schemas.microsoft.com/office/word/2016/wordml/cid" xmlns:w16="http://schemas.microsoft.com/office/word/2018/wordml" xmlns:w16sdtdh="http://schemas.microsoft.com/office/word/2020/wordml/sdtdatahash" xmlns:w16se="http://schemas.microsoft.com/office/word/2015/wordml/symex" xmlns:wpg="http://schemas.microsoft.com/office/word/2010/wordprocessingGroup" xmlns:wpi="http://schemas.microsoft.com/office/word/2010/wordprocessingInk" xmlns:wne="http://schemas.microsoft.com/office/word/2006/wordml" xmlns:wps="http://schemas.microsoft.com/office/word/2010/wordprocessingShape" mc:Ignorable="w14 w15 w16se w16cid w16 w16cex w16sdtdh wp14">
   <w:p>
     <w:pPr>
-      <w:pStyle w:val="Footer"/>
+      <w:pStyle w:val="Piedepgina"/>
     </w:pPr>
   </w:p>
 </w:ftr>
 </file>
 
 <file path=word/footnotes.xml><?xml version="1.0" encoding="utf-8"?>
-<w:footnotes xmlns:wpc="http://schemas.microsoft.com/office/word/2010/wordprocessingCanvas" xmlns:cx="http://schemas.microsoft.com/office/drawing/2014/chartex" xmlns:cx1="http://schemas.microsoft.com/office/drawing/2015/9/8/chartex" xmlns:cx2="http://schemas.microsoft.com/office/drawing/2015/10/21/chartex" xmlns:cx3="http://schemas.microsoft.com/office/drawing/2016/5/9/chartex" xmlns:cx4="http://schemas.microsoft.com/office/drawing/2016/5/10/chartex" xmlns:cx5="http://schemas.microsoft.com/office/drawing/2016/5/11/chartex" xmlns:cx6="http://schemas.microsoft.com/office/drawing/2016/5/12/chartex" xmlns:cx7="http://schemas.microsoft.com/office/drawing/2016/5/13/chartex" xmlns:cx8="http://schemas.microsoft.com/office/drawing/2016/5/14/chartex" xmlns:mc="http://schemas.openxmlformats.org/markup-compatibility/2006" xmlns:aink="http://schemas.microsoft.com/office/drawing/2016/ink" xmlns:am3d="http://schemas.microsoft.com/office/drawing/2017/model3d" xmlns:o="urn:schemas-microsoft-com:office:office" xmlns:oel="http://schemas.microsoft.com/office/2019/extlst" xmlns:r="http://schemas.openxmlformats.org/officeDocument/2006/relationships" xmlns:m="http://schemas.openxmlformats.org/officeDocument/2006/math" xmlns:v="urn:schemas-microsoft-com:vml" xmlns:wp14="http://schemas.microsoft.com/office/word/2010/wordprocessingDrawing" xmlns:wp="http://schemas.openxmlformats.org/drawingml/2006/wordprocessingDrawing" xmlns:w10="urn:schemas-microsoft-com:office:word" xmlns:w="http://schemas.openxmlformats.org/wordprocessingml/2006/main" xmlns:w14="http://schemas.microsoft.com/office/word/2010/wordml" xmlns:w15="http://schemas.microsoft.com/office/word/2012/wordml" xmlns:w16cex="http://schemas.microsoft.com/office/word/2018/wordml/cex" xmlns:w16cid="http://schemas.microsoft.com/office/word/2016/wordml/cid" xmlns:w16="http://schemas.microsoft.com/office/word/2018/wordml" xmlns:w16du="http://schemas.microsoft.com/office/word/2023/wordml/word16du" xmlns:w16sdtdh="http://schemas.microsoft.com/office/word/2020/wordml/sdtdatahash" xmlns:w16sdtfl="http://schemas.microsoft.com/office/word/2024/wordml/sdtformatlock" xmlns:w16se="http://schemas.microsoft.com/office/word/2015/wordml/symex" xmlns:wpg="http://schemas.microsoft.com/office/word/2010/wordprocessingGroup" xmlns:wpi="http://schemas.microsoft.com/office/word/2010/wordprocessingInk" xmlns:wne="http://schemas.microsoft.com/office/word/2006/wordml" xmlns:wps="http://schemas.microsoft.com/office/word/2010/wordprocessingShape" mc:Ignorable="w14 w15 w16se w16cid w16 w16cex w16sdtdh w16sdtfl w16du wp14">
+<w:footnotes xmlns:wpc="http://schemas.microsoft.com/office/word/2010/wordprocessingCanvas" xmlns:cx="http://schemas.microsoft.com/office/drawing/2014/chartex" xmlns:cx1="http://schemas.microsoft.com/office/drawing/2015/9/8/chartex" xmlns:cx2="http://schemas.microsoft.com/office/drawing/2015/10/21/chartex" xmlns:cx3="http://schemas.microsoft.com/office/drawing/2016/5/9/chartex" xmlns:cx4="http://schemas.microsoft.com/office/drawing/2016/5/10/chartex" xmlns:cx5="http://schemas.microsoft.com/office/drawing/2016/5/11/chartex" xmlns:cx6="http://schemas.microsoft.com/office/drawing/2016/5/12/chartex" xmlns:cx7="http://schemas.microsoft.com/office/drawing/2016/5/13/chartex" xmlns:cx8="http://schemas.microsoft.com/office/drawing/2016/5/14/chartex" xmlns:mc="http://schemas.openxmlformats.org/markup-compatibility/2006" xmlns:aink="http://schemas.microsoft.com/office/drawing/2016/ink" xmlns:am3d="http://schemas.microsoft.com/office/drawing/2017/model3d" xmlns:o="urn:schemas-microsoft-com:office:office" xmlns:r="http://schemas.openxmlformats.org/officeDocument/2006/relationships" xmlns:m="http://schemas.openxmlformats.org/officeDocument/2006/math" xmlns:v="urn:schemas-microsoft-com:vml" xmlns:wp14="http://schemas.microsoft.com/office/word/2010/wordprocessingDrawing" xmlns:wp="http://schemas.openxmlformats.org/drawingml/2006/wordprocessingDrawing" xmlns:w10="urn:schemas-microsoft-com:office:word" xmlns:w="http://schemas.openxmlformats.org/wordprocessingml/2006/main" xmlns:w14="http://schemas.microsoft.com/office/word/2010/wordml" xmlns:w15="http://schemas.microsoft.com/office/word/2012/wordml" xmlns:w16cex="http://schemas.microsoft.com/office/word/2018/wordml/cex" xmlns:w16cid="http://schemas.microsoft.com/office/word/2016/wordml/cid" xmlns:w16="http://schemas.microsoft.com/office/word/2018/wordml" xmlns:w16sdtdh="http://schemas.microsoft.com/office/word/2020/wordml/sdtdatahash" xmlns:w16se="http://schemas.microsoft.com/office/word/2015/wordml/symex" xmlns:wpg="http://schemas.microsoft.com/office/word/2010/wordprocessingGroup" xmlns:wpi="http://schemas.microsoft.com/office/word/2010/wordprocessingInk" xmlns:wne="http://schemas.microsoft.com/office/word/2006/wordml" xmlns:wps="http://schemas.microsoft.com/office/word/2010/wordprocessingShape" mc:Ignorable="w14 w15 w16se w16cid w16 w16cex w16sdtdh wp14">
   <w:footnote w:type="separator" w:id="-1">
     <w:p>
       <w:r>
@@ -25989,17 +26074,17 @@
 </file>
 
 <file path=word/header1.xml><?xml version="1.0" encoding="utf-8"?>
-<w:hdr xmlns:wpc="http://schemas.microsoft.com/office/word/2010/wordprocessingCanvas" xmlns:cx="http://schemas.microsoft.com/office/drawing/2014/chartex" xmlns:cx1="http://schemas.microsoft.com/office/drawing/2015/9/8/chartex" xmlns:cx2="http://schemas.microsoft.com/office/drawing/2015/10/21/chartex" xmlns:cx3="http://schemas.microsoft.com/office/drawing/2016/5/9/chartex" xmlns:cx4="http://schemas.microsoft.com/office/drawing/2016/5/10/chartex" xmlns:cx5="http://schemas.microsoft.com/office/drawing/2016/5/11/chartex" xmlns:cx6="http://schemas.microsoft.com/office/drawing/2016/5/12/chartex" xmlns:cx7="http://schemas.microsoft.com/office/drawing/2016/5/13/chartex" xmlns:cx8="http://schemas.microsoft.com/office/drawing/2016/5/14/chartex" xmlns:mc="http://schemas.openxmlformats.org/markup-compatibility/2006" xmlns:aink="http://schemas.microsoft.com/office/drawing/2016/ink" xmlns:am3d="http://schemas.microsoft.com/office/drawing/2017/model3d" xmlns:o="urn:schemas-microsoft-com:office:office" xmlns:oel="http://schemas.microsoft.com/office/2019/extlst" xmlns:r="http://schemas.openxmlformats.org/officeDocument/2006/relationships" xmlns:m="http://schemas.openxmlformats.org/officeDocument/2006/math" xmlns:v="urn:schemas-microsoft-com:vml" xmlns:wp14="http://schemas.microsoft.com/office/word/2010/wordprocessingDrawing" xmlns:wp="http://schemas.openxmlformats.org/drawingml/2006/wordprocessingDrawing" xmlns:w10="urn:schemas-microsoft-com:office:word" xmlns:w="http://schemas.openxmlformats.org/wordprocessingml/2006/main" xmlns:w14="http://schemas.microsoft.com/office/word/2010/wordml" xmlns:w15="http://schemas.microsoft.com/office/word/2012/wordml" xmlns:w16cex="http://schemas.microsoft.com/office/word/2018/wordml/cex" xmlns:w16cid="http://schemas.microsoft.com/office/word/2016/wordml/cid" xmlns:w16="http://schemas.microsoft.com/office/word/2018/wordml" xmlns:w16du="http://schemas.microsoft.com/office/word/2023/wordml/word16du" xmlns:w16sdtdh="http://schemas.microsoft.com/office/word/2020/wordml/sdtdatahash" xmlns:w16sdtfl="http://schemas.microsoft.com/office/word/2024/wordml/sdtformatlock" xmlns:w16se="http://schemas.microsoft.com/office/word/2015/wordml/symex" xmlns:wpg="http://schemas.microsoft.com/office/word/2010/wordprocessingGroup" xmlns:wpi="http://schemas.microsoft.com/office/word/2010/wordprocessingInk" xmlns:wne="http://schemas.microsoft.com/office/word/2006/wordml" xmlns:wps="http://schemas.microsoft.com/office/word/2010/wordprocessingShape" mc:Ignorable="w14 w15 w16se w16cid w16 w16cex w16sdtdh w16sdtfl w16du wp14">
+<w:hdr xmlns:wpc="http://schemas.microsoft.com/office/word/2010/wordprocessingCanvas" xmlns:cx="http://schemas.microsoft.com/office/drawing/2014/chartex" xmlns:cx1="http://schemas.microsoft.com/office/drawing/2015/9/8/chartex" xmlns:cx2="http://schemas.microsoft.com/office/drawing/2015/10/21/chartex" xmlns:cx3="http://schemas.microsoft.com/office/drawing/2016/5/9/chartex" xmlns:cx4="http://schemas.microsoft.com/office/drawing/2016/5/10/chartex" xmlns:cx5="http://schemas.microsoft.com/office/drawing/2016/5/11/chartex" xmlns:cx6="http://schemas.microsoft.com/office/drawing/2016/5/12/chartex" xmlns:cx7="http://schemas.microsoft.com/office/drawing/2016/5/13/chartex" xmlns:cx8="http://schemas.microsoft.com/office/drawing/2016/5/14/chartex" xmlns:mc="http://schemas.openxmlformats.org/markup-compatibility/2006" xmlns:aink="http://schemas.microsoft.com/office/drawing/2016/ink" xmlns:am3d="http://schemas.microsoft.com/office/drawing/2017/model3d" xmlns:o="urn:schemas-microsoft-com:office:office" xmlns:r="http://schemas.openxmlformats.org/officeDocument/2006/relationships" xmlns:m="http://schemas.openxmlformats.org/officeDocument/2006/math" xmlns:v="urn:schemas-microsoft-com:vml" xmlns:wp14="http://schemas.microsoft.com/office/word/2010/wordprocessingDrawing" xmlns:wp="http://schemas.openxmlformats.org/drawingml/2006/wordprocessingDrawing" xmlns:w10="urn:schemas-microsoft-com:office:word" xmlns:w="http://schemas.openxmlformats.org/wordprocessingml/2006/main" xmlns:w14="http://schemas.microsoft.com/office/word/2010/wordml" xmlns:w15="http://schemas.microsoft.com/office/word/2012/wordml" xmlns:w16cex="http://schemas.microsoft.com/office/word/2018/wordml/cex" xmlns:w16cid="http://schemas.microsoft.com/office/word/2016/wordml/cid" xmlns:w16="http://schemas.microsoft.com/office/word/2018/wordml" xmlns:w16sdtdh="http://schemas.microsoft.com/office/word/2020/wordml/sdtdatahash" xmlns:w16se="http://schemas.microsoft.com/office/word/2015/wordml/symex" xmlns:wpg="http://schemas.microsoft.com/office/word/2010/wordprocessingGroup" xmlns:wpi="http://schemas.microsoft.com/office/word/2010/wordprocessingInk" xmlns:wne="http://schemas.microsoft.com/office/word/2006/wordml" xmlns:wps="http://schemas.microsoft.com/office/word/2010/wordprocessingShape" mc:Ignorable="w14 w15 w16se w16cid w16 w16cex w16sdtdh wp14">
   <w:p>
     <w:pPr>
-      <w:pStyle w:val="Header"/>
+      <w:pStyle w:val="Encabezado"/>
     </w:pPr>
   </w:p>
 </w:hdr>
 </file>
 
 <file path=word/numbering.xml><?xml version="1.0" encoding="utf-8"?>
-<w:numbering xmlns:wpc="http://schemas.microsoft.com/office/word/2010/wordprocessingCanvas" xmlns:cx="http://schemas.microsoft.com/office/drawing/2014/chartex" xmlns:cx1="http://schemas.microsoft.com/office/drawing/2015/9/8/chartex" xmlns:cx2="http://schemas.microsoft.com/office/drawing/2015/10/21/chartex" xmlns:cx3="http://schemas.microsoft.com/office/drawing/2016/5/9/chartex" xmlns:cx4="http://schemas.microsoft.com/office/drawing/2016/5/10/chartex" xmlns:cx5="http://schemas.microsoft.com/office/drawing/2016/5/11/chartex" xmlns:cx6="http://schemas.microsoft.com/office/drawing/2016/5/12/chartex" xmlns:cx7="http://schemas.microsoft.com/office/drawing/2016/5/13/chartex" xmlns:cx8="http://schemas.microsoft.com/office/drawing/2016/5/14/chartex" xmlns:mc="http://schemas.openxmlformats.org/markup-compatibility/2006" xmlns:aink="http://schemas.microsoft.com/office/drawing/2016/ink" xmlns:am3d="http://schemas.microsoft.com/office/drawing/2017/model3d" xmlns:o="urn:schemas-microsoft-com:office:office" xmlns:oel="http://schemas.microsoft.com/office/2019/extlst" xmlns:r="http://schemas.openxmlformats.org/officeDocument/2006/relationships" xmlns:m="http://schemas.openxmlformats.org/officeDocument/2006/math" xmlns:v="urn:schemas-microsoft-com:vml" xmlns:wp14="http://schemas.microsoft.com/office/word/2010/wordprocessingDrawing" xmlns:wp="http://schemas.openxmlformats.org/drawingml/2006/wordprocessingDrawing" xmlns:w10="urn:schemas-microsoft-com:office:word" xmlns:w="http://schemas.openxmlformats.org/wordprocessingml/2006/main" xmlns:w14="http://schemas.microsoft.com/office/word/2010/wordml" xmlns:w15="http://schemas.microsoft.com/office/word/2012/wordml" xmlns:w16cex="http://schemas.microsoft.com/office/word/2018/wordml/cex" xmlns:w16cid="http://schemas.microsoft.com/office/word/2016/wordml/cid" xmlns:w16="http://schemas.microsoft.com/office/word/2018/wordml" xmlns:w16du="http://schemas.microsoft.com/office/word/2023/wordml/word16du" xmlns:w16sdtdh="http://schemas.microsoft.com/office/word/2020/wordml/sdtdatahash" xmlns:w16sdtfl="http://schemas.microsoft.com/office/word/2024/wordml/sdtformatlock" xmlns:w16se="http://schemas.microsoft.com/office/word/2015/wordml/symex" xmlns:wpg="http://schemas.microsoft.com/office/word/2010/wordprocessingGroup" xmlns:wpi="http://schemas.microsoft.com/office/word/2010/wordprocessingInk" xmlns:wne="http://schemas.microsoft.com/office/word/2006/wordml" xmlns:wps="http://schemas.microsoft.com/office/word/2010/wordprocessingShape" mc:Ignorable="w14 w15 w16se w16cid w16 w16cex w16sdtdh w16sdtfl w16du wp14">
+<w:numbering xmlns:wpc="http://schemas.microsoft.com/office/word/2010/wordprocessingCanvas" xmlns:cx="http://schemas.microsoft.com/office/drawing/2014/chartex" xmlns:cx1="http://schemas.microsoft.com/office/drawing/2015/9/8/chartex" xmlns:cx2="http://schemas.microsoft.com/office/drawing/2015/10/21/chartex" xmlns:cx3="http://schemas.microsoft.com/office/drawing/2016/5/9/chartex" xmlns:cx4="http://schemas.microsoft.com/office/drawing/2016/5/10/chartex" xmlns:cx5="http://schemas.microsoft.com/office/drawing/2016/5/11/chartex" xmlns:cx6="http://schemas.microsoft.com/office/drawing/2016/5/12/chartex" xmlns:cx7="http://schemas.microsoft.com/office/drawing/2016/5/13/chartex" xmlns:cx8="http://schemas.microsoft.com/office/drawing/2016/5/14/chartex" xmlns:mc="http://schemas.openxmlformats.org/markup-compatibility/2006" xmlns:aink="http://schemas.microsoft.com/office/drawing/2016/ink" xmlns:am3d="http://schemas.microsoft.com/office/drawing/2017/model3d" xmlns:o="urn:schemas-microsoft-com:office:office" xmlns:r="http://schemas.openxmlformats.org/officeDocument/2006/relationships" xmlns:m="http://schemas.openxmlformats.org/officeDocument/2006/math" xmlns:v="urn:schemas-microsoft-com:vml" xmlns:wp14="http://schemas.microsoft.com/office/word/2010/wordprocessingDrawing" xmlns:wp="http://schemas.openxmlformats.org/drawingml/2006/wordprocessingDrawing" xmlns:w10="urn:schemas-microsoft-com:office:word" xmlns:w="http://schemas.openxmlformats.org/wordprocessingml/2006/main" xmlns:w14="http://schemas.microsoft.com/office/word/2010/wordml" xmlns:w15="http://schemas.microsoft.com/office/word/2012/wordml" xmlns:w16cex="http://schemas.microsoft.com/office/word/2018/wordml/cex" xmlns:w16cid="http://schemas.microsoft.com/office/word/2016/wordml/cid" xmlns:w16="http://schemas.microsoft.com/office/word/2018/wordml" xmlns:w16sdtdh="http://schemas.microsoft.com/office/word/2020/wordml/sdtdatahash" xmlns:w16se="http://schemas.microsoft.com/office/word/2015/wordml/symex" xmlns:wpg="http://schemas.microsoft.com/office/word/2010/wordprocessingGroup" xmlns:wpi="http://schemas.microsoft.com/office/word/2010/wordprocessingInk" xmlns:wne="http://schemas.microsoft.com/office/word/2006/wordml" xmlns:wps="http://schemas.microsoft.com/office/word/2010/wordprocessingShape" mc:Ignorable="w14 w15 w16se w16cid w16 w16cex w16sdtdh wp14">
   <w:abstractNum w:abstractNumId="0" w15:restartNumberingAfterBreak="0">
     <w:nsid w:val="023F627C"/>
     <w:multiLevelType w:val="hybridMultilevel"/>
@@ -30914,133 +30999,133 @@
       </w:rPr>
     </w:lvl>
   </w:abstractNum>
-  <w:num w:numId="1" w16cid:durableId="1142036420">
+  <w:num w:numId="1">
     <w:abstractNumId w:val="42"/>
   </w:num>
-  <w:num w:numId="2" w16cid:durableId="113523368">
+  <w:num w:numId="2">
     <w:abstractNumId w:val="18"/>
   </w:num>
-  <w:num w:numId="3" w16cid:durableId="1102841671">
+  <w:num w:numId="3">
     <w:abstractNumId w:val="34"/>
   </w:num>
-  <w:num w:numId="4" w16cid:durableId="1849976461">
+  <w:num w:numId="4">
     <w:abstractNumId w:val="39"/>
   </w:num>
-  <w:num w:numId="5" w16cid:durableId="798572646">
+  <w:num w:numId="5">
     <w:abstractNumId w:val="40"/>
   </w:num>
-  <w:num w:numId="6" w16cid:durableId="758021848">
+  <w:num w:numId="6">
     <w:abstractNumId w:val="41"/>
   </w:num>
-  <w:num w:numId="7" w16cid:durableId="616789369">
+  <w:num w:numId="7">
     <w:abstractNumId w:val="10"/>
   </w:num>
-  <w:num w:numId="8" w16cid:durableId="499153116">
+  <w:num w:numId="8">
     <w:abstractNumId w:val="17"/>
   </w:num>
-  <w:num w:numId="9" w16cid:durableId="118770678">
+  <w:num w:numId="9">
     <w:abstractNumId w:val="30"/>
   </w:num>
-  <w:num w:numId="10" w16cid:durableId="1755586200">
+  <w:num w:numId="10">
     <w:abstractNumId w:val="36"/>
   </w:num>
-  <w:num w:numId="11" w16cid:durableId="1790657531">
+  <w:num w:numId="11">
     <w:abstractNumId w:val="38"/>
   </w:num>
-  <w:num w:numId="12" w16cid:durableId="1909459400">
+  <w:num w:numId="12">
     <w:abstractNumId w:val="9"/>
   </w:num>
-  <w:num w:numId="13" w16cid:durableId="2036878062">
+  <w:num w:numId="13">
     <w:abstractNumId w:val="20"/>
   </w:num>
-  <w:num w:numId="14" w16cid:durableId="1691179750">
+  <w:num w:numId="14">
     <w:abstractNumId w:val="14"/>
   </w:num>
-  <w:num w:numId="15" w16cid:durableId="1964729449">
+  <w:num w:numId="15">
     <w:abstractNumId w:val="11"/>
   </w:num>
-  <w:num w:numId="16" w16cid:durableId="730006628">
+  <w:num w:numId="16">
     <w:abstractNumId w:val="3"/>
   </w:num>
-  <w:num w:numId="17" w16cid:durableId="584458885">
+  <w:num w:numId="17">
     <w:abstractNumId w:val="33"/>
   </w:num>
-  <w:num w:numId="18" w16cid:durableId="1544444022">
+  <w:num w:numId="18">
     <w:abstractNumId w:val="27"/>
   </w:num>
-  <w:num w:numId="19" w16cid:durableId="2091267523">
+  <w:num w:numId="19">
     <w:abstractNumId w:val="12"/>
   </w:num>
-  <w:num w:numId="20" w16cid:durableId="869800038">
+  <w:num w:numId="20">
     <w:abstractNumId w:val="19"/>
   </w:num>
-  <w:num w:numId="21" w16cid:durableId="1278220507">
+  <w:num w:numId="21">
     <w:abstractNumId w:val="2"/>
   </w:num>
-  <w:num w:numId="22" w16cid:durableId="749621586">
+  <w:num w:numId="22">
     <w:abstractNumId w:val="21"/>
   </w:num>
-  <w:num w:numId="23" w16cid:durableId="1253126489">
+  <w:num w:numId="23">
     <w:abstractNumId w:val="35"/>
   </w:num>
-  <w:num w:numId="24" w16cid:durableId="1534229339">
+  <w:num w:numId="24">
     <w:abstractNumId w:val="6"/>
   </w:num>
-  <w:num w:numId="25" w16cid:durableId="1587379830">
+  <w:num w:numId="25">
     <w:abstractNumId w:val="4"/>
   </w:num>
-  <w:num w:numId="26" w16cid:durableId="611979092">
+  <w:num w:numId="26">
     <w:abstractNumId w:val="1"/>
   </w:num>
-  <w:num w:numId="27" w16cid:durableId="77673060">
+  <w:num w:numId="27">
     <w:abstractNumId w:val="31"/>
   </w:num>
-  <w:num w:numId="28" w16cid:durableId="99450352">
+  <w:num w:numId="28">
     <w:abstractNumId w:val="28"/>
   </w:num>
-  <w:num w:numId="29" w16cid:durableId="1451900012">
+  <w:num w:numId="29">
     <w:abstractNumId w:val="15"/>
   </w:num>
-  <w:num w:numId="30" w16cid:durableId="1074937792">
+  <w:num w:numId="30">
     <w:abstractNumId w:val="26"/>
   </w:num>
-  <w:num w:numId="31" w16cid:durableId="115296847">
+  <w:num w:numId="31">
     <w:abstractNumId w:val="25"/>
   </w:num>
-  <w:num w:numId="32" w16cid:durableId="1253589121">
+  <w:num w:numId="32">
     <w:abstractNumId w:val="32"/>
   </w:num>
-  <w:num w:numId="33" w16cid:durableId="1564487679">
+  <w:num w:numId="33">
     <w:abstractNumId w:val="8"/>
   </w:num>
-  <w:num w:numId="34" w16cid:durableId="430205366">
+  <w:num w:numId="34">
     <w:abstractNumId w:val="29"/>
   </w:num>
-  <w:num w:numId="35" w16cid:durableId="774520576">
+  <w:num w:numId="35">
     <w:abstractNumId w:val="0"/>
   </w:num>
-  <w:num w:numId="36" w16cid:durableId="1007710684">
+  <w:num w:numId="36">
     <w:abstractNumId w:val="13"/>
   </w:num>
-  <w:num w:numId="37" w16cid:durableId="1195074438">
+  <w:num w:numId="37">
     <w:abstractNumId w:val="7"/>
   </w:num>
-  <w:num w:numId="38" w16cid:durableId="1643385891">
+  <w:num w:numId="38">
     <w:abstractNumId w:val="22"/>
   </w:num>
-  <w:num w:numId="39" w16cid:durableId="155920719">
+  <w:num w:numId="39">
     <w:abstractNumId w:val="5"/>
   </w:num>
-  <w:num w:numId="40" w16cid:durableId="1024864031">
+  <w:num w:numId="40">
     <w:abstractNumId w:val="37"/>
   </w:num>
-  <w:num w:numId="41" w16cid:durableId="1183394659">
+  <w:num w:numId="41">
     <w:abstractNumId w:val="24"/>
   </w:num>
-  <w:num w:numId="42" w16cid:durableId="1615135381">
+  <w:num w:numId="42">
     <w:abstractNumId w:val="23"/>
   </w:num>
-  <w:num w:numId="43" w16cid:durableId="1504589708">
+  <w:num w:numId="43">
     <w:abstractNumId w:val="16"/>
   </w:num>
   <w:numIdMacAtCleanup w:val="15"/>
@@ -31048,7 +31133,7 @@
 </file>
 
 <file path=word/styles.xml><?xml version="1.0" encoding="utf-8"?>
-<w:styles xmlns:mc="http://schemas.openxmlformats.org/markup-compatibility/2006" xmlns:r="http://schemas.openxmlformats.org/officeDocument/2006/relationships" xmlns:w="http://schemas.openxmlformats.org/wordprocessingml/2006/main" xmlns:w14="http://schemas.microsoft.com/office/word/2010/wordml" xmlns:w15="http://schemas.microsoft.com/office/word/2012/wordml" xmlns:w16cex="http://schemas.microsoft.com/office/word/2018/wordml/cex" xmlns:w16cid="http://schemas.microsoft.com/office/word/2016/wordml/cid" xmlns:w16="http://schemas.microsoft.com/office/word/2018/wordml" xmlns:w16du="http://schemas.microsoft.com/office/word/2023/wordml/word16du" xmlns:w16sdtdh="http://schemas.microsoft.com/office/word/2020/wordml/sdtdatahash" xmlns:w16sdtfl="http://schemas.microsoft.com/office/word/2024/wordml/sdtformatlock" xmlns:w16se="http://schemas.microsoft.com/office/word/2015/wordml/symex" mc:Ignorable="w14 w15 w16se w16cid w16 w16cex w16sdtdh w16sdtfl w16du">
+<w:styles xmlns:mc="http://schemas.openxmlformats.org/markup-compatibility/2006" xmlns:r="http://schemas.openxmlformats.org/officeDocument/2006/relationships" xmlns:w="http://schemas.openxmlformats.org/wordprocessingml/2006/main" xmlns:w14="http://schemas.microsoft.com/office/word/2010/wordml" xmlns:w15="http://schemas.microsoft.com/office/word/2012/wordml" xmlns:w16cex="http://schemas.microsoft.com/office/word/2018/wordml/cex" xmlns:w16cid="http://schemas.microsoft.com/office/word/2016/wordml/cid" xmlns:w16="http://schemas.microsoft.com/office/word/2018/wordml" xmlns:w16sdtdh="http://schemas.microsoft.com/office/word/2020/wordml/sdtdatahash" xmlns:w16se="http://schemas.microsoft.com/office/word/2015/wordml/symex" mc:Ignorable="w14 w15 w16se w16cid w16 w16cex w16sdtdh">
   <w:docDefaults>
     <w:rPrDefault>
       <w:rPr>
@@ -31458,10 +31543,10 @@
       <w:lang w:val="es-ES"/>
     </w:rPr>
   </w:style>
-  <w:style w:type="paragraph" w:styleId="Heading1">
+  <w:style w:type="paragraph" w:styleId="Ttulo1">
     <w:name w:val="heading 1"/>
     <w:basedOn w:val="Normal"/>
-    <w:link w:val="Heading1Char"/>
+    <w:link w:val="Ttulo1Car"/>
     <w:uiPriority w:val="9"/>
     <w:qFormat/>
     <w:rsid w:val="00EB7050"/>
@@ -31477,7 +31562,7 @@
       <w:szCs w:val="32"/>
     </w:rPr>
   </w:style>
-  <w:style w:type="paragraph" w:styleId="Heading2">
+  <w:style w:type="paragraph" w:styleId="Ttulo2">
     <w:name w:val="heading 2"/>
     <w:basedOn w:val="Normal"/>
     <w:uiPriority w:val="9"/>
@@ -31494,10 +31579,10 @@
       <w:szCs w:val="24"/>
     </w:rPr>
   </w:style>
-  <w:style w:type="paragraph" w:styleId="Heading3">
+  <w:style w:type="paragraph" w:styleId="Ttulo3">
     <w:name w:val="heading 3"/>
     <w:basedOn w:val="Normal"/>
-    <w:link w:val="Heading3Char"/>
+    <w:link w:val="Ttulo3Car"/>
     <w:uiPriority w:val="9"/>
     <w:unhideWhenUsed/>
     <w:qFormat/>
@@ -31511,11 +31596,11 @@
       <w:szCs w:val="24"/>
     </w:rPr>
   </w:style>
-  <w:style w:type="paragraph" w:styleId="Heading4">
+  <w:style w:type="paragraph" w:styleId="Ttulo4">
     <w:name w:val="heading 4"/>
     <w:basedOn w:val="Normal"/>
     <w:next w:val="Normal"/>
-    <w:link w:val="Heading4Char"/>
+    <w:link w:val="Ttulo4Car"/>
     <w:unhideWhenUsed/>
     <w:qFormat/>
     <w:rsid w:val="003B410B"/>
@@ -31534,12 +31619,13 @@
       <w:iCs/>
     </w:rPr>
   </w:style>
-  <w:style w:type="character" w:default="1" w:styleId="DefaultParagraphFont">
+  <w:style w:type="character" w:default="1" w:styleId="Fuentedeprrafopredeter">
     <w:name w:val="Default Paragraph Font"/>
     <w:uiPriority w:val="1"/>
+    <w:semiHidden/>
     <w:unhideWhenUsed/>
   </w:style>
-  <w:style w:type="table" w:default="1" w:styleId="TableNormal">
+  <w:style w:type="table" w:default="1" w:styleId="Tablanormal">
     <w:name w:val="Normal Table"/>
     <w:uiPriority w:val="99"/>
     <w:semiHidden/>
@@ -31554,7 +31640,7 @@
       </w:tblCellMar>
     </w:tblPr>
   </w:style>
-  <w:style w:type="numbering" w:default="1" w:styleId="NoList">
+  <w:style w:type="numbering" w:default="1" w:styleId="Sinlista">
     <w:name w:val="No List"/>
     <w:uiPriority w:val="99"/>
     <w:semiHidden/>
@@ -31576,7 +31662,7 @@
       </w:tblCellMar>
     </w:tblPr>
   </w:style>
-  <w:style w:type="paragraph" w:styleId="TOC1">
+  <w:style w:type="paragraph" w:styleId="TDC1">
     <w:name w:val="toc 1"/>
     <w:basedOn w:val="Normal"/>
     <w:uiPriority w:val="39"/>
@@ -31586,7 +31672,7 @@
       <w:ind w:left="980" w:hanging="441"/>
     </w:pPr>
   </w:style>
-  <w:style w:type="paragraph" w:styleId="TOC2">
+  <w:style w:type="paragraph" w:styleId="TDC2">
     <w:name w:val="toc 2"/>
     <w:basedOn w:val="Normal"/>
     <w:uiPriority w:val="39"/>
@@ -31596,7 +31682,7 @@
       <w:ind w:left="540"/>
     </w:pPr>
   </w:style>
-  <w:style w:type="paragraph" w:styleId="TOC3">
+  <w:style w:type="paragraph" w:styleId="TDC3">
     <w:name w:val="toc 3"/>
     <w:basedOn w:val="Normal"/>
     <w:uiPriority w:val="39"/>
@@ -31606,7 +31692,7 @@
       <w:ind w:left="1421" w:hanging="661"/>
     </w:pPr>
   </w:style>
-  <w:style w:type="paragraph" w:styleId="TOC4">
+  <w:style w:type="paragraph" w:styleId="TDC4">
     <w:name w:val="toc 4"/>
     <w:basedOn w:val="Normal"/>
     <w:uiPriority w:val="39"/>
@@ -31620,7 +31706,7 @@
       <w:bCs/>
     </w:rPr>
   </w:style>
-  <w:style w:type="paragraph" w:styleId="TOC5">
+  <w:style w:type="paragraph" w:styleId="TDC5">
     <w:name w:val="toc 5"/>
     <w:basedOn w:val="Normal"/>
     <w:uiPriority w:val="39"/>
@@ -31633,7 +31719,7 @@
       <w:i/>
     </w:rPr>
   </w:style>
-  <w:style w:type="paragraph" w:styleId="BodyText">
+  <w:style w:type="paragraph" w:styleId="Textoindependiente">
     <w:name w:val="Body Text"/>
     <w:basedOn w:val="Normal"/>
     <w:uiPriority w:val="1"/>
@@ -31642,7 +31728,7 @@
       <w:i/>
     </w:rPr>
   </w:style>
-  <w:style w:type="paragraph" w:styleId="Title">
+  <w:style w:type="paragraph" w:styleId="Ttulo">
     <w:name w:val="Title"/>
     <w:basedOn w:val="Normal"/>
     <w:uiPriority w:val="10"/>
@@ -31660,7 +31746,7 @@
       <w:szCs w:val="44"/>
     </w:rPr>
   </w:style>
-  <w:style w:type="paragraph" w:styleId="ListParagraph">
+  <w:style w:type="paragraph" w:styleId="Prrafodelista">
     <w:name w:val="List Paragraph"/>
     <w:basedOn w:val="Normal"/>
     <w:uiPriority w:val="34"/>
@@ -31675,9 +31761,9 @@
     <w:uiPriority w:val="1"/>
     <w:qFormat/>
   </w:style>
-  <w:style w:type="table" w:styleId="TableGrid">
+  <w:style w:type="table" w:styleId="Tablaconcuadrcula">
     <w:name w:val="Table Grid"/>
-    <w:basedOn w:val="TableNormal"/>
+    <w:basedOn w:val="Tablanormal"/>
     <w:uiPriority w:val="39"/>
     <w:rsid w:val="00C56009"/>
     <w:tblPr>
@@ -31691,7 +31777,7 @@
       </w:tblBorders>
     </w:tblPr>
   </w:style>
-  <w:style w:type="paragraph" w:styleId="Caption">
+  <w:style w:type="paragraph" w:styleId="Descripcin">
     <w:name w:val="caption"/>
     <w:basedOn w:val="Normal"/>
     <w:next w:val="Normal"/>
@@ -31710,10 +31796,10 @@
       <w:szCs w:val="18"/>
     </w:rPr>
   </w:style>
-  <w:style w:type="character" w:customStyle="1" w:styleId="Heading1Char">
-    <w:name w:val="Heading 1 Char"/>
-    <w:basedOn w:val="DefaultParagraphFont"/>
-    <w:link w:val="Heading1"/>
+  <w:style w:type="character" w:customStyle="1" w:styleId="Ttulo1Car">
+    <w:name w:val="Título 1 Car"/>
+    <w:basedOn w:val="Fuentedeprrafopredeter"/>
+    <w:link w:val="Ttulo1"/>
     <w:uiPriority w:val="9"/>
     <w:rsid w:val="00EB7050"/>
     <w:rPr>
@@ -31742,7 +31828,7 @@
       <w:lang w:eastAsia="es-ES"/>
     </w:rPr>
   </w:style>
-  <w:style w:type="character" w:styleId="Hyperlink">
+  <w:style w:type="character" w:styleId="Hipervnculo">
     <w:name w:val="Hyperlink"/>
     <w:uiPriority w:val="99"/>
     <w:rsid w:val="00EA5020"/>
@@ -31755,9 +31841,9 @@
     <w:name w:val="st"/>
     <w:rsid w:val="00EA5020"/>
   </w:style>
-  <w:style w:type="paragraph" w:styleId="TOCHeading">
+  <w:style w:type="paragraph" w:styleId="TtuloTDC">
     <w:name w:val="TOC Heading"/>
-    <w:basedOn w:val="Heading1"/>
+    <w:basedOn w:val="Ttulo1"/>
     <w:next w:val="Normal"/>
     <w:uiPriority w:val="39"/>
     <w:unhideWhenUsed/>
@@ -31779,7 +31865,7 @@
       <w:lang w:val="es-MX" w:eastAsia="es-MX"/>
     </w:rPr>
   </w:style>
-  <w:style w:type="paragraph" w:styleId="NoSpacing">
+  <w:style w:type="paragraph" w:styleId="Sinespaciado">
     <w:name w:val="No Spacing"/>
     <w:uiPriority w:val="1"/>
     <w:qFormat/>
@@ -31789,10 +31875,10 @@
       <w:lang w:val="es-ES"/>
     </w:rPr>
   </w:style>
-  <w:style w:type="character" w:customStyle="1" w:styleId="Heading4Char">
-    <w:name w:val="Heading 4 Char"/>
-    <w:basedOn w:val="DefaultParagraphFont"/>
-    <w:link w:val="Heading4"/>
+  <w:style w:type="character" w:customStyle="1" w:styleId="Ttulo4Car">
+    <w:name w:val="Título 4 Car"/>
+    <w:basedOn w:val="Fuentedeprrafopredeter"/>
+    <w:link w:val="Ttulo4"/>
     <w:rsid w:val="003B410B"/>
     <w:rPr>
       <w:rFonts w:asciiTheme="majorHAnsi" w:eastAsiaTheme="majorEastAsia" w:hAnsiTheme="majorHAnsi" w:cstheme="majorBidi"/>
@@ -31802,10 +31888,10 @@
       <w:lang w:val="es-ES"/>
     </w:rPr>
   </w:style>
-  <w:style w:type="character" w:customStyle="1" w:styleId="Heading3Char">
-    <w:name w:val="Heading 3 Char"/>
-    <w:basedOn w:val="DefaultParagraphFont"/>
-    <w:link w:val="Heading3"/>
+  <w:style w:type="character" w:customStyle="1" w:styleId="Ttulo3Car">
+    <w:name w:val="Título 3 Car"/>
+    <w:basedOn w:val="Fuentedeprrafopredeter"/>
+    <w:link w:val="Ttulo3"/>
     <w:uiPriority w:val="9"/>
     <w:rsid w:val="004D293B"/>
     <w:rPr>
@@ -31816,7 +31902,7 @@
       <w:lang w:val="es-ES"/>
     </w:rPr>
   </w:style>
-  <w:style w:type="paragraph" w:styleId="TableofFigures">
+  <w:style w:type="paragraph" w:styleId="Tabladeilustraciones">
     <w:name w:val="table of figures"/>
     <w:basedOn w:val="Normal"/>
     <w:next w:val="Normal"/>
@@ -31826,23 +31912,23 @@
   </w:style>
   <w:style w:type="character" w:customStyle="1" w:styleId="normaltextrun">
     <w:name w:val="normaltextrun"/>
-    <w:basedOn w:val="DefaultParagraphFont"/>
+    <w:basedOn w:val="Fuentedeprrafopredeter"/>
     <w:rsid w:val="00EB1C2A"/>
   </w:style>
   <w:style w:type="character" w:customStyle="1" w:styleId="scxw173366235">
     <w:name w:val="scxw173366235"/>
-    <w:basedOn w:val="DefaultParagraphFont"/>
+    <w:basedOn w:val="Fuentedeprrafopredeter"/>
     <w:rsid w:val="00EB1C2A"/>
   </w:style>
   <w:style w:type="character" w:customStyle="1" w:styleId="eop">
     <w:name w:val="eop"/>
-    <w:basedOn w:val="DefaultParagraphFont"/>
+    <w:basedOn w:val="Fuentedeprrafopredeter"/>
     <w:rsid w:val="00EB1C2A"/>
   </w:style>
-  <w:style w:type="paragraph" w:styleId="Header">
+  <w:style w:type="paragraph" w:styleId="Encabezado">
     <w:name w:val="header"/>
     <w:basedOn w:val="Normal"/>
-    <w:link w:val="HeaderChar"/>
+    <w:link w:val="EncabezadoCar"/>
     <w:uiPriority w:val="99"/>
     <w:unhideWhenUsed/>
     <w:rsid w:val="00C02C11"/>
@@ -31853,10 +31939,10 @@
       </w:tabs>
     </w:pPr>
   </w:style>
-  <w:style w:type="character" w:customStyle="1" w:styleId="HeaderChar">
-    <w:name w:val="Header Char"/>
-    <w:basedOn w:val="DefaultParagraphFont"/>
-    <w:link w:val="Header"/>
+  <w:style w:type="character" w:customStyle="1" w:styleId="EncabezadoCar">
+    <w:name w:val="Encabezado Car"/>
+    <w:basedOn w:val="Fuentedeprrafopredeter"/>
+    <w:link w:val="Encabezado"/>
     <w:uiPriority w:val="99"/>
     <w:rsid w:val="00C02C11"/>
     <w:rPr>
@@ -31864,10 +31950,10 @@
       <w:lang w:val="es-ES"/>
     </w:rPr>
   </w:style>
-  <w:style w:type="paragraph" w:styleId="Footer">
+  <w:style w:type="paragraph" w:styleId="Piedepgina">
     <w:name w:val="footer"/>
     <w:basedOn w:val="Normal"/>
-    <w:link w:val="FooterChar"/>
+    <w:link w:val="PiedepginaCar"/>
     <w:uiPriority w:val="99"/>
     <w:unhideWhenUsed/>
     <w:rsid w:val="00C02C11"/>
@@ -31878,10 +31964,10 @@
       </w:tabs>
     </w:pPr>
   </w:style>
-  <w:style w:type="character" w:customStyle="1" w:styleId="FooterChar">
-    <w:name w:val="Footer Char"/>
-    <w:basedOn w:val="DefaultParagraphFont"/>
-    <w:link w:val="Footer"/>
+  <w:style w:type="character" w:customStyle="1" w:styleId="PiedepginaCar">
+    <w:name w:val="Pie de página Car"/>
+    <w:basedOn w:val="Fuentedeprrafopredeter"/>
+    <w:link w:val="Piedepgina"/>
     <w:uiPriority w:val="99"/>
     <w:rsid w:val="00C02C11"/>
     <w:rPr>
@@ -31889,10 +31975,10 @@
       <w:lang w:val="es-ES"/>
     </w:rPr>
   </w:style>
-  <w:style w:type="paragraph" w:styleId="EndnoteText">
+  <w:style w:type="paragraph" w:styleId="Textonotaalfinal">
     <w:name w:val="endnote text"/>
     <w:basedOn w:val="Normal"/>
-    <w:link w:val="EndnoteTextChar"/>
+    <w:link w:val="TextonotaalfinalCar"/>
     <w:uiPriority w:val="99"/>
     <w:semiHidden/>
     <w:unhideWhenUsed/>
@@ -31902,10 +31988,10 @@
       <w:szCs w:val="20"/>
     </w:rPr>
   </w:style>
-  <w:style w:type="character" w:customStyle="1" w:styleId="EndnoteTextChar">
-    <w:name w:val="Endnote Text Char"/>
-    <w:basedOn w:val="DefaultParagraphFont"/>
-    <w:link w:val="EndnoteText"/>
+  <w:style w:type="character" w:customStyle="1" w:styleId="TextonotaalfinalCar">
+    <w:name w:val="Texto nota al final Car"/>
+    <w:basedOn w:val="Fuentedeprrafopredeter"/>
+    <w:link w:val="Textonotaalfinal"/>
     <w:uiPriority w:val="99"/>
     <w:semiHidden/>
     <w:rsid w:val="00C555D6"/>
@@ -31916,9 +32002,9 @@
       <w:lang w:val="es-ES"/>
     </w:rPr>
   </w:style>
-  <w:style w:type="character" w:styleId="EndnoteReference">
+  <w:style w:type="character" w:styleId="Refdenotaalfinal">
     <w:name w:val="endnote reference"/>
-    <w:basedOn w:val="DefaultParagraphFont"/>
+    <w:basedOn w:val="Fuentedeprrafopredeter"/>
     <w:uiPriority w:val="99"/>
     <w:semiHidden/>
     <w:unhideWhenUsed/>
@@ -31927,10 +32013,10 @@
       <w:vertAlign w:val="superscript"/>
     </w:rPr>
   </w:style>
-  <w:style w:type="paragraph" w:styleId="FootnoteText">
+  <w:style w:type="paragraph" w:styleId="Textonotapie">
     <w:name w:val="footnote text"/>
     <w:basedOn w:val="Normal"/>
-    <w:link w:val="FootnoteTextChar"/>
+    <w:link w:val="TextonotapieCar"/>
     <w:uiPriority w:val="99"/>
     <w:semiHidden/>
     <w:unhideWhenUsed/>
@@ -31940,10 +32026,10 @@
       <w:szCs w:val="20"/>
     </w:rPr>
   </w:style>
-  <w:style w:type="character" w:customStyle="1" w:styleId="FootnoteTextChar">
-    <w:name w:val="Footnote Text Char"/>
-    <w:basedOn w:val="DefaultParagraphFont"/>
-    <w:link w:val="FootnoteText"/>
+  <w:style w:type="character" w:customStyle="1" w:styleId="TextonotapieCar">
+    <w:name w:val="Texto nota pie Car"/>
+    <w:basedOn w:val="Fuentedeprrafopredeter"/>
+    <w:link w:val="Textonotapie"/>
     <w:uiPriority w:val="99"/>
     <w:semiHidden/>
     <w:rsid w:val="00C555D6"/>
@@ -31954,9 +32040,9 @@
       <w:lang w:val="es-ES"/>
     </w:rPr>
   </w:style>
-  <w:style w:type="character" w:styleId="FootnoteReference">
+  <w:style w:type="character" w:styleId="Refdenotaalpie">
     <w:name w:val="footnote reference"/>
-    <w:basedOn w:val="DefaultParagraphFont"/>
+    <w:basedOn w:val="Fuentedeprrafopredeter"/>
     <w:uiPriority w:val="99"/>
     <w:semiHidden/>
     <w:unhideWhenUsed/>
@@ -31965,9 +32051,9 @@
       <w:vertAlign w:val="superscript"/>
     </w:rPr>
   </w:style>
-  <w:style w:type="table" w:styleId="GridTable4-Accent4">
+  <w:style w:type="table" w:styleId="Tablaconcuadrcula4-nfasis4">
     <w:name w:val="Grid Table 4 Accent 4"/>
-    <w:basedOn w:val="TableNormal"/>
+    <w:basedOn w:val="Tablanormal"/>
     <w:uiPriority w:val="49"/>
     <w:rsid w:val="00E31EB6"/>
     <w:tblPr>
@@ -32038,9 +32124,9 @@
       </w:tcPr>
     </w:tblStylePr>
   </w:style>
-  <w:style w:type="table" w:styleId="GridTable1Light-Accent4">
+  <w:style w:type="table" w:styleId="Tablaconcuadrcula1clara-nfasis4">
     <w:name w:val="Grid Table 1 Light Accent 4"/>
-    <w:basedOn w:val="TableNormal"/>
+    <w:basedOn w:val="Tablanormal"/>
     <w:uiPriority w:val="46"/>
     <w:rsid w:val="00694E7A"/>
     <w:tblPr>
@@ -32092,7 +32178,7 @@
       </w:rPr>
     </w:tblStylePr>
   </w:style>
-  <w:style w:type="paragraph" w:styleId="TOC6">
+  <w:style w:type="paragraph" w:styleId="TDC6">
     <w:name w:val="toc 6"/>
     <w:basedOn w:val="Normal"/>
     <w:next w:val="Normal"/>
@@ -32112,7 +32198,7 @@
       <w:lang w:val="es-US" w:eastAsia="es-US"/>
     </w:rPr>
   </w:style>
-  <w:style w:type="paragraph" w:styleId="TOC7">
+  <w:style w:type="paragraph" w:styleId="TDC7">
     <w:name w:val="toc 7"/>
     <w:basedOn w:val="Normal"/>
     <w:next w:val="Normal"/>
@@ -32132,7 +32218,7 @@
       <w:lang w:val="es-US" w:eastAsia="es-US"/>
     </w:rPr>
   </w:style>
-  <w:style w:type="paragraph" w:styleId="TOC8">
+  <w:style w:type="paragraph" w:styleId="TDC8">
     <w:name w:val="toc 8"/>
     <w:basedOn w:val="Normal"/>
     <w:next w:val="Normal"/>
@@ -32152,7 +32238,7 @@
       <w:lang w:val="es-US" w:eastAsia="es-US"/>
     </w:rPr>
   </w:style>
-  <w:style w:type="paragraph" w:styleId="TOC9">
+  <w:style w:type="paragraph" w:styleId="TDC9">
     <w:name w:val="toc 9"/>
     <w:basedOn w:val="Normal"/>
     <w:next w:val="Normal"/>
@@ -32174,7 +32260,7 @@
   </w:style>
   <w:style w:type="character" w:customStyle="1" w:styleId="Mencinsinresolver1">
     <w:name w:val="Mención sin resolver1"/>
-    <w:basedOn w:val="DefaultParagraphFont"/>
+    <w:basedOn w:val="Fuentedeprrafopredeter"/>
     <w:uiPriority w:val="99"/>
     <w:semiHidden/>
     <w:unhideWhenUsed/>
@@ -32184,9 +32270,9 @@
       <w:shd w:val="clear" w:color="auto" w:fill="E1DFDD"/>
     </w:rPr>
   </w:style>
-  <w:style w:type="table" w:styleId="GridTable5Dark-Accent4">
+  <w:style w:type="table" w:styleId="Tablaconcuadrcula5oscura-nfasis4">
     <w:name w:val="Grid Table 5 Dark Accent 4"/>
-    <w:basedOn w:val="TableNormal"/>
+    <w:basedOn w:val="Tablanormal"/>
     <w:uiPriority w:val="50"/>
     <w:rsid w:val="00D47161"/>
     <w:tblPr>
@@ -32287,9 +32373,9 @@
       </w:tcPr>
     </w:tblStylePr>
   </w:style>
-  <w:style w:type="table" w:styleId="PlainTable3">
+  <w:style w:type="table" w:styleId="Tablanormal3">
     <w:name w:val="Plain Table 3"/>
-    <w:basedOn w:val="TableNormal"/>
+    <w:basedOn w:val="Tablanormal"/>
     <w:uiPriority w:val="43"/>
     <w:rsid w:val="00F43C26"/>
     <w:tblPr>
@@ -32377,9 +32463,9 @@
       </w:tcPr>
     </w:tblStylePr>
   </w:style>
-  <w:style w:type="table" w:styleId="ListTable7Colorful-Accent4">
+  <w:style w:type="table" w:styleId="Tabladelista7concolores-nfasis4">
     <w:name w:val="List Table 7 Colorful Accent 4"/>
-    <w:basedOn w:val="TableNormal"/>
+    <w:basedOn w:val="Tablanormal"/>
     <w:uiPriority w:val="52"/>
     <w:rsid w:val="004D144F"/>
     <w:rPr>
@@ -32497,9 +32583,9 @@
       </w:tcPr>
     </w:tblStylePr>
   </w:style>
-  <w:style w:type="table" w:styleId="ListTable3-Accent4">
+  <w:style w:type="table" w:styleId="Tabladelista3-nfasis4">
     <w:name w:val="List Table 3 Accent 4"/>
-    <w:basedOn w:val="TableNormal"/>
+    <w:basedOn w:val="Tablanormal"/>
     <w:uiPriority w:val="48"/>
     <w:rsid w:val="004D144F"/>
     <w:tblPr>
@@ -32618,9 +32704,9 @@
       </w:tcPr>
     </w:tblStylePr>
   </w:style>
-  <w:style w:type="table" w:styleId="GridTable6Colorful-Accent4">
+  <w:style w:type="table" w:styleId="Tablaconcuadrcula6concolores-nfasis4">
     <w:name w:val="Grid Table 6 Colorful Accent 4"/>
-    <w:basedOn w:val="TableNormal"/>
+    <w:basedOn w:val="Tablanormal"/>
     <w:uiPriority w:val="51"/>
     <w:rsid w:val="004D144F"/>
     <w:rPr>
@@ -32702,9 +32788,9 @@
       <w:lang w:val="es-EC" w:eastAsia="zh-CN" w:bidi="hi-IN"/>
     </w:rPr>
   </w:style>
-  <w:style w:type="table" w:styleId="MediumGrid3-Accent1">
+  <w:style w:type="table" w:styleId="Cuadrculamedia3-nfasis1">
     <w:name w:val="Medium Grid 3 Accent 1"/>
-    <w:basedOn w:val="TableNormal"/>
+    <w:basedOn w:val="Tablanormal"/>
     <w:uiPriority w:val="69"/>
     <w:unhideWhenUsed/>
     <w:rsid w:val="00624EF3"/>
@@ -32846,9 +32932,9 @@
       </w:tcPr>
     </w:tblStylePr>
   </w:style>
-  <w:style w:type="table" w:styleId="GridTable7Colorful-Accent4">
+  <w:style w:type="table" w:styleId="Tablaconcuadrcula7concolores-nfasis4">
     <w:name w:val="Grid Table 7 Colorful Accent 4"/>
-    <w:basedOn w:val="TableNormal"/>
+    <w:basedOn w:val="Tablanormal"/>
     <w:uiPriority w:val="52"/>
     <w:rsid w:val="002603FE"/>
     <w:rPr>
@@ -32982,9 +33068,9 @@
       </w:tcPr>
     </w:tblStylePr>
   </w:style>
-  <w:style w:type="character" w:styleId="UnresolvedMention">
+  <w:style w:type="character" w:styleId="Mencinsinresolver">
     <w:name w:val="Unresolved Mention"/>
-    <w:basedOn w:val="DefaultParagraphFont"/>
+    <w:basedOn w:val="Fuentedeprrafopredeter"/>
     <w:uiPriority w:val="99"/>
     <w:semiHidden/>
     <w:unhideWhenUsed/>
@@ -33006,9 +33092,9 @@
       <w:szCs w:val="24"/>
     </w:rPr>
   </w:style>
-  <w:style w:type="table" w:styleId="GridTable4-Accent1">
+  <w:style w:type="table" w:styleId="Tablaconcuadrcula4-nfasis1">
     <w:name w:val="Grid Table 4 Accent 1"/>
-    <w:basedOn w:val="TableNormal"/>
+    <w:basedOn w:val="Tablanormal"/>
     <w:uiPriority w:val="49"/>
     <w:rsid w:val="00F50CD1"/>
     <w:tblPr>

</xml_diff>